<commit_message>
Modificacion parte requerimientos funcionales
</commit_message>
<xml_diff>
--- a/PROYECTO ING SOFTWARE PENDIENTE (1).docx
+++ b/PROYECTO ING SOFTWARE PENDIENTE (1).docx
@@ -62,17 +62,17 @@
               <wp:align>center</wp:align>
             </wp:positionH>
             <wp:positionV relativeFrom="margin">
-              <wp:posOffset>-230584</wp:posOffset>
+              <wp:posOffset>-230582</wp:posOffset>
             </wp:positionV>
             <wp:extent cx="1278262" cy="1278262"/>
             <wp:effectExtent b="0" l="0" r="0" t="0"/>
             <wp:wrapSquare wrapText="bothSides" distB="0" distT="0" distL="114300" distR="114300"/>
-            <wp:docPr id="1" name="image1.png"/>
+            <wp:docPr id="3" name="image2.png"/>
             <a:graphic>
               <a:graphicData uri="http://schemas.openxmlformats.org/drawingml/2006/picture">
                 <pic:pic>
                   <pic:nvPicPr>
-                    <pic:cNvPr id="0" name="image1.png"/>
+                    <pic:cNvPr id="0" name="image2.png"/>
                     <pic:cNvPicPr preferRelativeResize="0"/>
                   </pic:nvPicPr>
                   <pic:blipFill>
@@ -501,7 +501,7 @@
     </w:p>
     <w:sdt>
       <w:sdtPr>
-        <w:id w:val="-1769141219"/>
+        <w:id w:val="-486059469"/>
         <w:docPartObj>
           <w:docPartGallery w:val="Table of Contents"/>
           <w:docPartUnique w:val="1"/>
@@ -531,7 +531,7 @@
             <w:instrText xml:space="preserve"> TOC \h \u \z \t "Heading 1,1,Heading 2,2,Heading 3,3,"</w:instrText>
             <w:fldChar w:fldCharType="separate"/>
           </w:r>
-          <w:hyperlink w:anchor="_i9ickftc3grp">
+          <w:hyperlink w:anchor="_kk36r7h24pgu">
             <w:r>
               <w:rPr>
                 <w:color w:val="000000"/>
@@ -566,7 +566,7 @@
               <w:color w:val="000000"/>
             </w:rPr>
           </w:pPr>
-          <w:hyperlink w:anchor="_wtmu6j114ak7">
+          <w:hyperlink w:anchor="_p0xz3sq7wxnb">
             <w:r>
               <w:rPr>
                 <w:color w:val="000000"/>
@@ -601,7 +601,7 @@
               <w:color w:val="000000"/>
             </w:rPr>
           </w:pPr>
-          <w:hyperlink w:anchor="_732vfb7pz3xs">
+          <w:hyperlink w:anchor="_uifmxkbgosih">
             <w:r>
               <w:rPr>
                 <w:color w:val="000000"/>
@@ -637,7 +637,7 @@
               <w:color w:val="000000"/>
             </w:rPr>
           </w:pPr>
-          <w:hyperlink w:anchor="_xpn8603ot21m">
+          <w:hyperlink w:anchor="_vw73w6o6unle">
             <w:r>
               <w:rPr>
                 <w:color w:val="000000"/>
@@ -673,7 +673,7 @@
               <w:color w:val="000000"/>
             </w:rPr>
           </w:pPr>
-          <w:hyperlink w:anchor="_7jhj2sw5xxkw">
+          <w:hyperlink w:anchor="_pq5dp6axkgcn">
             <w:r>
               <w:rPr>
                 <w:color w:val="000000"/>
@@ -708,7 +708,7 @@
               <w:color w:val="000000"/>
             </w:rPr>
           </w:pPr>
-          <w:hyperlink w:anchor="_nopl17l1jwt">
+          <w:hyperlink w:anchor="_hsdk2wwgw1qb">
             <w:r>
               <w:rPr>
                 <w:color w:val="000000"/>
@@ -743,7 +743,7 @@
               <w:color w:val="000000"/>
             </w:rPr>
           </w:pPr>
-          <w:hyperlink w:anchor="_3j7wt6xm2ngb">
+          <w:hyperlink w:anchor="_avwwe4xb4qnl">
             <w:r>
               <w:rPr>
                 <w:color w:val="000000"/>
@@ -779,7 +779,7 @@
               <w:color w:val="000000"/>
             </w:rPr>
           </w:pPr>
-          <w:hyperlink w:anchor="_w42yof3lwq3i">
+          <w:hyperlink w:anchor="_nmi0ot53b1dz">
             <w:r>
               <w:rPr>
                 <w:color w:val="000000"/>
@@ -842,7 +842,7 @@
           <w:bCs w:val="0"/>
         </w:rPr>
       </w:pPr>
-      <w:bookmarkStart w:colFirst="0" w:colLast="0" w:name="_i9ickftc3grp" w:id="0"/>
+      <w:bookmarkStart w:colFirst="0" w:colLast="0" w:name="_kk36r7h24pgu" w:id="0"/>
       <w:bookmarkEnd w:id="0"/>
       <w:r>
         <w:rPr>
@@ -922,7 +922,7 @@
         <w:ind w:firstLine="0"/>
         <w:rPr/>
       </w:pPr>
-      <w:bookmarkStart w:colFirst="0" w:colLast="0" w:name="_wtmu6j114ak7" w:id="1"/>
+      <w:bookmarkStart w:colFirst="0" w:colLast="0" w:name="_p0xz3sq7wxnb" w:id="1"/>
       <w:bookmarkEnd w:id="1"/>
       <w:r>
         <w:rPr>
@@ -995,7 +995,7 @@
         <w:pStyle w:val="Heading1"/>
         <w:rPr/>
       </w:pPr>
-      <w:bookmarkStart w:colFirst="0" w:colLast="0" w:name="_732vfb7pz3xs" w:id="2"/>
+      <w:bookmarkStart w:colFirst="0" w:colLast="0" w:name="_uifmxkbgosih" w:id="2"/>
       <w:bookmarkEnd w:id="2"/>
       <w:r>
         <w:rPr>
@@ -1015,7 +1015,7 @@
         <w:pStyle w:val="Heading2"/>
         <w:rPr/>
       </w:pPr>
-      <w:bookmarkStart w:colFirst="0" w:colLast="0" w:name="_xpn8603ot21m" w:id="3"/>
+      <w:bookmarkStart w:colFirst="0" w:colLast="0" w:name="_vw73w6o6unle" w:id="3"/>
       <w:bookmarkEnd w:id="3"/>
       <w:r>
         <w:rPr>
@@ -1041,7 +1041,7 @@
         <w:pStyle w:val="Heading2"/>
         <w:rPr/>
       </w:pPr>
-      <w:bookmarkStart w:colFirst="0" w:colLast="0" w:name="_7jhj2sw5xxkw" w:id="4"/>
+      <w:bookmarkStart w:colFirst="0" w:colLast="0" w:name="_pq5dp6axkgcn" w:id="4"/>
       <w:bookmarkEnd w:id="4"/>
       <w:r>
         <w:rPr>
@@ -1155,7 +1155,7 @@
         <w:pStyle w:val="Heading1"/>
         <w:rPr/>
       </w:pPr>
-      <w:bookmarkStart w:colFirst="0" w:colLast="0" w:name="_nopl17l1jwt" w:id="5"/>
+      <w:bookmarkStart w:colFirst="0" w:colLast="0" w:name="_hsdk2wwgw1qb" w:id="5"/>
       <w:bookmarkEnd w:id="5"/>
       <w:r>
         <w:rPr>
@@ -1587,7 +1587,7 @@
         <w:pStyle w:val="Heading1"/>
         <w:rPr/>
       </w:pPr>
-      <w:bookmarkStart w:colFirst="0" w:colLast="0" w:name="_3j7wt6xm2ngb" w:id="6"/>
+      <w:bookmarkStart w:colFirst="0" w:colLast="0" w:name="_avwwe4xb4qnl" w:id="6"/>
       <w:bookmarkEnd w:id="6"/>
       <w:r>
         <w:rPr>
@@ -1607,7 +1607,7 @@
         <w:pStyle w:val="Heading2"/>
         <w:rPr/>
       </w:pPr>
-      <w:bookmarkStart w:colFirst="0" w:colLast="0" w:name="_w42yof3lwq3i" w:id="7"/>
+      <w:bookmarkStart w:colFirst="0" w:colLast="0" w:name="_nmi0ot53b1dz" w:id="7"/>
       <w:bookmarkEnd w:id="7"/>
       <w:r>
         <w:rPr>
@@ -2054,10 +2054,15 @@
               <w:spacing w:before="0" w:line="240" w:lineRule="auto"/>
               <w:ind w:firstLine="0"/>
               <w:jc w:val="left"/>
-              <w:rPr/>
+              <w:rPr>
+                <w:sz w:val="20"/>
+                <w:szCs w:val="20"/>
+              </w:rPr>
             </w:pPr>
             <w:r>
               <w:rPr>
+                <w:sz w:val="20"/>
+                <w:szCs w:val="20"/>
                 <w:rtl w:val="0"/>
               </w:rPr>
               <w:t xml:space="preserve">Requerimiento Funcional</w:t>
@@ -2087,10 +2092,15 @@
               <w:spacing w:before="0" w:line="240" w:lineRule="auto"/>
               <w:ind w:firstLine="0"/>
               <w:jc w:val="left"/>
-              <w:rPr/>
+              <w:rPr>
+                <w:sz w:val="20"/>
+                <w:szCs w:val="20"/>
+              </w:rPr>
             </w:pPr>
             <w:r>
               <w:rPr>
+                <w:sz w:val="20"/>
+                <w:szCs w:val="20"/>
                 <w:rtl w:val="0"/>
               </w:rPr>
               <w:t xml:space="preserve">Nombre</w:t>
@@ -2120,10 +2130,15 @@
               <w:spacing w:before="0" w:line="240" w:lineRule="auto"/>
               <w:ind w:firstLine="0"/>
               <w:jc w:val="left"/>
-              <w:rPr/>
+              <w:rPr>
+                <w:sz w:val="20"/>
+                <w:szCs w:val="20"/>
+              </w:rPr>
             </w:pPr>
             <w:r>
               <w:rPr>
+                <w:sz w:val="20"/>
+                <w:szCs w:val="20"/>
                 <w:rtl w:val="0"/>
               </w:rPr>
               <w:t xml:space="preserve">Descripcion</w:t>
@@ -2153,10 +2168,15 @@
               <w:spacing w:before="0" w:line="240" w:lineRule="auto"/>
               <w:ind w:firstLine="0"/>
               <w:jc w:val="left"/>
-              <w:rPr/>
+              <w:rPr>
+                <w:sz w:val="20"/>
+                <w:szCs w:val="20"/>
+              </w:rPr>
             </w:pPr>
             <w:r>
               <w:rPr>
+                <w:sz w:val="20"/>
+                <w:szCs w:val="20"/>
                 <w:rtl w:val="0"/>
               </w:rPr>
               <w:t xml:space="preserve">Prioridad</w:t>
@@ -2192,10 +2212,15 @@
               <w:spacing w:before="0" w:line="240" w:lineRule="auto"/>
               <w:ind w:firstLine="0"/>
               <w:jc w:val="left"/>
-              <w:rPr/>
+              <w:rPr>
+                <w:sz w:val="20"/>
+                <w:szCs w:val="20"/>
+              </w:rPr>
             </w:pPr>
             <w:r>
               <w:rPr>
+                <w:sz w:val="20"/>
+                <w:szCs w:val="20"/>
                 <w:rtl w:val="0"/>
               </w:rPr>
               <w:t xml:space="preserve">1</w:t>
@@ -2225,10 +2250,15 @@
               <w:spacing w:before="0" w:line="240" w:lineRule="auto"/>
               <w:ind w:firstLine="0"/>
               <w:jc w:val="left"/>
-              <w:rPr/>
+              <w:rPr>
+                <w:sz w:val="20"/>
+                <w:szCs w:val="20"/>
+              </w:rPr>
             </w:pPr>
             <w:r>
               <w:rPr>
+                <w:sz w:val="20"/>
+                <w:szCs w:val="20"/>
                 <w:rtl w:val="0"/>
               </w:rPr>
               <w:t xml:space="preserve">Registro de Citas</w:t>
@@ -2258,10 +2288,15 @@
               <w:spacing w:before="0" w:line="240" w:lineRule="auto"/>
               <w:ind w:firstLine="0"/>
               <w:jc w:val="left"/>
-              <w:rPr/>
+              <w:rPr>
+                <w:sz w:val="20"/>
+                <w:szCs w:val="20"/>
+              </w:rPr>
             </w:pPr>
             <w:r>
               <w:rPr>
+                <w:sz w:val="20"/>
+                <w:szCs w:val="20"/>
                 <w:rtl w:val="0"/>
               </w:rPr>
               <w:t xml:space="preserve">El sistema debe permitir ingresar datos del cliente (nombre y telefono), datos del paciente : nombre, especie, edad.</w:t>
@@ -2293,10 +2328,15 @@
               <w:spacing w:before="0" w:line="240" w:lineRule="auto"/>
               <w:ind w:firstLine="0"/>
               <w:jc w:val="left"/>
-              <w:rPr/>
+              <w:rPr>
+                <w:sz w:val="20"/>
+                <w:szCs w:val="20"/>
+              </w:rPr>
             </w:pPr>
             <w:r>
               <w:rPr>
+                <w:sz w:val="20"/>
+                <w:szCs w:val="20"/>
                 <w:rtl w:val="0"/>
               </w:rPr>
               <w:t xml:space="preserve">Alta</w:t>
@@ -2332,10 +2372,15 @@
               <w:spacing w:before="0" w:line="240" w:lineRule="auto"/>
               <w:ind w:firstLine="0"/>
               <w:jc w:val="left"/>
-              <w:rPr/>
+              <w:rPr>
+                <w:sz w:val="20"/>
+                <w:szCs w:val="20"/>
+              </w:rPr>
             </w:pPr>
             <w:r>
               <w:rPr>
+                <w:sz w:val="20"/>
+                <w:szCs w:val="20"/>
                 <w:rtl w:val="0"/>
               </w:rPr>
               <w:t xml:space="preserve">2</w:t>
@@ -2365,10 +2410,15 @@
               <w:spacing w:before="0" w:line="240" w:lineRule="auto"/>
               <w:ind w:firstLine="0"/>
               <w:jc w:val="left"/>
-              <w:rPr/>
+              <w:rPr>
+                <w:sz w:val="20"/>
+                <w:szCs w:val="20"/>
+              </w:rPr>
             </w:pPr>
             <w:r>
               <w:rPr>
+                <w:sz w:val="20"/>
+                <w:szCs w:val="20"/>
                 <w:rtl w:val="0"/>
               </w:rPr>
               <w:t xml:space="preserve">Validación de disponibilidad</w:t>
@@ -2398,10 +2448,15 @@
               <w:spacing w:before="0" w:line="240" w:lineRule="auto"/>
               <w:ind w:firstLine="0"/>
               <w:jc w:val="left"/>
-              <w:rPr/>
+              <w:rPr>
+                <w:sz w:val="20"/>
+                <w:szCs w:val="20"/>
+              </w:rPr>
             </w:pPr>
             <w:r>
               <w:rPr>
+                <w:sz w:val="20"/>
+                <w:szCs w:val="20"/>
                 <w:rtl w:val="0"/>
               </w:rPr>
               <w:t xml:space="preserve">El sistema debe verificar en tiempo real que el horario seleccionado no este ocupado antes de guardar la cita.</w:t>
@@ -2431,10 +2486,15 @@
               <w:spacing w:before="0" w:line="240" w:lineRule="auto"/>
               <w:ind w:firstLine="0"/>
               <w:jc w:val="left"/>
-              <w:rPr/>
+              <w:rPr>
+                <w:sz w:val="20"/>
+                <w:szCs w:val="20"/>
+              </w:rPr>
             </w:pPr>
             <w:r>
               <w:rPr>
+                <w:sz w:val="20"/>
+                <w:szCs w:val="20"/>
                 <w:rtl w:val="0"/>
               </w:rPr>
               <w:t xml:space="preserve">Alta</w:t>
@@ -2470,10 +2530,15 @@
               <w:spacing w:before="0" w:line="240" w:lineRule="auto"/>
               <w:ind w:firstLine="0"/>
               <w:jc w:val="left"/>
-              <w:rPr/>
+              <w:rPr>
+                <w:sz w:val="20"/>
+                <w:szCs w:val="20"/>
+              </w:rPr>
             </w:pPr>
             <w:r>
               <w:rPr>
+                <w:sz w:val="20"/>
+                <w:szCs w:val="20"/>
                 <w:rtl w:val="0"/>
               </w:rPr>
               <w:t xml:space="preserve">3</w:t>
@@ -2503,10 +2568,15 @@
               <w:spacing w:before="0" w:line="240" w:lineRule="auto"/>
               <w:ind w:firstLine="0"/>
               <w:jc w:val="left"/>
-              <w:rPr/>
+              <w:rPr>
+                <w:sz w:val="20"/>
+                <w:szCs w:val="20"/>
+              </w:rPr>
             </w:pPr>
             <w:r>
               <w:rPr>
+                <w:sz w:val="20"/>
+                <w:szCs w:val="20"/>
                 <w:rtl w:val="0"/>
               </w:rPr>
               <w:t xml:space="preserve">Consulta dinámica</w:t>
@@ -2536,10 +2606,15 @@
               <w:spacing w:before="0" w:line="240" w:lineRule="auto"/>
               <w:ind w:firstLine="0"/>
               <w:jc w:val="left"/>
-              <w:rPr/>
+              <w:rPr>
+                <w:sz w:val="20"/>
+                <w:szCs w:val="20"/>
+              </w:rPr>
             </w:pPr>
             <w:r>
               <w:rPr>
+                <w:sz w:val="20"/>
+                <w:szCs w:val="20"/>
                 <w:rtl w:val="0"/>
               </w:rPr>
               <w:t xml:space="preserve">El usuario debe poder buscar y visualizar las citas programadas.</w:t>
@@ -2569,10 +2644,15 @@
               <w:spacing w:before="0" w:line="240" w:lineRule="auto"/>
               <w:ind w:firstLine="0"/>
               <w:jc w:val="left"/>
-              <w:rPr/>
+              <w:rPr>
+                <w:sz w:val="20"/>
+                <w:szCs w:val="20"/>
+              </w:rPr>
             </w:pPr>
             <w:r>
               <w:rPr>
+                <w:sz w:val="20"/>
+                <w:szCs w:val="20"/>
                 <w:rtl w:val="0"/>
               </w:rPr>
               <w:t xml:space="preserve">Media</w:t>
@@ -2608,10 +2688,15 @@
               <w:spacing w:before="0" w:line="240" w:lineRule="auto"/>
               <w:ind w:firstLine="0"/>
               <w:jc w:val="left"/>
-              <w:rPr/>
+              <w:rPr>
+                <w:sz w:val="20"/>
+                <w:szCs w:val="20"/>
+              </w:rPr>
             </w:pPr>
             <w:r>
               <w:rPr>
+                <w:sz w:val="20"/>
+                <w:szCs w:val="20"/>
                 <w:rtl w:val="0"/>
               </w:rPr>
               <w:t xml:space="preserve">4</w:t>
@@ -2641,10 +2726,15 @@
               <w:spacing w:before="0" w:line="240" w:lineRule="auto"/>
               <w:ind w:firstLine="0"/>
               <w:jc w:val="left"/>
-              <w:rPr/>
+              <w:rPr>
+                <w:sz w:val="20"/>
+                <w:szCs w:val="20"/>
+              </w:rPr>
             </w:pPr>
             <w:r>
               <w:rPr>
+                <w:sz w:val="20"/>
+                <w:szCs w:val="20"/>
                 <w:rtl w:val="0"/>
               </w:rPr>
               <w:t xml:space="preserve">Cancelación / Modificación</w:t>
@@ -2674,10 +2764,15 @@
               <w:spacing w:before="0" w:line="240" w:lineRule="auto"/>
               <w:ind w:firstLine="0"/>
               <w:jc w:val="left"/>
-              <w:rPr/>
+              <w:rPr>
+                <w:sz w:val="20"/>
+                <w:szCs w:val="20"/>
+              </w:rPr>
             </w:pPr>
             <w:r>
               <w:rPr>
+                <w:sz w:val="20"/>
+                <w:szCs w:val="20"/>
                 <w:rtl w:val="0"/>
               </w:rPr>
               <w:t xml:space="preserve">El sistema debe permitir cambiar el estado de una cita a “cancelada” o actualizar fecha y hora si es modificada.</w:t>
@@ -2707,10 +2802,15 @@
               <w:spacing w:before="0" w:line="240" w:lineRule="auto"/>
               <w:ind w:firstLine="0"/>
               <w:jc w:val="left"/>
-              <w:rPr/>
+              <w:rPr>
+                <w:sz w:val="20"/>
+                <w:szCs w:val="20"/>
+              </w:rPr>
             </w:pPr>
             <w:r>
               <w:rPr>
+                <w:sz w:val="20"/>
+                <w:szCs w:val="20"/>
                 <w:rtl w:val="0"/>
               </w:rPr>
               <w:t xml:space="preserve">Media</w:t>
@@ -2721,20 +2821,33 @@
     </w:tbl>
     <w:p>
       <w:pPr>
-        <w:rPr/>
-      </w:pPr>
-      <w:r>
-        <w:rPr>
-          <w:rtl w:val="0"/>
-        </w:rPr>
-      </w:r>
-    </w:p>
-    <w:p>
-      <w:pPr>
-        <w:rPr/>
-      </w:pPr>
-      <w:r>
-        <w:rPr>
+        <w:ind w:left="0" w:firstLine="0"/>
+        <w:rPr>
+          <w:sz w:val="20"/>
+          <w:szCs w:val="20"/>
+        </w:rPr>
+      </w:pPr>
+      <w:r>
+        <w:br w:type="page"/>
+      </w:r>
+      <w:r>
+        <w:rPr>
+          <w:rtl w:val="0"/>
+        </w:rPr>
+      </w:r>
+    </w:p>
+    <w:p>
+      <w:pPr>
+        <w:ind w:left="0" w:firstLine="0"/>
+        <w:rPr>
+          <w:sz w:val="20"/>
+          <w:szCs w:val="20"/>
+        </w:rPr>
+      </w:pPr>
+      <w:r>
+        <w:rPr>
+          <w:sz w:val="20"/>
+          <w:szCs w:val="20"/>
           <w:rtl w:val="0"/>
         </w:rPr>
         <w:t xml:space="preserve">Requisitos no funcionales</w:t>
@@ -2742,7 +2855,10 @@
     </w:p>
     <w:p>
       <w:pPr>
-        <w:rPr/>
+        <w:rPr>
+          <w:sz w:val="20"/>
+          <w:szCs w:val="20"/>
+        </w:rPr>
       </w:pPr>
       <w:r>
         <w:rPr>
@@ -2799,10 +2915,15 @@
               <w:spacing w:before="0" w:line="240" w:lineRule="auto"/>
               <w:ind w:firstLine="0"/>
               <w:jc w:val="center"/>
-              <w:rPr/>
+              <w:rPr>
+                <w:sz w:val="20"/>
+                <w:szCs w:val="20"/>
+              </w:rPr>
             </w:pPr>
             <w:r>
               <w:rPr>
+                <w:sz w:val="20"/>
+                <w:szCs w:val="20"/>
                 <w:rtl w:val="0"/>
               </w:rPr>
               <w:t xml:space="preserve">Requerimiento NO Funcional</w:t>
@@ -2825,10 +2946,15 @@
               <w:spacing w:before="0" w:line="240" w:lineRule="auto"/>
               <w:ind w:firstLine="0"/>
               <w:jc w:val="center"/>
-              <w:rPr/>
+              <w:rPr>
+                <w:sz w:val="20"/>
+                <w:szCs w:val="20"/>
+              </w:rPr>
             </w:pPr>
             <w:r>
               <w:rPr>
+                <w:sz w:val="20"/>
+                <w:szCs w:val="20"/>
                 <w:rtl w:val="0"/>
               </w:rPr>
               <w:t xml:space="preserve">Descripción</w:t>
@@ -2851,10 +2977,15 @@
               <w:spacing w:before="0" w:line="240" w:lineRule="auto"/>
               <w:ind w:firstLine="0"/>
               <w:jc w:val="center"/>
-              <w:rPr/>
+              <w:rPr>
+                <w:sz w:val="20"/>
+                <w:szCs w:val="20"/>
+              </w:rPr>
             </w:pPr>
             <w:r>
               <w:rPr>
+                <w:sz w:val="20"/>
+                <w:szCs w:val="20"/>
                 <w:rtl w:val="0"/>
               </w:rPr>
               <w:t xml:space="preserve">Prioridad</w:t>
@@ -2890,10 +3021,15 @@
               <w:spacing w:before="0" w:line="240" w:lineRule="auto"/>
               <w:ind w:firstLine="0"/>
               <w:jc w:val="left"/>
-              <w:rPr/>
+              <w:rPr>
+                <w:sz w:val="20"/>
+                <w:szCs w:val="20"/>
+              </w:rPr>
             </w:pPr>
             <w:r>
               <w:rPr>
+                <w:sz w:val="20"/>
+                <w:szCs w:val="20"/>
                 <w:rtl w:val="0"/>
               </w:rPr>
               <w:t xml:space="preserve">Persistencia Lenta</w:t>
@@ -2923,10 +3059,15 @@
               <w:spacing w:before="0" w:line="240" w:lineRule="auto"/>
               <w:ind w:firstLine="0"/>
               <w:jc w:val="left"/>
-              <w:rPr/>
+              <w:rPr>
+                <w:sz w:val="20"/>
+                <w:szCs w:val="20"/>
+              </w:rPr>
             </w:pPr>
             <w:r>
               <w:rPr>
+                <w:sz w:val="20"/>
+                <w:szCs w:val="20"/>
                 <w:rtl w:val="0"/>
               </w:rPr>
               <w:t xml:space="preserve">La base de datos debe ser de Google Sheets que estará funcionando en la nube, quitando la necesidad de desplegar motores SQL locales.</w:t>
@@ -2956,10 +3097,15 @@
               <w:spacing w:before="0" w:line="240" w:lineRule="auto"/>
               <w:ind w:firstLine="0"/>
               <w:jc w:val="left"/>
-              <w:rPr/>
+              <w:rPr>
+                <w:sz w:val="20"/>
+                <w:szCs w:val="20"/>
+              </w:rPr>
             </w:pPr>
             <w:r>
               <w:rPr>
+                <w:sz w:val="20"/>
+                <w:szCs w:val="20"/>
                 <w:rtl w:val="0"/>
               </w:rPr>
               <w:t xml:space="preserve">Restricción Técnica</w:t>
@@ -2995,10 +3141,15 @@
               <w:spacing w:before="0" w:line="240" w:lineRule="auto"/>
               <w:ind w:firstLine="0"/>
               <w:jc w:val="left"/>
-              <w:rPr/>
+              <w:rPr>
+                <w:sz w:val="20"/>
+                <w:szCs w:val="20"/>
+              </w:rPr>
             </w:pPr>
             <w:r>
               <w:rPr>
+                <w:sz w:val="20"/>
+                <w:szCs w:val="20"/>
                 <w:rtl w:val="0"/>
               </w:rPr>
               <w:t xml:space="preserve">Usabilidad</w:t>
@@ -3028,10 +3179,15 @@
               <w:spacing w:before="0" w:line="240" w:lineRule="auto"/>
               <w:ind w:firstLine="0"/>
               <w:jc w:val="left"/>
-              <w:rPr/>
+              <w:rPr>
+                <w:sz w:val="20"/>
+                <w:szCs w:val="20"/>
+              </w:rPr>
             </w:pPr>
             <w:r>
               <w:rPr>
+                <w:sz w:val="20"/>
+                <w:szCs w:val="20"/>
                 <w:rtl w:val="0"/>
               </w:rPr>
               <w:t xml:space="preserve">La interfaz de usuario debe ser limpia, intuitiva y autodescriptiva, diseñada para cargarse de manera óptima en navegadores y escritorio.</w:t>
@@ -3061,10 +3217,15 @@
               <w:spacing w:before="0" w:line="240" w:lineRule="auto"/>
               <w:ind w:firstLine="0"/>
               <w:jc w:val="left"/>
-              <w:rPr/>
+              <w:rPr>
+                <w:sz w:val="20"/>
+                <w:szCs w:val="20"/>
+              </w:rPr>
             </w:pPr>
             <w:r>
               <w:rPr>
+                <w:sz w:val="20"/>
+                <w:szCs w:val="20"/>
                 <w:rtl w:val="0"/>
               </w:rPr>
               <w:t xml:space="preserve">Usabilidad</w:t>
@@ -3100,10 +3261,15 @@
               <w:spacing w:before="0" w:line="240" w:lineRule="auto"/>
               <w:ind w:firstLine="0"/>
               <w:jc w:val="left"/>
-              <w:rPr/>
+              <w:rPr>
+                <w:sz w:val="20"/>
+                <w:szCs w:val="20"/>
+              </w:rPr>
             </w:pPr>
             <w:r>
               <w:rPr>
+                <w:sz w:val="20"/>
+                <w:szCs w:val="20"/>
                 <w:rtl w:val="0"/>
               </w:rPr>
               <w:t xml:space="preserve">Tiempo de Respuesta</w:t>
@@ -3133,10 +3299,15 @@
               <w:spacing w:before="0" w:line="240" w:lineRule="auto"/>
               <w:ind w:firstLine="0"/>
               <w:jc w:val="left"/>
-              <w:rPr/>
+              <w:rPr>
+                <w:sz w:val="20"/>
+                <w:szCs w:val="20"/>
+              </w:rPr>
             </w:pPr>
             <w:r>
               <w:rPr>
+                <w:sz w:val="20"/>
+                <w:szCs w:val="20"/>
                 <w:rtl w:val="0"/>
               </w:rPr>
               <w:t xml:space="preserve">Las operaciones de consulta y escritura mediante la API/Script no debe demorar más de 3 segundos bajo una conexión estándar a internet.</w:t>
@@ -3166,10 +3337,15 @@
               <w:spacing w:before="0" w:line="240" w:lineRule="auto"/>
               <w:ind w:firstLine="0"/>
               <w:jc w:val="left"/>
-              <w:rPr/>
+              <w:rPr>
+                <w:sz w:val="20"/>
+                <w:szCs w:val="20"/>
+              </w:rPr>
             </w:pPr>
             <w:r>
               <w:rPr>
+                <w:sz w:val="20"/>
+                <w:szCs w:val="20"/>
                 <w:rtl w:val="0"/>
               </w:rPr>
               <w:t xml:space="preserve">Rendimiento</w:t>
@@ -3205,10 +3381,15 @@
               <w:spacing w:before="0" w:line="240" w:lineRule="auto"/>
               <w:ind w:firstLine="0"/>
               <w:jc w:val="left"/>
-              <w:rPr/>
+              <w:rPr>
+                <w:sz w:val="20"/>
+                <w:szCs w:val="20"/>
+              </w:rPr>
             </w:pPr>
             <w:r>
               <w:rPr>
+                <w:sz w:val="20"/>
+                <w:szCs w:val="20"/>
                 <w:rtl w:val="0"/>
               </w:rPr>
               <w:t xml:space="preserve">Seguridad de Acceso</w:t>
@@ -3238,10 +3419,15 @@
               <w:spacing w:before="0" w:line="240" w:lineRule="auto"/>
               <w:ind w:firstLine="0"/>
               <w:jc w:val="left"/>
-              <w:rPr/>
+              <w:rPr>
+                <w:sz w:val="20"/>
+                <w:szCs w:val="20"/>
+              </w:rPr>
             </w:pPr>
             <w:r>
               <w:rPr>
+                <w:sz w:val="20"/>
+                <w:szCs w:val="20"/>
                 <w:rtl w:val="0"/>
               </w:rPr>
               <w:t xml:space="preserve">El acceso directo a la base de datos, estará restringido mediante permisos nativos de la cuenta google del administrador.</w:t>
@@ -3271,10 +3457,15 @@
               <w:spacing w:before="0" w:line="240" w:lineRule="auto"/>
               <w:ind w:firstLine="0"/>
               <w:jc w:val="left"/>
-              <w:rPr/>
+              <w:rPr>
+                <w:sz w:val="20"/>
+                <w:szCs w:val="20"/>
+              </w:rPr>
             </w:pPr>
             <w:r>
               <w:rPr>
+                <w:sz w:val="20"/>
+                <w:szCs w:val="20"/>
                 <w:rtl w:val="0"/>
               </w:rPr>
               <w:t xml:space="preserve">Seguridad</w:t>
@@ -3310,10 +3501,15 @@
               <w:spacing w:before="0" w:line="240" w:lineRule="auto"/>
               <w:ind w:firstLine="0"/>
               <w:jc w:val="left"/>
-              <w:rPr/>
+              <w:rPr>
+                <w:sz w:val="20"/>
+                <w:szCs w:val="20"/>
+              </w:rPr>
             </w:pPr>
             <w:r>
               <w:rPr>
+                <w:sz w:val="20"/>
+                <w:szCs w:val="20"/>
                 <w:rtl w:val="0"/>
               </w:rPr>
               <w:t xml:space="preserve">Escalabilidad</w:t>
@@ -3343,10 +3539,15 @@
               <w:spacing w:before="0" w:line="240" w:lineRule="auto"/>
               <w:ind w:firstLine="0"/>
               <w:jc w:val="left"/>
-              <w:rPr/>
+              <w:rPr>
+                <w:sz w:val="20"/>
+                <w:szCs w:val="20"/>
+              </w:rPr>
             </w:pPr>
             <w:r>
               <w:rPr>
+                <w:sz w:val="20"/>
+                <w:szCs w:val="20"/>
                 <w:rtl w:val="0"/>
               </w:rPr>
               <w:t xml:space="preserve">El código de JavaScript de lógica de negocio debe ser estructurado de manera modular y desacoplada para permitir una futura migración hacia una base de datos relacional robusta.</w:t>
@@ -3376,10 +3577,15 @@
               <w:spacing w:before="0" w:line="240" w:lineRule="auto"/>
               <w:ind w:firstLine="0"/>
               <w:jc w:val="left"/>
-              <w:rPr/>
+              <w:rPr>
+                <w:sz w:val="20"/>
+                <w:szCs w:val="20"/>
+              </w:rPr>
             </w:pPr>
             <w:r>
               <w:rPr>
+                <w:sz w:val="20"/>
+                <w:szCs w:val="20"/>
                 <w:rtl w:val="0"/>
               </w:rPr>
               <w:t xml:space="preserve">Mantenibilidad</w:t>
@@ -3408,6 +3614,23 @@
         </w:rPr>
       </w:pPr>
       <w:r>
+        <w:br w:type="page"/>
+      </w:r>
+      <w:r>
+        <w:rPr>
+          <w:rtl w:val="0"/>
+        </w:rPr>
+      </w:r>
+    </w:p>
+    <w:p>
+      <w:pPr>
+        <w:ind w:firstLine="0"/>
+        <w:rPr>
+          <w:b w:val="1"/>
+          <w:bCs w:val="1"/>
+        </w:rPr>
+      </w:pPr>
+      <w:r>
         <w:rPr>
           <w:b w:val="1"/>
           <w:bCs w:val="1"/>
@@ -4100,7 +4323,7 @@
           <wp:anchor allowOverlap="1" behindDoc="0" distB="114300" distT="114300" distL="114300" distR="114300" hidden="0" layoutInCell="1" locked="0" relativeHeight="0" simplePos="0">
             <wp:simplePos x="0" y="0"/>
             <wp:positionH relativeFrom="column">
-              <wp:posOffset>-638173</wp:posOffset>
+              <wp:posOffset>-638172</wp:posOffset>
             </wp:positionH>
             <wp:positionV relativeFrom="paragraph">
               <wp:posOffset>114300</wp:posOffset>
@@ -4108,12 +4331,12 @@
             <wp:extent cx="6923301" cy="3428683"/>
             <wp:effectExtent b="0" l="0" r="0" t="0"/>
             <wp:wrapSquare wrapText="bothSides" distB="114300" distT="114300" distL="114300" distR="114300"/>
-            <wp:docPr id="2" name="image2.png"/>
+            <wp:docPr id="4" name="image3.png"/>
             <a:graphic>
               <a:graphicData uri="http://schemas.openxmlformats.org/drawingml/2006/picture">
                 <pic:pic>
                   <pic:nvPicPr>
-                    <pic:cNvPr id="0" name="image2.png"/>
+                    <pic:cNvPr id="0" name="image3.png"/>
                     <pic:cNvPicPr preferRelativeResize="0"/>
                   </pic:nvPicPr>
                   <pic:blipFill>
@@ -5534,7 +5757,7 @@
           <wp:inline distB="114300" distT="114300" distL="114300" distR="114300">
             <wp:extent cx="5722937" cy="2560262"/>
             <wp:effectExtent b="0" l="0" r="0" t="0"/>
-            <wp:docPr id="3" name="image4.png"/>
+            <wp:docPr id="1" name="image4.png"/>
             <a:graphic>
               <a:graphicData uri="http://schemas.openxmlformats.org/drawingml/2006/picture">
                 <pic:pic>
@@ -5637,12 +5860,12 @@
           <wp:inline distB="114300" distT="114300" distL="114300" distR="114300">
             <wp:extent cx="5793105" cy="2590800"/>
             <wp:effectExtent b="0" l="0" r="0" t="0"/>
-            <wp:docPr id="4" name="image3.png"/>
+            <wp:docPr id="2" name="image1.png"/>
             <a:graphic>
               <a:graphicData uri="http://schemas.openxmlformats.org/drawingml/2006/picture">
                 <pic:pic>
                   <pic:nvPicPr>
-                    <pic:cNvPr id="0" name="image3.png"/>
+                    <pic:cNvPr id="0" name="image1.png"/>
                     <pic:cNvPicPr preferRelativeResize="0"/>
                   </pic:nvPicPr>
                   <pic:blipFill>

</xml_diff>

<commit_message>
AVANCE PROYECTO Y EXCEL
</commit_message>
<xml_diff>
--- a/PROYECTO ING SOFTWARE PENDIENTE (1).docx
+++ b/PROYECTO ING SOFTWARE PENDIENTE (1).docx
@@ -68,7 +68,7 @@
                     <pic:cNvPicPr preferRelativeResize="0"/>
                   </pic:nvPicPr>
                   <pic:blipFill>
-                    <a:blip r:embed="rId8"/>
+                    <a:blip r:embed="rId9"/>
                     <a:srcRect/>
                     <a:stretch>
                       <a:fillRect/>
@@ -407,8 +407,8 @@
           <w:szCs w:val="22"/>
         </w:rPr>
         <w:sectPr>
-          <w:footerReference w:type="default" r:id="rId9"/>
-          <w:footerReference w:type="first" r:id="rId10"/>
+          <w:footerReference w:type="default" r:id="rId10"/>
+          <w:footerReference w:type="first" r:id="rId11"/>
           <w:pgSz w:w="12240" w:h="15840"/>
           <w:pgMar w:top="1417" w:right="1417" w:bottom="1417" w:left="1700" w:header="720" w:footer="720" w:gutter="0"/>
           <w:pgNumType w:start="1"/>
@@ -1021,11 +1021,6 @@
     </w:p>
     <w:p>
       <w:r>
-        <w:t xml:space="preserve">Existen actualmente muchos centros de cuidado y atención de animales de compañía, donde manejar una agenda para la atención es prioridad, genera confianza hacia el usuario y optimiza recursos. </w:t>
-      </w:r>
-    </w:p>
-    <w:p>
-      <w:r>
         <w:t>Es un proyecto básico utilizando programas accesibles, donde se puede administrar una base de datos básica y un sistema pequeño para usuarios que recién inician con sus actividades profesionales.</w:t>
       </w:r>
     </w:p>
@@ -1269,7 +1264,6 @@
           <w:bCs/>
           <w:color w:val="000000"/>
         </w:rPr>
-        <w:lastRenderedPageBreak/>
         <w:t>Historial Clínico Completo:</w:t>
       </w:r>
       <w:r>
@@ -1350,17 +1344,9 @@
       </w:r>
     </w:p>
     <w:p>
-      <w:pPr>
-        <w:pStyle w:val="Ttulo2"/>
-      </w:pPr>
       <w:bookmarkStart w:id="7" w:name="_heading=h.gcdeu4mc4gw2" w:colFirst="0" w:colLast="0"/>
       <w:bookmarkEnd w:id="7"/>
       <w:r>
-        <w:t>Antecedentes de la investigación</w:t>
-      </w:r>
-    </w:p>
-    <w:p>
-      <w:r>
         <w:t>Rodríguez y Silva (2022), en su investigación titulada “Optimización de procesos de atención al cliente mediante plataformas web en clínicas veterinarias” para la Universidad Politécnica de Valencia, desarrollaron una aplicación orientada a la gestión de citas. La cual redujo el 35 % el tiempo de espera y aportó a la mejora de fidelización del usuario.</w:t>
       </w:r>
     </w:p>
@@ -1371,32 +1357,179 @@
     </w:p>
     <w:p>
       <w:r>
-        <w:t xml:space="preserve">El desarrollo de sistemas de información requiere de metodologías estructuradas que garanticen la calidad y eficiencia del producto final. En este contexto, el modelo de desarrollo incremental surge como una respuesta directa a las limitaciones de los enfoques tradicionales y rígidos, como el modelo en cascada. El origen de este modelo se remonta a la década de 1980, y su conceptualización principal se atribuye al ingeniero Harlan Mills (Mills, 1980). Durante su trayectoria en IBM, Mills propuso que los sistemas de software complejos no debían construirse en un único esfuerzo monolítico, sino que debían desarrollarse de manera orgánica a través de entregas funcionales y acumulativas. Esta visión fue posteriormente refinada por diversos académicos de la ingeniería de software, consolidándose como una estrategia fundamental para proyectos modernos (Sommerville, 2011). </w:t>
-      </w:r>
-      <w:r>
-        <w:br/>
-      </w:r>
-      <w:r>
-        <w:br/>
-        <w:t xml:space="preserve">En cuanto a su propósito y utilidad, el modelo incremental sirve para dividir un proyecto de gran magnitud en múltiples partes más pequeñas, manejables y operativas, denominadas "incrementos" (Pressman, 2010). Su objetivo principal es entregar valor y funcionalidad al usuario desde las etapas más tempranas del ciclo de vida del desarrollo. Esto significa que el cliente no tiene que esperar hasta el final del proyecto </w:t>
+        <w:t>El desarrollo de sistemas de información requiere de metodologías estructuradas que garanticen la calidad y eficiencia del producto final. En este contexto, el modelo de desarrollo incremental surge como una respuesta directa a las limitaciones de los enfoques tradicionales y rígidos, como el modelo en cascada. El origen de este modelo se remonta a la década de 1980, y su conceptualización principal se atribuye al ingeniero Harlan Mills (</w:t>
+      </w:r>
+      <w:r>
+        <w:fldChar w:fldCharType="begin"/>
+      </w:r>
+      <w:r>
+        <w:instrText xml:space="preserve"> ADDIN ZOTERO_ITEM CSL_CITATION {"citationID":"vaXDFZIp","properties":{"unsorted":false,"formattedCitation":"(Mills, 1999)","plainCitation":"(Mills, 1999)","dontUpdate":true,"noteIndex":0},"citationItems":[{"id":65,"uris":["http://zotero.org/users/local/qNloqAmT/items/826QJDCU"],"itemData":{"id":65,"type":"article-journal","abstract":"&lt;p&gt;Software engineering may be defined as the systematic design and development of software products and the management of the software process. The general principles of software engineering are set forth in Part I, in which the author relates software engineering to the whole field of the system development process--system engineering, hardware engineering, software engineering, and system integration. Presented briefly are overviews of the major aspects of software engineering--design, development, and management.&lt;/p&gt;","language":"en","source":"trace.tennessee.edu","title":"Management of Software Engineering, The - Part I: Principles of Software Engineering","title-short":"Management of Software Engineering, The - Part I","URL":"https://trace.tennessee.edu/handle/20.500.14382/47084","author":[{"family":"Mills","given":"Harlan D."}],"accessed":{"date-parts":[["2026",7,25]]},"issued":{"date-parts":[["1999",1,1]]}}}],"schema":"https://github.com/citation-style-language/schema/raw/master/csl-citation.json"} </w:instrText>
+      </w:r>
+      <w:r>
+        <w:fldChar w:fldCharType="separate"/>
+      </w:r>
+      <w:r>
+        <w:t>Mills, 1999)</w:t>
+      </w:r>
+      <w:r>
+        <w:fldChar w:fldCharType="end"/>
+      </w:r>
+      <w:r>
+        <w:t>.</w:t>
+      </w:r>
+      <w:r>
+        <w:t xml:space="preserve"> Durante su trayectoria en IBM, Mills propuso que los sistemas de software complejos no debían construirse en un único esfuerzo monolítico, sino que debían desarrollarse de manera orgánica a través de entregas funcionales y acumulativas. Esta visión fue posteriormente refinada por diversos académicos de la ingeniería de software, consolidándose como una estrategia fundamental para proyectos modernos </w:t>
+      </w:r>
+      <w:r>
+        <w:fldChar w:fldCharType="begin"/>
+      </w:r>
+      <w:r>
+        <w:instrText xml:space="preserve"> ADDIN ZOTERO_ITEM CSL_CITATION {"citationID":"JpDw1tam","properties":{"unsorted":false,"formattedCitation":"(Sommerville, 2011)","plainCitation":"(Sommerville, 2011)","noteIndex":0},"citationItems":[{"id":60,"uris":["http://zotero.org/users/local/qNloqAmT/items/Z2A98QF7"],"itemData":{"id":60,"type":"book","abstract":"This book discusses a comprehensive spectrum of software engineering techniques and shows how they can be applied in practical software projects. This edition features updated chapters on critical systems, project management and software requirements","edition":"9th ed","ISBN":"978-0-13-703515-1","language":"es","note":"OCLC: 462909026","publisher":"Pearson","publisher-place":"Boston","source":"Open WorldCat","title":"Software engineering","author":[{"family":"Sommerville","given":"Ian"}],"issued":{"date-parts":[["2011"]]}}}],"schema":"https://github.com/citation-style-language/schema/raw/master/csl-citation.json"} </w:instrText>
+      </w:r>
+      <w:r>
+        <w:fldChar w:fldCharType="separate"/>
+      </w:r>
+      <w:r>
+        <w:t>(Sommerville, 2011)</w:t>
+      </w:r>
+      <w:r>
+        <w:fldChar w:fldCharType="end"/>
+      </w:r>
+    </w:p>
+    <w:p>
+      <w:r>
+        <w:t>En</w:t>
+      </w:r>
+      <w:r>
+        <w:t xml:space="preserve"> cuanto a su propósito y utilidad, el modelo incremental sirve para dividir un proyecto de gran magnitud en múltiples partes más pequeñas, manejables y operativas, denominadas "incrementos" (Pressman, 2010). Su objetivo principal es entregar valor y funcionalidad al usuario desde las etapas más tempranas del ciclo de vida del desarrollo. Esto significa que el cliente no tiene que esperar hasta el final del proyecto para ver resultados; en su lugar, recibe un núcleo básico del software que ya puede utilizar, mientras el equipo de desarrollo continúa trabajando de forma paralela </w:t>
       </w:r>
       <w:r>
         <w:lastRenderedPageBreak/>
-        <w:t xml:space="preserve">para ver resultados; en su lugar, recibe un núcleo básico del software que ya puede utilizar, mientras el equipo de desarrollo continúa trabajando de forma paralela en las funciones secundarias o de mayor complejidad técnica (Larman, 2003). Esta dinámica resulta especialmente útil para mitigar los riesgos del proyecto, ya que cualquier fallo o desviación en los requerimientos se detecta y corrige en la etapa inicial del ciclo de vida (Beck, 2000). </w:t>
-      </w:r>
-      <w:r>
-        <w:br/>
-      </w:r>
-      <w:r>
-        <w:br/>
-        <w:t xml:space="preserve">La estructura operativa del modelo incremental se basa en la repetición de un ciclo de trabajo bien definido. Cada incremento individual atraviesa las fases clásicas de la ingeniería de software: comunicación y análisis de requisitos, diseño arquitectónico, codificación, pruebas exhaustivas y, finalmente, el despliegue (Pressman, 2010). A medida que se completa una iteración, el nuevo módulo desarrollado se integra cuidadosamente con los incrementos anteriores (Sommerville, 2011). En el contexto de un sistema web de gestión, el primer incremento podría consistir únicamente en el inicio de sesión y el registro de clientes, el segundo incremento podría sumar el módulo de citas, y los siguientes integrarían reportes o facturación, asegurando en todo momento que el sistema en producción siga siendo estable. </w:t>
-      </w:r>
-      <w:r>
-        <w:br/>
-      </w:r>
-      <w:r>
-        <w:br/>
-        <w:t xml:space="preserve">Para que esta estructura de entregas escalonadas funcione correctamente, es indispensable establecer una jerarquía de roles con responsabilidades claras dentro del equipo de trabajo. En la cúspide de la gestión se encuentra el Líder de Proyecto, quien tiene la responsabilidad de coordinar las iteraciones, definir el alcance de cada incremento y asegurar que se cumplan los tiempos de entrega (Schwalbe, 2015). A su lado, el Analista de Sistemas desempeña el rol de traducir las necesidades comerciales del cliente en requerimientos técnicos y diseñar la base de datos de tal forma que pueda escalar a medida que se añadan los futuros incrementos (Kendall y Kendall, 2011). </w:t>
+        <w:t>en las funciones secundarias o de mayor complejidad técnica Esta dinámica resulta especialmente útil para mitigar los riesgos del proyecto, ya que cualquier fallo o desviación en los requerimientos se detecta y corrige en la etapa inicial del ciclo de vida (Beck, 2000).</w:t>
+      </w:r>
+    </w:p>
+    <w:p>
+      <w:r>
+        <w:t xml:space="preserve">La estructura operativa del modelo incremental se basa en la repetición de un ciclo de trabajo bien definido. Cada incremento individual atraviesa las fases clásicas de la ingeniería de software: comunicación y análisis de requisitos, diseño arquitectónico, codificación, pruebas exhaustivas y, finalmente, el despliegue A medida que se completa una iteración, el nuevo módulo desarrollado se integra cuidadosamente con los incrementos anteriores </w:t>
+      </w:r>
+      <w:r>
+        <w:fldChar w:fldCharType="begin"/>
+      </w:r>
+      <w:r>
+        <w:instrText xml:space="preserve"> ADDIN ZOTERO_ITEM CSL_CITATION {"citationID":"1RdhUbFg","properties":{"unsorted":false,"formattedCitation":"(Sommerville, 2011)","plainCitation":"(Sommerville, 2011)","noteIndex":0},"citationItems":[{"id":60,"uris":["http://zotero.org/users/local/qNloqAmT/items/Z2A98QF7"],"itemData":{"id":60,"type":"book","abstract":"This book discusses a comprehensive spectrum of software engineering techniques and shows how they can be applied in practical software projects. This edition features updated chapters on critical systems, project management and software requirements","edition":"9th ed","ISBN":"978-0-13-703515-1","language":"es","note":"OCLC: 462909026","publisher":"Pearson","publisher-place":"Boston","source":"Open WorldCat","title":"Software engineering","author":[{"family":"Sommerville","given":"Ian"}],"issued":{"date-parts":[["2011"]]}}}],"schema":"https://github.com/citation-style-language/schema/raw/master/csl-citation.json"} </w:instrText>
+      </w:r>
+      <w:r>
+        <w:fldChar w:fldCharType="separate"/>
+      </w:r>
+      <w:r>
+        <w:t>(Sommerville, 2011)</w:t>
+      </w:r>
+      <w:r>
+        <w:fldChar w:fldCharType="end"/>
+      </w:r>
+      <w:r>
+        <w:t>.</w:t>
+      </w:r>
+      <w:r>
+        <w:t>En el contexto de un sistema web de gestión, el primer incremento podría consistir únicamente en el inicio de sesión y el registro de clientes, el segundo incremento podría sumar el módulo de citas, y los siguientes integrarían reportes o facturación, asegurando en todo momento que el sistema en producción siga siendo estable.</w:t>
+      </w:r>
+    </w:p>
+    <w:p>
+      <w:pPr>
+        <w:rPr>
+          <w:lang w:val="es-EC"/>
+        </w:rPr>
+      </w:pPr>
+      <w:r>
+        <w:t xml:space="preserve">Para que esta estructura de entregas escalonadas funcione correctamente, es indispensable establecer una jerarquía de roles con responsabilidades claras dentro del equipo de trabajo. En la cúspide de la gestión se encuentra el Líder de Proyecto, quien tiene la responsabilidad de coordinar las iteraciones, definir el alcance de cada incremento y asegurar que se cumplan los tiempos de entrega </w:t>
+      </w:r>
+      <w:r>
+        <w:fldChar w:fldCharType="begin"/>
+      </w:r>
+      <w:r>
+        <w:instrText xml:space="preserve"> ADDIN ZOTERO_ITEM CSL_CITATION {"citationID":"JWCszWgM","properties":{"unsorted":false,"formattedCitation":"({\\i{}Schwalbe, K. (2015). Information Technology Project Management. Cengage Learning. - References - Scientific Research Publishing}, s.\\uc0\\u160{}f.)","plainCitation":"(Schwalbe, K. (2015). Information Technology Project Management. Cengage Learning. - References - Scientific Research Publishing, s. f.)","noteIndex":0},"citationItems":[{"id":69,"uris":["http://zotero.org/users/local/qNloqAmT/items/4ZV6Z73X"],"itemData":{"id":69,"type":"webpage","title":"Schwalbe, K. (2015). Information Technology Project Management. Cengage Learning. - References - Scientific Research Publishing","URL":"https://www.scirp.org/reference/referencespapers?referenceid=3225970","accessed":{"date-parts":[["2026",7,25]]}}}],"schema":"https://github.com/citation-style-language/schema/raw/master/csl-citation.json"} </w:instrText>
+      </w:r>
+      <w:r>
+        <w:fldChar w:fldCharType="separate"/>
+      </w:r>
+      <w:r>
+        <w:t>(</w:t>
+      </w:r>
+      <w:r>
+        <w:rPr>
+          <w:i/>
+          <w:iCs/>
+        </w:rPr>
+        <w:t xml:space="preserve">Schwalbe, K. (2015). </w:t>
+      </w:r>
+      <w:r>
+        <w:rPr>
+          <w:i/>
+          <w:iCs/>
+          <w:lang w:val="en-US"/>
+        </w:rPr>
+        <w:t xml:space="preserve">Information Technology Project Management. </w:t>
+      </w:r>
+      <w:r>
+        <w:rPr>
+          <w:i/>
+          <w:iCs/>
+          <w:lang w:val="es-EC"/>
+        </w:rPr>
+        <w:t>Cengage Learning. - References - Scientific Research Publishing</w:t>
+      </w:r>
+      <w:r>
+        <w:rPr>
+          <w:lang w:val="es-EC"/>
+        </w:rPr>
+        <w:t>, s. f.)</w:t>
+      </w:r>
+      <w:r>
+        <w:fldChar w:fldCharType="end"/>
+      </w:r>
+      <w:r>
+        <w:t xml:space="preserve"> </w:t>
+      </w:r>
+      <w:r>
+        <w:t>.</w:t>
+      </w:r>
+      <w:r>
+        <w:t>A su lado, el Analista de Sistemas desempeña el rol de traducir las necesidades comerciales del cliente en requerimientos técnicos y diseñar la base de datos de tal forma que pueda escalar a medida que se añadan los futuros incrementos</w:t>
+      </w:r>
+      <w:r>
+        <w:t>.</w:t>
+      </w:r>
+      <w:r>
+        <w:t xml:space="preserve"> </w:t>
+      </w:r>
+      <w:r>
+        <w:t>(</w:t>
+      </w:r>
+      <w:r>
+        <w:rPr>
+          <w:lang w:val="es-EC"/>
+        </w:rPr>
+        <w:t xml:space="preserve">Kendall, K. E. y Kendall, J. E. (2011). </w:t>
+      </w:r>
+      <w:r>
+        <w:rPr>
+          <w:i/>
+          <w:iCs/>
+          <w:lang w:val="es-EC"/>
+        </w:rPr>
+        <w:t>Análisis y diseño de sistemas</w:t>
+      </w:r>
+      <w:r>
+        <w:rPr>
+          <w:lang w:val="es-EC"/>
+        </w:rPr>
+        <w:t xml:space="preserve"> (8.ª ed.). Pearson Educación</w:t>
+      </w:r>
+      <w:r>
+        <w:t>)</w:t>
+      </w:r>
+      <w:r>
+        <w:t>.</w:t>
       </w:r>
     </w:p>
     <w:p>
@@ -1405,8 +1538,37 @@
       </w:r>
     </w:p>
     <w:p>
-      <w:r>
+      <w:pPr>
+        <w:rPr>
+          <w:i/>
+          <w:iCs/>
+          <w:u w:val="single"/>
+        </w:rPr>
+      </w:pPr>
+      <w:r>
+        <w:rPr>
+          <w:i/>
+          <w:iCs/>
+          <w:u w:val="single"/>
+        </w:rPr>
         <w:t>Javier - Product Owner &amp; QA / Arquitecto de Software</w:t>
+      </w:r>
+    </w:p>
+    <w:p>
+      <w:r>
+        <w:lastRenderedPageBreak/>
+        <w:t>Gestión: Dueño del producto encargado de la planificación general, entrevistas con los usuarios, definición del problema, levantamiento de requerimientos, casos de uso y la gestión del Product Backlog para maximizar el valor del sistema.</w:t>
+      </w:r>
+    </w:p>
+    <w:p>
+      <w:r>
+        <w:t xml:space="preserve">Técnico: </w:t>
+      </w:r>
+      <w:r>
+        <w:t>responsable</w:t>
+      </w:r>
+      <w:r>
+        <w:t xml:space="preserve"> del diseño de la arquitectura del Software y de control de calidad (QA), asegurando que el producto cumpla con los estándares técnicos y funcionales.</w:t>
       </w:r>
     </w:p>
     <w:p>
@@ -1414,10 +1576,19 @@
         <w:tabs>
           <w:tab w:val="left" w:pos="7013"/>
         </w:tabs>
-      </w:pPr>
-      <w:r>
-        <w:lastRenderedPageBreak/>
-        <w:t>Gestión: Dueño del producto encargado de la planificación general, entrevistas con los usuarios, definición del problema, levantamiento de requerimientos, casos de uso y la gestión del Product Backlog para maximizar el valor del sistema.</w:t>
+        <w:rPr>
+          <w:i/>
+          <w:iCs/>
+          <w:u w:val="single"/>
+        </w:rPr>
+      </w:pPr>
+      <w:r>
+        <w:rPr>
+          <w:i/>
+          <w:iCs/>
+          <w:u w:val="single"/>
+        </w:rPr>
+        <w:t>Genesis: - Scrum Developer &amp; Desarrolladora Full Stack</w:t>
       </w:r>
     </w:p>
     <w:p>
@@ -1427,13 +1598,7 @@
         </w:tabs>
       </w:pPr>
       <w:r>
-        <w:t xml:space="preserve">Técnico: </w:t>
-      </w:r>
-      <w:r>
-        <w:t>responsable</w:t>
-      </w:r>
-      <w:r>
-        <w:t xml:space="preserve"> del diseño de la arquitectura del Software y de control de calidad (QA), asegurando que el producto cumpla con los estándares técnicos y funcionales.</w:t>
+        <w:t>Gestión: miembro del equipo de desarrollo encargado de transformar los requerimientos en incrementos de software fundacionales en cada Sprint.</w:t>
       </w:r>
     </w:p>
     <w:p>
@@ -1443,7 +1608,13 @@
         </w:tabs>
       </w:pPr>
       <w:r>
-        <w:t>Genesis: - Scrum Developer &amp; Desarrolladora Full Stack</w:t>
+        <w:t xml:space="preserve">Técnico: </w:t>
+      </w:r>
+      <w:r>
+        <w:t>responsable</w:t>
+      </w:r>
+      <w:r>
+        <w:t xml:space="preserve"> del diseño, maquetación e implementación de la interfaz de usuario (Frontend), así, como de la lógica de programación, servicios y gestión de la base de datos básica (Backend).</w:t>
       </w:r>
     </w:p>
     <w:p>
@@ -1451,9 +1622,19 @@
         <w:tabs>
           <w:tab w:val="left" w:pos="7013"/>
         </w:tabs>
-      </w:pPr>
-      <w:r>
-        <w:t>Gestión: miembro del equipo de desarrollo encargado de transformar los requerimientos en incrementos de software fundacionales en cada Sprint.</w:t>
+        <w:rPr>
+          <w:i/>
+          <w:iCs/>
+          <w:u w:val="single"/>
+        </w:rPr>
+      </w:pPr>
+      <w:r>
+        <w:rPr>
+          <w:i/>
+          <w:iCs/>
+          <w:u w:val="single"/>
+        </w:rPr>
+        <w:t>Mafer - Scrum Master &amp; DevOps Engineer</w:t>
       </w:r>
     </w:p>
     <w:p>
@@ -1463,13 +1644,7 @@
         </w:tabs>
       </w:pPr>
       <w:r>
-        <w:t xml:space="preserve">Técnico: </w:t>
-      </w:r>
-      <w:r>
-        <w:t>responsable</w:t>
-      </w:r>
-      <w:r>
-        <w:t xml:space="preserve"> del diseño, maquetación e implementación de la interfaz de usuario (Frontend), así, como de la lógica de programación, servicios y gestión de la base de datos básica (Backend).</w:t>
+        <w:t>Gestión: facilitadora del proceso ágil. Se encarga de eliminar impedimentos que afecten al equipo, proteger el ritmo de trabajo y asegurar el cumplimiento de las prácticas de Scrum.</w:t>
       </w:r>
     </w:p>
     <w:p>
@@ -1479,26 +1654,6 @@
         </w:tabs>
       </w:pPr>
       <w:r>
-        <w:t>Mafer - Scrum Master &amp; DevOps Engineer</w:t>
-      </w:r>
-    </w:p>
-    <w:p>
-      <w:pPr>
-        <w:tabs>
-          <w:tab w:val="left" w:pos="7013"/>
-        </w:tabs>
-      </w:pPr>
-      <w:r>
-        <w:t>Gestión: facilitadora del proceso ágil. Se encarga de eliminar impedimentos que afecten al equipo, proteger el ritmo de trabajo y asegurar el cumplimiento de las prácticas de Scrum.</w:t>
-      </w:r>
-    </w:p>
-    <w:p>
-      <w:pPr>
-        <w:tabs>
-          <w:tab w:val="left" w:pos="7013"/>
-        </w:tabs>
-      </w:pPr>
-      <w:r>
         <w:t>Técnico: Responsable de la configuración de entornos, despliegue del sistema y aseguramiento de que las herramientas accesibles elegidas funcionan correctamente en el ciclo de entrega.</w:t>
       </w:r>
     </w:p>
@@ -1521,44 +1676,16 @@
     </w:p>
     <w:p>
       <w:pPr>
-        <w:rPr>
-          <w:b/>
-          <w:bCs/>
-        </w:rPr>
-      </w:pPr>
-      <w:r>
-        <w:rPr>
-          <w:b/>
-          <w:bCs/>
-        </w:rPr>
-        <w:t xml:space="preserve">Ingeniería de requerimientos (versión completa): </w:t>
-      </w:r>
-    </w:p>
-    <w:p>
-      <w:pPr>
-        <w:rPr>
-          <w:b/>
-          <w:bCs/>
-        </w:rPr>
-      </w:pPr>
-      <w:r>
-        <w:rPr>
-          <w:b/>
-          <w:bCs/>
-        </w:rPr>
-        <w:t xml:space="preserve">clasificación de requerimientos funcionales y no funcionales, </w:t>
-      </w:r>
-    </w:p>
-    <w:p>
-      <w:r>
-        <w:rPr>
-          <w:b/>
-          <w:bCs/>
-        </w:rPr>
-        <w:t>proceso seguido y aplicación de técnicas de levantamiento de requerimientos, con evidencia concreta, más la especificación de requerimientos (SRS) completa.</w:t>
-      </w:r>
-    </w:p>
-    <w:p>
+        <w:pStyle w:val="Ttulo1"/>
+      </w:pPr>
+      <w:r>
+        <w:t xml:space="preserve">Ingeniería de requerimientos </w:t>
+      </w:r>
+    </w:p>
+    <w:p>
+      <w:pPr>
+        <w:pStyle w:val="Ttulo2"/>
+      </w:pPr>
       <w:r>
         <w:t>Proceso de levantamiento y técnicas aplicadas</w:t>
       </w:r>
@@ -1570,17 +1697,40 @@
     </w:p>
     <w:p>
       <w:r>
+        <w:rPr>
+          <w:i/>
+          <w:iCs/>
+        </w:rPr>
         <w:t>Entrevista semiestructurada</w:t>
       </w:r>
-    </w:p>
-    <w:p>
+      <w:r>
+        <w:rPr>
+          <w:i/>
+          <w:iCs/>
+        </w:rPr>
+        <w:t xml:space="preserve">: </w:t>
+      </w:r>
       <w:r>
         <w:t>Se realizó una sesión con la administradora de la veterinaria para definir las reglas del negocio, horarios, servicios y atención médica.</w:t>
       </w:r>
     </w:p>
     <w:p>
       <w:r>
-        <w:t xml:space="preserve"> Análisis de artefactos: Se revisaron cuadernos de notas y plantillas de </w:t>
+        <w:rPr>
+          <w:i/>
+          <w:iCs/>
+        </w:rPr>
+        <w:t xml:space="preserve"> Análisis de artefactos</w:t>
+      </w:r>
+      <w:r>
+        <w:rPr>
+          <w:i/>
+          <w:iCs/>
+        </w:rPr>
+        <w:t xml:space="preserve">: </w:t>
+      </w:r>
+      <w:r>
+        <w:t xml:space="preserve">Se revisaron cuadernos de notas y plantillas de </w:t>
       </w:r>
       <w:r>
         <w:t>Excel</w:t>
@@ -1591,7 +1741,10 @@
     </w:p>
     <w:p>
       <w:r>
-        <w:t xml:space="preserve">Evidencia Levantamiento: Minuta de </w:t>
+        <w:t>Evidencia Levantamiento:</w:t>
+      </w:r>
+      <w:r>
+        <w:t xml:space="preserve"> Minuta de </w:t>
       </w:r>
       <w:r>
         <w:t>validación</w:t>
@@ -1623,17 +1776,41 @@
     </w:p>
     <w:p>
       <w:r>
+        <w:t xml:space="preserve">Acuerdo de diseño: Se determinó que el sistema no requiere control de roles complejo, ya que el acceso a la interfaz estará limitado en la computadora de recepción. </w:t>
+      </w:r>
+    </w:p>
+    <w:p>
+      <w:pPr>
+        <w:rPr>
+          <w:sz w:val="32"/>
+          <w:szCs w:val="32"/>
+        </w:rPr>
+      </w:pPr>
+      <w:r>
+        <w:br w:type="page"/>
+      </w:r>
+    </w:p>
+    <w:p>
+      <w:pPr>
+        <w:pStyle w:val="Ttulo2"/>
+      </w:pPr>
+      <w:r>
         <w:lastRenderedPageBreak/>
-        <w:t xml:space="preserve">Acuerdo de diseño: Se determinó que el sistema no requiere control de roles complejo, ya que el acceso a la interfaz estará limitado en la computadora de recepción. </w:t>
-      </w:r>
-    </w:p>
-    <w:p>
-      <w:r>
         <w:t>Clasificación de Requerimientos</w:t>
       </w:r>
     </w:p>
     <w:p>
-      <w:r>
+      <w:pPr>
+        <w:rPr>
+          <w:i/>
+          <w:iCs/>
+        </w:rPr>
+      </w:pPr>
+      <w:r>
+        <w:rPr>
+          <w:i/>
+          <w:iCs/>
+        </w:rPr>
         <w:t>Requerimientos Funcionales</w:t>
       </w:r>
     </w:p>
@@ -2263,14 +2440,43 @@
         </w:tbl>
       </w:sdtContent>
     </w:sdt>
-    <w:p/>
-    <w:p>
-      <w:r>
+    <w:p>
+      <w:pPr>
+        <w:ind w:firstLine="0"/>
+        <w:rPr>
+          <w:i/>
+          <w:iCs/>
+        </w:rPr>
+      </w:pPr>
+    </w:p>
+    <w:p>
+      <w:pPr>
+        <w:rPr>
+          <w:i/>
+          <w:iCs/>
+        </w:rPr>
+      </w:pPr>
+      <w:r>
+        <w:rPr>
+          <w:i/>
+          <w:iCs/>
+        </w:rPr>
+        <w:br w:type="page"/>
+      </w:r>
+    </w:p>
+    <w:p>
+      <w:pPr>
+        <w:ind w:firstLine="0"/>
+      </w:pPr>
+      <w:r>
+        <w:rPr>
+          <w:i/>
+          <w:iCs/>
+        </w:rPr>
         <w:lastRenderedPageBreak/>
         <w:t>Requisitos no funcionales</w:t>
       </w:r>
     </w:p>
-    <w:p/>
     <w:sdt>
       <w:sdtPr>
         <w:tag w:val="goog_rdk_1"/>
@@ -2822,87 +3028,51 @@
     </w:p>
     <w:p>
       <w:pPr>
-        <w:ind w:firstLine="0"/>
-        <w:rPr>
-          <w:b/>
-          <w:bCs/>
-        </w:rPr>
-      </w:pPr>
-      <w:r>
-        <w:rPr>
-          <w:b/>
-          <w:bCs/>
-        </w:rPr>
+        <w:pStyle w:val="Ttulo2"/>
+      </w:pPr>
+      <w:r>
         <w:lastRenderedPageBreak/>
         <w:t>Implementación</w:t>
       </w:r>
     </w:p>
     <w:p>
       <w:r>
-        <w:t xml:space="preserve">Dentro de la implementación del sistema de agendamiento para la veterinaria MONDELVET se ejecutó bajo un enfoque ágil e incremental, priorizando una solución sencilla, funcional y de bajos costos operativos que no requiera una infraestructura compleja. </w:t>
-      </w:r>
-    </w:p>
-    <w:p>
-      <w:pPr>
-        <w:rPr>
-          <w:b/>
-          <w:bCs/>
-        </w:rPr>
-      </w:pPr>
-      <w:r>
-        <w:rPr>
-          <w:b/>
-          <w:bCs/>
-        </w:rPr>
+        <w:t xml:space="preserve">Dentro de la implementación del sistema de agendamiento para la veterinaria se ejecutó bajo un enfoque ágil e incremental, priorizando una solución sencilla, funcional y de bajos costos operativos que no requiera una infraestructura compleja. </w:t>
+      </w:r>
+    </w:p>
+    <w:p>
+      <w:r>
         <w:t>El proceso se dividió en tres componentes principales:</w:t>
       </w:r>
     </w:p>
     <w:p>
-      <w:pPr>
-        <w:rPr>
-          <w:b/>
-          <w:bCs/>
-        </w:rPr>
-      </w:pPr>
-      <w:r>
-        <w:rPr>
-          <w:b/>
-          <w:bCs/>
-        </w:rPr>
-        <w:t>Configuración de Base de Datos (Google Sheets)</w:t>
-      </w:r>
-    </w:p>
-    <w:p>
-      <w:r>
-        <w:t xml:space="preserve">Se estructuró una hoja de cálculo en la nube para operar como repositorio </w:t>
-      </w:r>
-      <w:r>
-        <w:t>central</w:t>
-      </w:r>
-      <w:r>
-        <w:rPr>
-          <w:b/>
-          <w:bCs/>
-        </w:rPr>
-        <w:t xml:space="preserve"> de</w:t>
-      </w:r>
-      <w:r>
-        <w:t xml:space="preserve"> datos. Se definieron tablas independientes mediante pestañas de trabajo para organizar la información de clientes, mascotas, horarios disponibles, proformas y los catálogos de servicios. El uso de esta plataforma asegura la disponibilidad inmediata, persistencia de datos, acceso remoto y capacidades de edición en tiempo real sin costos de licenciamiento o hosting de base datos tradicionales.</w:t>
-      </w:r>
-    </w:p>
-    <w:p>
-      <w:pPr>
-        <w:rPr>
-          <w:b/>
-          <w:bCs/>
-        </w:rPr>
-      </w:pPr>
-      <w:r>
-        <w:rPr>
-          <w:b/>
-          <w:bCs/>
-        </w:rPr>
-        <w:t>Desarrollo de la Lógica del Negocio e integración (JavaScript)</w:t>
+      <w:r>
+        <w:t>Configuración de Base de Datos (</w:t>
+      </w:r>
+      <w:r>
+        <w:t>Microsoft Excel)</w:t>
+      </w:r>
+    </w:p>
+    <w:p>
+      <w:r>
+        <w:t xml:space="preserve">Se estructuró una hoja de cálculo </w:t>
+      </w:r>
+      <w:r>
+        <w:t>en Microsoft Excel</w:t>
+      </w:r>
+      <w:r>
+        <w:t>. Se definieron tablas independientes mediante pestañas de trabajo para organizar la información de clientes, mascotas, horarios disponibles, proformas y los catálogos de servicios.</w:t>
+      </w:r>
+    </w:p>
+    <w:p>
+      <w:r>
+        <w:t>Desarrollo de la Lógica del Negocio e integración (</w:t>
+      </w:r>
+      <w:r>
+        <w:t>Macros-Visual Basic</w:t>
+      </w:r>
+      <w:r>
+        <w:t>)</w:t>
       </w:r>
     </w:p>
     <w:p>
@@ -2910,13 +3080,27 @@
         <w:ind w:firstLine="0"/>
       </w:pPr>
       <w:r>
-        <w:t xml:space="preserve">La función del sistema se programó enteramente en JavaScript. Este componente actúa como el puente de comunicación directa con </w:t>
-      </w:r>
-      <w:r>
-        <w:t>API de</w:t>
-      </w:r>
-      <w:r>
-        <w:t xml:space="preserve"> Google Sheets, que se encarga de:</w:t>
+        <w:t xml:space="preserve">La función del sistema se programó enteramente en </w:t>
+      </w:r>
+      <w:r>
+        <w:t>Visual Basic</w:t>
+      </w:r>
+      <w:r>
+        <w:t>, permitiendo la automatización de procesos mediante macros y la interacción directa del usuario a través de botones y formularios</w:t>
+      </w:r>
+      <w:r>
+        <w:t xml:space="preserve">. Este componente </w:t>
+      </w:r>
+      <w:r>
+        <w:t>constituye el núcleo del sistema, ya que gestiona la lógica de negocio la validación de datos y la manipulación de la información almacenada en hojas de calculo Excel.</w:t>
+      </w:r>
+    </w:p>
+    <w:p>
+      <w:pPr>
+        <w:ind w:firstLine="0"/>
+      </w:pPr>
+      <w:r>
+        <w:t>El sistema esta diseñado para operar mediante una interfaz sencilla e intuitiva, en la cual el usuario ejecuta las acciones principales (registro, consulta, modificacion y cancelación de citas) mediante botones asignados a macros especificas. Entre las principales funcionalidades se destacan:</w:t>
       </w:r>
     </w:p>
     <w:p>
@@ -2927,7 +3111,7 @@
         </w:numPr>
       </w:pPr>
       <w:r>
-        <w:t>La captura y validación de datos provenientes de los formularios</w:t>
+        <w:t>Automatizacion de procesos mediante macros.</w:t>
       </w:r>
     </w:p>
     <w:p>
@@ -2939,7 +3123,7 @@
         <w:spacing w:before="0"/>
       </w:pPr>
       <w:r>
-        <w:t>La manipulación y persistencia de estructuras de datos</w:t>
+        <w:t>Manipulacion de datos en hojas de Excel.</w:t>
       </w:r>
     </w:p>
     <w:p>
@@ -2951,65 +3135,61 @@
         <w:spacing w:before="0"/>
       </w:pPr>
       <w:r>
-        <w:t>El control de concurrencia por medio de consultas dinámicos de disponibilidad de horarios para evitar duplicidad de citas</w:t>
+        <w:t>Control de disponibilidad de horarios.</w:t>
+      </w:r>
+    </w:p>
+    <w:p>
+      <w:pPr>
+        <w:numPr>
+          <w:ilvl w:val="0"/>
+          <w:numId w:val="1"/>
+        </w:numPr>
+        <w:spacing w:before="0"/>
+      </w:pPr>
+      <w:r>
+        <w:t>Gestion de eventos</w:t>
+      </w:r>
+    </w:p>
+    <w:p>
+      <w:pPr>
+        <w:numPr>
+          <w:ilvl w:val="0"/>
+          <w:numId w:val="1"/>
+        </w:numPr>
+        <w:spacing w:before="0"/>
+      </w:pPr>
+      <w:r>
+        <w:t>Validacion de datos en tiempo rela.</w:t>
+      </w:r>
+    </w:p>
+    <w:p>
+      <w:pPr>
+        <w:numPr>
+          <w:ilvl w:val="0"/>
+          <w:numId w:val="1"/>
+        </w:numPr>
+        <w:spacing w:before="0"/>
+      </w:pPr>
+      <w:r>
+        <w:t>Optimizacion de la experiencia del usuario.</w:t>
+      </w:r>
+    </w:p>
+    <w:p>
+      <w:pPr>
+        <w:pStyle w:val="Ttulo2"/>
+      </w:pPr>
+      <w:r>
+        <w:lastRenderedPageBreak/>
+        <w:t>Despliegue de la Interfaz de Usuaria (UI)</w:t>
       </w:r>
     </w:p>
     <w:p>
       <w:pPr>
         <w:ind w:firstLine="0"/>
-        <w:rPr>
-          <w:b/>
-          <w:bCs/>
-        </w:rPr>
-      </w:pPr>
-      <w:r>
-        <w:rPr>
-          <w:b/>
-          <w:bCs/>
-        </w:rPr>
-        <w:t>Despliegue de la Interfaz de Usuaria (UI)</w:t>
-      </w:r>
-    </w:p>
-    <w:p>
-      <w:pPr>
-        <w:ind w:firstLine="0"/>
-      </w:pPr>
-      <w:r>
-        <w:t xml:space="preserve">Se implementó una interfaz gráfica sencilla y amigable, diseñada bajo principios de usabilidad para facilitar su uso tanto por el personal de la clínica como por los clientes. Los módulos de agendamiento se estructuraron de manera clara para asegurar un flujo </w:t>
-      </w:r>
-      <w:r>
-        <w:lastRenderedPageBreak/>
-        <w:t>de usuario intuitivo y eficiente, facilitando el uso del sistema en las tareas básicas del negocio.</w:t>
-      </w:r>
-    </w:p>
-    <w:p>
-      <w:pPr>
-        <w:ind w:firstLine="0"/>
-        <w:rPr>
-          <w:b/>
-          <w:bCs/>
-        </w:rPr>
-      </w:pPr>
-      <w:r>
-        <w:rPr>
-          <w:b/>
-          <w:bCs/>
-        </w:rPr>
-        <w:t>Consideraciones de Escalabilidad</w:t>
-      </w:r>
-    </w:p>
-    <w:p>
-      <w:pPr>
-        <w:ind w:firstLine="0"/>
-      </w:pPr>
-      <w:r>
-        <w:t>Al cumplir con los requerimientos iniciales establecidos, la arquitectura modular del sistema se diseñó de manera separada. Esto asegura que, ante un eventual crecimiento de la veterinaria, la lógica programada en JavaScript pueda ser migrada hacia un motor de base de datos más robusto (como PostgreSQL o MySQL) con un impacto mínimo en el código base del sistema.</w:t>
-      </w:r>
-    </w:p>
-    <w:p>
-      <w:pPr>
-        <w:jc w:val="left"/>
-      </w:pPr>
+      </w:pPr>
+      <w:r>
+        <w:t>Se implementó una interfaz gráfica sencilla y amigable, diseñada bajo principios de usabilidad para facilitar su uso tanto por el personal de la clínica como por los clientes. Los módulos de agendamiento se estructuraron de manera clara para asegurar un flujo de usuario intuitivo y eficiente, facilitando el uso del sistema en las tareas básicas del negocio.</w:t>
+      </w:r>
     </w:p>
     <w:p>
       <w:pPr>
@@ -3043,400 +3223,22 @@
         <w:rPr>
           <w:b/>
           <w:bCs/>
+        </w:rPr>
+      </w:pPr>
+      <w:r>
+        <w:rPr>
+          <w:b/>
+          <w:bCs/>
           <w:smallCaps/>
           <w:color w:val="1F497D"/>
           <w:sz w:val="40"/>
           <w:szCs w:val="40"/>
         </w:rPr>
-      </w:pPr>
-      <w:r>
-        <w:rPr>
-          <w:b/>
-          <w:bCs/>
-          <w:smallCaps/>
-          <w:color w:val="1F497D"/>
-          <w:sz w:val="40"/>
-          <w:szCs w:val="40"/>
-        </w:rPr>
-        <w:br/>
-        <w:t>MANUAL DE USUARIO</w:t>
-      </w:r>
-      <w:r>
-        <w:rPr>
-          <w:b/>
-          <w:bCs/>
-          <w:smallCaps/>
-          <w:color w:val="1F497D"/>
-          <w:sz w:val="40"/>
-          <w:szCs w:val="40"/>
-        </w:rPr>
-        <w:t xml:space="preserve"> (GENESIS POVEDA)</w:t>
-      </w:r>
-    </w:p>
-    <w:p>
-      <w:pPr>
-        <w:ind w:firstLine="0"/>
-        <w:jc w:val="center"/>
-      </w:pPr>
-      <w:r>
-        <w:rPr>
-          <w:b/>
-          <w:bCs/>
-          <w:smallCaps/>
-          <w:color w:val="1F497D"/>
-          <w:sz w:val="40"/>
-          <w:szCs w:val="40"/>
-        </w:rPr>
-        <w:t>AVANCE</w:t>
-      </w:r>
-    </w:p>
-    <w:p>
-      <w:pPr>
-        <w:rPr>
-          <w:b/>
-          <w:bCs/>
-        </w:rPr>
-      </w:pPr>
-    </w:p>
-    <w:p>
-      <w:pPr>
-        <w:rPr>
-          <w:b/>
-          <w:bCs/>
-        </w:rPr>
-      </w:pPr>
-    </w:p>
-    <w:p>
-      <w:pPr>
-        <w:rPr>
-          <w:b/>
-          <w:bCs/>
-        </w:rPr>
-      </w:pPr>
-      <w:r>
-        <w:rPr>
-          <w:b/>
-          <w:bCs/>
-        </w:rPr>
-        <w:t>9. Validación y gestión de requerimientos: evidencia de validación con los interesados y descripción del mecanismo utilizado para gestionar cambios de requerimientos.</w:t>
-      </w:r>
-      <w:r>
-        <w:rPr>
-          <w:b/>
-          <w:bCs/>
-        </w:rPr>
-        <w:t xml:space="preserve"> (Andrés Figueroa)</w:t>
-      </w:r>
-    </w:p>
-    <w:p>
-      <w:pPr>
-        <w:rPr>
-          <w:b/>
-          <w:bCs/>
-        </w:rPr>
-      </w:pPr>
-      <w:r>
-        <w:rPr>
-          <w:b/>
-          <w:bCs/>
-        </w:rPr>
-        <w:t>9.1. Evidencia de Validación con los Interesados</w:t>
-      </w:r>
-    </w:p>
-    <w:p>
-      <w:r>
-        <w:t xml:space="preserve">La validación de requerimientos se realizó mediante un taller de Aceptación del Prototipo de Interfaz (Walkthrough) el 16 de julio de 2026. En esta sesión, el equipo de desarrollo presentó maquetas interactivas (mockups) de los formularios de JavaScript </w:t>
-      </w:r>
-      <w:r>
-        <w:lastRenderedPageBreak/>
-        <w:t>y la estructura de almacenamiento en Google Sheets para que la administración de la clínica validara si las reglas de negocio estaban correctamente representadas.</w:t>
-      </w:r>
-    </w:p>
-    <w:p>
-      <w:pPr>
-        <w:rPr>
-          <w:b/>
-          <w:bCs/>
-        </w:rPr>
-      </w:pPr>
-      <w:r>
-        <w:rPr>
-          <w:b/>
-          <w:bCs/>
-        </w:rPr>
-        <w:t>Acta de Validación y Conformidad Técnica</w:t>
-      </w:r>
-    </w:p>
-    <w:p>
-      <w:r>
-        <w:rPr>
-          <w:b/>
-          <w:bCs/>
-        </w:rPr>
-        <w:t xml:space="preserve">Fecha: </w:t>
-      </w:r>
-      <w:r>
-        <w:t>16 de Julio de 2026</w:t>
-      </w:r>
-    </w:p>
-    <w:p>
-      <w:r>
-        <w:rPr>
-          <w:b/>
-          <w:bCs/>
-        </w:rPr>
-        <w:t>Proyecto:</w:t>
-      </w:r>
-      <w:r>
-        <w:t xml:space="preserve"> Sistema de Agendamiento MONDELVET</w:t>
-      </w:r>
-    </w:p>
-    <w:p>
-      <w:r>
-        <w:rPr>
-          <w:b/>
-          <w:bCs/>
-        </w:rPr>
-        <w:t xml:space="preserve">Interesados: </w:t>
-      </w:r>
-      <w:r>
-        <w:t>Administración General (MONDELVET) / Equipo de Desarrollo Squad</w:t>
-      </w:r>
-    </w:p>
-    <w:p>
-      <w:pPr>
-        <w:rPr>
-          <w:b/>
-          <w:bCs/>
-        </w:rPr>
-      </w:pPr>
-      <w:r>
-        <w:rPr>
-          <w:b/>
-          <w:bCs/>
-        </w:rPr>
-        <w:t>Criterios Evaluados:</w:t>
-      </w:r>
-    </w:p>
-    <w:p>
-      <w:r>
-        <w:rPr>
-          <w:b/>
-          <w:bCs/>
-        </w:rPr>
-        <w:t xml:space="preserve">1. Flujo de Registro: </w:t>
-      </w:r>
-      <w:r>
-        <w:t>El formulario captura eficientemente los datos del cliente, la mascota y calcula correctamente la proforma del servicio. (Aprobado)</w:t>
-      </w:r>
-    </w:p>
-    <w:p>
-      <w:r>
-        <w:rPr>
-          <w:b/>
-          <w:bCs/>
-        </w:rPr>
-        <w:t>2. Validación de Bloques Horarios:</w:t>
-      </w:r>
-      <w:r>
-        <w:t xml:space="preserve"> Se verificó que el script en JavaScript bloquea correctamente un horario ya ocupado en la hoja de cálculo. (Aprobado)</w:t>
-      </w:r>
-    </w:p>
-    <w:p>
-      <w:r>
-        <w:rPr>
-          <w:b/>
-          <w:bCs/>
-        </w:rPr>
-        <w:t xml:space="preserve">Firmas de Conformidad: </w:t>
-      </w:r>
-      <w:r>
-        <w:t>Entregado y validado satisfactoriamente por las partes interesadas.</w:t>
-      </w:r>
-    </w:p>
-    <w:p>
-      <w:pPr>
-        <w:rPr>
-          <w:b/>
-          <w:bCs/>
-        </w:rPr>
-      </w:pPr>
-      <w:r>
-        <w:rPr>
-          <w:b/>
-          <w:bCs/>
-        </w:rPr>
-        <w:t>9.2. Mecanismo de Gestión de Cambios de Requerimientos</w:t>
-      </w:r>
-    </w:p>
-    <w:p>
-      <w:pPr>
-        <w:rPr>
-          <w:b/>
-          <w:bCs/>
-        </w:rPr>
-      </w:pPr>
-      <w:r>
-        <w:rPr>
-          <w:b/>
-          <w:bCs/>
-        </w:rPr>
-        <w:t>Dada la naturaleza del proyecto (desarrollo rápido para un negocio en crecimiento), se estableció un Mecanismo de Control de Cambios Ágil para evitar la corrupción del alcance (Scope Creep). Cualquier solicitud de modificación sigue un flujo estricto:</w:t>
-      </w:r>
-    </w:p>
-    <w:p>
-      <w:r>
-        <w:rPr>
-          <w:b/>
-          <w:bCs/>
-        </w:rPr>
-        <w:t>1. Solicitud de Cambio (RFC):</w:t>
-      </w:r>
-      <w:r>
-        <w:t xml:space="preserve"> El interesado registra la petición mediante un formulario formal detallando la nueva necesidad (</w:t>
-      </w:r>
-      <w:r>
-        <w:t>ej.</w:t>
-      </w:r>
-      <w:r>
-        <w:t>: “Agregar campo para peso de la mascota”).</w:t>
-      </w:r>
-    </w:p>
-    <w:p>
-      <w:pPr>
-        <w:rPr>
-          <w:b/>
-          <w:bCs/>
-        </w:rPr>
-      </w:pPr>
-      <w:r>
-        <w:rPr>
-          <w:b/>
-          <w:bCs/>
-        </w:rPr>
-        <w:t>2. Análisis de Impacto Técnico: El equipo de computación evalúa el impacto en tres ejes:</w:t>
-      </w:r>
-    </w:p>
-    <w:p>
-      <w:r>
-        <w:rPr>
-          <w:b/>
-          <w:bCs/>
-        </w:rPr>
-        <w:lastRenderedPageBreak/>
-        <w:t xml:space="preserve">Base de datos: </w:t>
-      </w:r>
-      <w:r>
-        <w:t>¿Requiere añadir columnas en Google Sheets?</w:t>
-      </w:r>
-    </w:p>
-    <w:p>
-      <w:r>
-        <w:rPr>
-          <w:b/>
-          <w:bCs/>
-        </w:rPr>
-        <w:t xml:space="preserve">Lógica: </w:t>
-      </w:r>
-      <w:r>
-        <w:t>¿Afecta las funciones de validación en JavaScript?</w:t>
-      </w:r>
-    </w:p>
-    <w:p>
-      <w:r>
-        <w:rPr>
-          <w:b/>
-          <w:bCs/>
-        </w:rPr>
-        <w:t xml:space="preserve">Esfuerzo: </w:t>
-      </w:r>
-      <w:r>
-        <w:t>Horas de desarrollo necesarias.</w:t>
-      </w:r>
-    </w:p>
-    <w:p>
-      <w:r>
-        <w:rPr>
-          <w:b/>
-          <w:bCs/>
-        </w:rPr>
-        <w:t>3. Aprobación o Rechazo:</w:t>
-      </w:r>
-      <w:r>
-        <w:t xml:space="preserve"> Si el cambio supera el alcance del Producto Mínimo Viable (MVP), se archiva en el Product Backlog como un requerimiento para la fase de Escalabilidad Futura, protegiendo la fecha de entrega actual.</w:t>
-      </w:r>
-    </w:p>
-    <w:p>
-      <w:pPr>
-        <w:rPr>
-          <w:b/>
-          <w:bCs/>
-        </w:rPr>
-      </w:pPr>
-      <w:r>
-        <w:rPr>
-          <w:b/>
-          <w:bCs/>
-        </w:rPr>
-        <w:t xml:space="preserve">10. Plan de gestión del proyecto: Estructura de Desglose del Trabajo (EDT/WBS), cronograma o diagrama de Gantt, y matriz de gestión de riesgos con al menos 5 riesgos identificados (probabilidad, impacto y plan de respuesta). </w:t>
-      </w:r>
-    </w:p>
-    <w:p>
-      <w:pPr>
-        <w:rPr>
-          <w:b/>
-          <w:bCs/>
-        </w:rPr>
-      </w:pPr>
-      <w:r>
-        <w:rPr>
-          <w:b/>
-          <w:bCs/>
-        </w:rPr>
-        <w:t xml:space="preserve">Conexión </w:t>
-      </w:r>
-      <w:proofErr w:type="spellStart"/>
-      <w:r>
-        <w:rPr>
-          <w:b/>
-          <w:bCs/>
-        </w:rPr>
-        <w:t>y</w:t>
-      </w:r>
-      <w:proofErr w:type="spellEnd"/>
-      <w:r>
-        <w:rPr>
-          <w:b/>
-          <w:bCs/>
-        </w:rPr>
-        <w:t xml:space="preserve"> velocidad de internet:</w:t>
-      </w:r>
-    </w:p>
-    <w:p>
-      <w:pPr>
-        <w:rPr>
-          <w:b/>
-          <w:bCs/>
-        </w:rPr>
-      </w:pPr>
-    </w:p>
-    <w:p>
-      <w:pPr>
-        <w:rPr>
-          <w:b/>
-          <w:bCs/>
-        </w:rPr>
-      </w:pPr>
-      <w:r>
-        <w:rPr>
-          <w:b/>
-          <w:bCs/>
-        </w:rPr>
         <w:drawing>
-          <wp:inline distT="0" distB="0" distL="0" distR="0" wp14:anchorId="4A807139" wp14:editId="1BDD6B2D">
-            <wp:extent cx="5793105" cy="2496185"/>
-            <wp:effectExtent l="0" t="0" r="0" b="0"/>
-            <wp:docPr id="74338241" name="Imagen 1"/>
+          <wp:inline distT="0" distB="0" distL="0" distR="0" wp14:anchorId="51F2958A" wp14:editId="3605F398">
+            <wp:extent cx="5793105" cy="2247265"/>
+            <wp:effectExtent l="0" t="0" r="0" b="635"/>
+            <wp:docPr id="855360048" name="Imagen 1"/>
             <wp:cNvGraphicFramePr>
               <a:graphicFrameLocks xmlns:a="http://schemas.openxmlformats.org/drawingml/2006/main" noChangeAspect="1"/>
             </wp:cNvGraphicFramePr>
@@ -3444,11 +3246,11 @@
               <a:graphicData uri="http://schemas.openxmlformats.org/drawingml/2006/picture">
                 <pic:pic xmlns:pic="http://schemas.openxmlformats.org/drawingml/2006/picture">
                   <pic:nvPicPr>
-                    <pic:cNvPr id="74338241" name=""/>
+                    <pic:cNvPr id="855360048" name=""/>
                     <pic:cNvPicPr/>
                   </pic:nvPicPr>
                   <pic:blipFill>
-                    <a:blip r:embed="rId11"/>
+                    <a:blip r:embed="rId12"/>
                     <a:stretch>
                       <a:fillRect/>
                     </a:stretch>
@@ -3456,7 +3258,7 @@
                   <pic:spPr>
                     <a:xfrm>
                       <a:off x="0" y="0"/>
-                      <a:ext cx="5793105" cy="2496185"/>
+                      <a:ext cx="5793105" cy="2247265"/>
                     </a:xfrm>
                     <a:prstGeom prst="rect">
                       <a:avLst/>
@@ -3468,44 +3270,38 @@
           </wp:inline>
         </w:drawing>
       </w:r>
-    </w:p>
-    <w:p>
-      <w:pPr>
-        <w:ind w:firstLine="0"/>
-        <w:rPr>
-          <w:b/>
-          <w:bCs/>
-        </w:rPr>
-      </w:pPr>
       <w:r>
         <w:rPr>
           <w:noProof/>
         </w:rPr>
-        <w:lastRenderedPageBreak/>
+        <w:t xml:space="preserve"> </w:t>
+      </w:r>
+      <w:r>
+        <w:rPr>
+          <w:b/>
+          <w:bCs/>
+          <w:smallCaps/>
+          <w:color w:val="1F497D"/>
+          <w:sz w:val="40"/>
+          <w:szCs w:val="40"/>
+        </w:rPr>
         <w:drawing>
-          <wp:anchor distT="114300" distB="114300" distL="114300" distR="114300" simplePos="0" relativeHeight="251659264" behindDoc="0" locked="0" layoutInCell="1" hidden="0" allowOverlap="1" wp14:anchorId="04720003" wp14:editId="24772B4A">
-            <wp:simplePos x="0" y="0"/>
-            <wp:positionH relativeFrom="column">
-              <wp:posOffset>-638174</wp:posOffset>
-            </wp:positionH>
-            <wp:positionV relativeFrom="paragraph">
-              <wp:posOffset>114300</wp:posOffset>
-            </wp:positionV>
-            <wp:extent cx="6923301" cy="3428683"/>
-            <wp:effectExtent l="0" t="0" r="0" b="0"/>
-            <wp:wrapSquare wrapText="bothSides" distT="114300" distB="114300" distL="114300" distR="114300"/>
-            <wp:docPr id="3" name="image3.png"/>
-            <wp:cNvGraphicFramePr/>
+          <wp:inline distT="0" distB="0" distL="0" distR="0" wp14:anchorId="2556F62D" wp14:editId="73834286">
+            <wp:extent cx="5793105" cy="2189480"/>
+            <wp:effectExtent l="0" t="0" r="0" b="1270"/>
+            <wp:docPr id="756302085" name="Imagen 1"/>
+            <wp:cNvGraphicFramePr>
+              <a:graphicFrameLocks xmlns:a="http://schemas.openxmlformats.org/drawingml/2006/main" noChangeAspect="1"/>
+            </wp:cNvGraphicFramePr>
             <a:graphic xmlns:a="http://schemas.openxmlformats.org/drawingml/2006/main">
               <a:graphicData uri="http://schemas.openxmlformats.org/drawingml/2006/picture">
                 <pic:pic xmlns:pic="http://schemas.openxmlformats.org/drawingml/2006/picture">
                   <pic:nvPicPr>
-                    <pic:cNvPr id="0" name="image3.png"/>
-                    <pic:cNvPicPr preferRelativeResize="0"/>
+                    <pic:cNvPr id="756302085" name=""/>
+                    <pic:cNvPicPr/>
                   </pic:nvPicPr>
                   <pic:blipFill>
-                    <a:blip r:embed="rId12"/>
-                    <a:srcRect/>
+                    <a:blip r:embed="rId13"/>
                     <a:stretch>
                       <a:fillRect/>
                     </a:stretch>
@@ -3513,55 +3309,322 @@
                   <pic:spPr>
                     <a:xfrm>
                       <a:off x="0" y="0"/>
-                      <a:ext cx="6923301" cy="3428683"/>
+                      <a:ext cx="5793105" cy="2189480"/>
                     </a:xfrm>
                     <a:prstGeom prst="rect">
                       <a:avLst/>
                     </a:prstGeom>
-                    <a:ln/>
                   </pic:spPr>
                 </pic:pic>
               </a:graphicData>
             </a:graphic>
-          </wp:anchor>
+          </wp:inline>
         </w:drawing>
       </w:r>
-    </w:p>
-    <w:p>
-      <w:pPr>
-        <w:spacing w:after="240"/>
-        <w:ind w:firstLine="0"/>
-        <w:rPr>
-          <w:b/>
-          <w:bCs/>
-        </w:rPr>
-      </w:pPr>
-    </w:p>
-    <w:p>
-      <w:pPr>
-        <w:spacing w:after="240"/>
-        <w:ind w:firstLine="0"/>
-        <w:rPr>
-          <w:b/>
-          <w:bCs/>
-        </w:rPr>
-      </w:pPr>
-    </w:p>
-    <w:p>
-      <w:pPr>
-        <w:spacing w:after="240"/>
-        <w:ind w:firstLine="0"/>
-        <w:rPr>
-          <w:b/>
-          <w:bCs/>
-        </w:rPr>
-      </w:pPr>
-      <w:r>
-        <w:rPr>
-          <w:b/>
-          <w:bCs/>
-        </w:rPr>
-        <w:t>Estructura de Desglose del Trabajo (EDT/WBS)</w:t>
+      <w:r>
+        <w:rPr>
+          <w:noProof/>
+        </w:rPr>
+        <w:t xml:space="preserve"> </w:t>
+      </w:r>
+      <w:r>
+        <w:rPr>
+          <w:noProof/>
+        </w:rPr>
+        <w:lastRenderedPageBreak/>
+        <w:drawing>
+          <wp:inline distT="0" distB="0" distL="0" distR="0" wp14:anchorId="2E270D4A" wp14:editId="3DED3D6D">
+            <wp:extent cx="5793105" cy="1126490"/>
+            <wp:effectExtent l="0" t="0" r="0" b="0"/>
+            <wp:docPr id="456017362" name="Imagen 1"/>
+            <wp:cNvGraphicFramePr>
+              <a:graphicFrameLocks xmlns:a="http://schemas.openxmlformats.org/drawingml/2006/main" noChangeAspect="1"/>
+            </wp:cNvGraphicFramePr>
+            <a:graphic xmlns:a="http://schemas.openxmlformats.org/drawingml/2006/main">
+              <a:graphicData uri="http://schemas.openxmlformats.org/drawingml/2006/picture">
+                <pic:pic xmlns:pic="http://schemas.openxmlformats.org/drawingml/2006/picture">
+                  <pic:nvPicPr>
+                    <pic:cNvPr id="456017362" name=""/>
+                    <pic:cNvPicPr/>
+                  </pic:nvPicPr>
+                  <pic:blipFill>
+                    <a:blip r:embed="rId14"/>
+                    <a:stretch>
+                      <a:fillRect/>
+                    </a:stretch>
+                  </pic:blipFill>
+                  <pic:spPr>
+                    <a:xfrm>
+                      <a:off x="0" y="0"/>
+                      <a:ext cx="5793105" cy="1126490"/>
+                    </a:xfrm>
+                    <a:prstGeom prst="rect">
+                      <a:avLst/>
+                    </a:prstGeom>
+                  </pic:spPr>
+                </pic:pic>
+              </a:graphicData>
+            </a:graphic>
+          </wp:inline>
+        </w:drawing>
+      </w:r>
+      <w:r>
+        <w:rPr>
+          <w:b/>
+          <w:bCs/>
+          <w:smallCaps/>
+          <w:color w:val="1F497D"/>
+          <w:sz w:val="40"/>
+          <w:szCs w:val="40"/>
+        </w:rPr>
+        <w:br/>
+      </w:r>
+    </w:p>
+    <w:p>
+      <w:pPr>
+        <w:pStyle w:val="Ttulo1"/>
+      </w:pPr>
+      <w:r>
+        <w:t>MANUAL DE USUARIO</w:t>
+      </w:r>
+    </w:p>
+    <w:p>
+      <w:pPr>
+        <w:pStyle w:val="Ttulo1"/>
+      </w:pPr>
+      <w:r>
+        <w:t>EVIDENCIA DE VALIDACIÓN CON LOS INTERESADOS</w:t>
+      </w:r>
+    </w:p>
+    <w:p>
+      <w:r>
+        <w:t>La validación de requerimientos se realizó mediante un taller de Aceptación del Prototipo de Interfaz (Walkthrough) el 16 de julio de 2026. En esta sesión, el equipo de desarrollo presentó maquetas interactivas (mockups) de los formularios de JavaScript y la estructura de almacenamiento en Google Sheets para que la administración de la clínica validara si las reglas de negocio estaban correctamente representadas.</w:t>
+      </w:r>
+    </w:p>
+    <w:p>
+      <w:pPr>
+        <w:rPr>
+          <w:b/>
+          <w:bCs/>
+        </w:rPr>
+      </w:pPr>
+      <w:r>
+        <w:rPr>
+          <w:b/>
+          <w:bCs/>
+        </w:rPr>
+        <w:t>Acta de Validación y Conformidad Técnica</w:t>
+      </w:r>
+    </w:p>
+    <w:p>
+      <w:r>
+        <w:rPr>
+          <w:b/>
+          <w:bCs/>
+        </w:rPr>
+        <w:t xml:space="preserve">Fecha: </w:t>
+      </w:r>
+      <w:r>
+        <w:t>16 de Julio de 2026</w:t>
+      </w:r>
+    </w:p>
+    <w:p>
+      <w:r>
+        <w:rPr>
+          <w:b/>
+          <w:bCs/>
+        </w:rPr>
+        <w:t>Proyecto:</w:t>
+      </w:r>
+      <w:r>
+        <w:t xml:space="preserve"> Sistema de Agendamiento MONDELVET</w:t>
+      </w:r>
+    </w:p>
+    <w:p>
+      <w:r>
+        <w:rPr>
+          <w:b/>
+          <w:bCs/>
+        </w:rPr>
+        <w:t xml:space="preserve">Interesados: </w:t>
+      </w:r>
+      <w:r>
+        <w:t>Administración General (MONDELVET) / Equipo de Desarrollo Squad</w:t>
+      </w:r>
+    </w:p>
+    <w:p>
+      <w:pPr>
+        <w:rPr>
+          <w:b/>
+          <w:bCs/>
+        </w:rPr>
+      </w:pPr>
+      <w:r>
+        <w:rPr>
+          <w:b/>
+          <w:bCs/>
+        </w:rPr>
+        <w:t>Criterios Evaluados:</w:t>
+      </w:r>
+    </w:p>
+    <w:p>
+      <w:r>
+        <w:rPr>
+          <w:b/>
+          <w:bCs/>
+        </w:rPr>
+        <w:t xml:space="preserve">1. Flujo de Registro: </w:t>
+      </w:r>
+      <w:r>
+        <w:t>El formulario captura eficientemente los datos del cliente, la mascota y calcula correctamente la proforma del servicio. (Aprobado)</w:t>
+      </w:r>
+    </w:p>
+    <w:p>
+      <w:r>
+        <w:rPr>
+          <w:b/>
+          <w:bCs/>
+        </w:rPr>
+        <w:t>2. Validación de Bloques Horarios:</w:t>
+      </w:r>
+      <w:r>
+        <w:t xml:space="preserve"> Se verificó que el script en JavaScript bloquea correctamente un horario ya ocupado en la hoja de cálculo. (Aprobado)</w:t>
+      </w:r>
+    </w:p>
+    <w:p>
+      <w:r>
+        <w:rPr>
+          <w:b/>
+          <w:bCs/>
+        </w:rPr>
+        <w:lastRenderedPageBreak/>
+        <w:t xml:space="preserve">Firmas de Conformidad: </w:t>
+      </w:r>
+      <w:r>
+        <w:t>Entregado y validado satisfactoriamente por las partes interesadas.</w:t>
+      </w:r>
+    </w:p>
+    <w:p>
+      <w:pPr>
+        <w:pStyle w:val="Ttulo2"/>
+      </w:pPr>
+      <w:r>
+        <w:t>Mecanismo de Gestión de Cambios de Requerimientos</w:t>
+      </w:r>
+    </w:p>
+    <w:p>
+      <w:r>
+        <w:t>Dada la naturaleza del proyecto (desarrollo rápido para un negocio en crecimiento), se estableció un Mecanismo de Control de Cambios Ágil para evitar la corrupción del alcance (Scope Creep). Cualquier solicitud de modificación sigue un flujo estricto:</w:t>
+      </w:r>
+    </w:p>
+    <w:p>
+      <w:r>
+        <w:rPr>
+          <w:b/>
+          <w:bCs/>
+        </w:rPr>
+        <w:t>Solicitud de Cambio (RFC):</w:t>
+      </w:r>
+      <w:r>
+        <w:t xml:space="preserve"> El interesado registra la petición mediante un formulario formal detallando la nueva necesidad (</w:t>
+      </w:r>
+      <w:r>
+        <w:t>ej.</w:t>
+      </w:r>
+      <w:r>
+        <w:t>: “Agregar campo para peso de la mascota”).</w:t>
+      </w:r>
+    </w:p>
+    <w:p>
+      <w:pPr>
+        <w:rPr>
+          <w:b/>
+          <w:bCs/>
+        </w:rPr>
+      </w:pPr>
+      <w:r>
+        <w:rPr>
+          <w:b/>
+          <w:bCs/>
+        </w:rPr>
+        <w:t>Análisis de Impacto Técnico: El equipo de computación evalúa el impacto en tres ejes:</w:t>
+      </w:r>
+    </w:p>
+    <w:p>
+      <w:pPr>
+        <w:pStyle w:val="Prrafodelista"/>
+        <w:numPr>
+          <w:ilvl w:val="0"/>
+          <w:numId w:val="10"/>
+        </w:numPr>
+      </w:pPr>
+      <w:r>
+        <w:rPr>
+          <w:b/>
+          <w:bCs/>
+        </w:rPr>
+        <w:t xml:space="preserve">Base de datos: </w:t>
+      </w:r>
+      <w:r>
+        <w:t>¿Requiere añadir columnas en Google Sheets?</w:t>
+      </w:r>
+    </w:p>
+    <w:p>
+      <w:pPr>
+        <w:pStyle w:val="Prrafodelista"/>
+        <w:numPr>
+          <w:ilvl w:val="0"/>
+          <w:numId w:val="10"/>
+        </w:numPr>
+      </w:pPr>
+      <w:r>
+        <w:rPr>
+          <w:b/>
+          <w:bCs/>
+        </w:rPr>
+        <w:t xml:space="preserve">Lógica: </w:t>
+      </w:r>
+      <w:r>
+        <w:t>¿Afecta las funciones de validación en JavaScript?</w:t>
+      </w:r>
+    </w:p>
+    <w:p>
+      <w:pPr>
+        <w:pStyle w:val="Prrafodelista"/>
+        <w:numPr>
+          <w:ilvl w:val="0"/>
+          <w:numId w:val="10"/>
+        </w:numPr>
+      </w:pPr>
+      <w:r>
+        <w:rPr>
+          <w:b/>
+          <w:bCs/>
+        </w:rPr>
+        <w:t xml:space="preserve">Esfuerzo: </w:t>
+      </w:r>
+      <w:r>
+        <w:t>Horas de desarrollo necesarias.</w:t>
+      </w:r>
+    </w:p>
+    <w:p>
+      <w:r>
+        <w:rPr>
+          <w:b/>
+          <w:bCs/>
+        </w:rPr>
+        <w:t>Aprobación o Rechazo:</w:t>
+      </w:r>
+      <w:r>
+        <w:t xml:space="preserve"> Si el cambio supera el alcance del Producto Mínimo Viable (MVP), se archiva en el Product Backlog como un requerimiento para la fase de Escalabilidad Futura, protegiendo la fecha de entrega actual.</w:t>
+      </w:r>
+    </w:p>
+    <w:p>
+      <w:pPr>
+        <w:pStyle w:val="Ttulo1"/>
+      </w:pPr>
+      <w:r>
+        <w:t>ESTRUCTURA DE DESGLOSE DEL TRABAJO (EDT/WBS)</w:t>
       </w:r>
     </w:p>
     <w:p>
@@ -3618,6 +3681,7 @@
           <w:b/>
           <w:bCs/>
         </w:rPr>
+        <w:lastRenderedPageBreak/>
         <w:t>2. Fase 2: Base de Datos</w:t>
       </w:r>
     </w:p>
@@ -3684,7 +3748,6 @@
         <w:jc w:val="left"/>
       </w:pPr>
       <w:r>
-        <w:lastRenderedPageBreak/>
         <w:t>3.2. Maquetación de la interfaz</w:t>
       </w:r>
     </w:p>
@@ -3731,27 +3794,10 @@
     </w:p>
     <w:p>
       <w:pPr>
-        <w:spacing w:after="240"/>
-        <w:ind w:left="720"/>
-        <w:jc w:val="left"/>
-      </w:pPr>
-    </w:p>
-    <w:p>
-      <w:pPr>
-        <w:spacing w:after="240"/>
-        <w:ind w:firstLine="0"/>
-        <w:jc w:val="left"/>
-        <w:rPr>
-          <w:b/>
-          <w:bCs/>
-        </w:rPr>
-      </w:pPr>
-      <w:r>
-        <w:rPr>
-          <w:b/>
-          <w:bCs/>
-        </w:rPr>
-        <w:t xml:space="preserve">Matriz de Gestión de Riesgos </w:t>
+        <w:pStyle w:val="Ttulo1"/>
+      </w:pPr>
+      <w:r>
+        <w:t xml:space="preserve">MATRIZ DE GESTIÓN DE RIESGOS </w:t>
       </w:r>
     </w:p>
     <w:tbl>
@@ -3959,8 +4005,12 @@
           </w:tcPr>
           <w:p>
             <w:pPr>
+              <w:pStyle w:val="Prrafodelista"/>
+              <w:numPr>
+                <w:ilvl w:val="0"/>
+                <w:numId w:val="11"/>
+              </w:numPr>
               <w:spacing w:before="0" w:after="480" w:line="276" w:lineRule="auto"/>
-              <w:ind w:firstLine="0"/>
               <w:jc w:val="left"/>
               <w:rPr>
                 <w:sz w:val="22"/>
@@ -3972,7 +4022,7 @@
                 <w:sz w:val="22"/>
                 <w:szCs w:val="22"/>
               </w:rPr>
-              <w:t>1. Lentitud de la API de Google Sheets</w:t>
+              <w:t>Inconsistencia o error en el ingreso de datos por el usuario</w:t>
             </w:r>
           </w:p>
         </w:tc>
@@ -4007,7 +4057,7 @@
                 <w:sz w:val="22"/>
                 <w:szCs w:val="22"/>
               </w:rPr>
-              <w:t>Media</w:t>
+              <w:t>Alta</w:t>
             </w:r>
           </w:p>
         </w:tc>
@@ -4042,7 +4092,174 @@
                 <w:sz w:val="22"/>
                 <w:szCs w:val="22"/>
               </w:rPr>
-              <w:t>Alto</w:t>
+              <w:t xml:space="preserve"> Medio</w:t>
+            </w:r>
+          </w:p>
+        </w:tc>
+        <w:tc>
+          <w:tcPr>
+            <w:tcW w:w="2865" w:type="dxa"/>
+            <w:tcBorders>
+              <w:top w:val="single" w:sz="8" w:space="0" w:color="C4C7C5"/>
+              <w:left w:val="single" w:sz="8" w:space="0" w:color="C4C7C5"/>
+              <w:bottom w:val="single" w:sz="8" w:space="0" w:color="C4C7C5"/>
+              <w:right w:val="single" w:sz="8" w:space="0" w:color="C4C7C5"/>
+            </w:tcBorders>
+            <w:tcMar>
+              <w:top w:w="120" w:type="dxa"/>
+              <w:left w:w="180" w:type="dxa"/>
+              <w:bottom w:w="120" w:type="dxa"/>
+              <w:right w:w="180" w:type="dxa"/>
+            </w:tcMar>
+          </w:tcPr>
+          <w:p>
+            <w:pPr>
+              <w:spacing w:before="0" w:after="480" w:line="276" w:lineRule="auto"/>
+              <w:ind w:firstLine="0"/>
+              <w:jc w:val="left"/>
+              <w:rPr>
+                <w:sz w:val="22"/>
+                <w:szCs w:val="22"/>
+              </w:rPr>
+            </w:pPr>
+          </w:p>
+          <w:p>
+            <w:pPr>
+              <w:spacing w:before="0" w:after="480" w:line="276" w:lineRule="auto"/>
+              <w:ind w:firstLine="0"/>
+              <w:jc w:val="left"/>
+              <w:rPr>
+                <w:sz w:val="22"/>
+                <w:szCs w:val="22"/>
+              </w:rPr>
+            </w:pPr>
+            <w:r>
+              <w:rPr>
+                <w:sz w:val="22"/>
+                <w:szCs w:val="22"/>
+              </w:rPr>
+              <w:t>Împlementar reglas de validación de datos, por ejemplo en campos numéricos para cedula o teléfono.</w:t>
+            </w:r>
+          </w:p>
+        </w:tc>
+      </w:tr>
+      <w:tr>
+        <w:trPr>
+          <w:trHeight w:val="1650"/>
+        </w:trPr>
+        <w:tc>
+          <w:tcPr>
+            <w:tcW w:w="2730" w:type="dxa"/>
+            <w:tcBorders>
+              <w:top w:val="single" w:sz="8" w:space="0" w:color="C4C7C5"/>
+              <w:left w:val="single" w:sz="8" w:space="0" w:color="C4C7C5"/>
+              <w:bottom w:val="single" w:sz="8" w:space="0" w:color="C4C7C5"/>
+              <w:right w:val="single" w:sz="8" w:space="0" w:color="C4C7C5"/>
+            </w:tcBorders>
+            <w:tcMar>
+              <w:top w:w="120" w:type="dxa"/>
+              <w:left w:w="180" w:type="dxa"/>
+              <w:bottom w:w="120" w:type="dxa"/>
+              <w:right w:w="180" w:type="dxa"/>
+            </w:tcMar>
+          </w:tcPr>
+          <w:p>
+            <w:pPr>
+              <w:pStyle w:val="Prrafodelista"/>
+              <w:numPr>
+                <w:ilvl w:val="0"/>
+                <w:numId w:val="11"/>
+              </w:numPr>
+              <w:spacing w:before="0" w:after="480" w:line="276" w:lineRule="auto"/>
+              <w:jc w:val="left"/>
+              <w:rPr>
+                <w:sz w:val="22"/>
+                <w:szCs w:val="22"/>
+              </w:rPr>
+            </w:pPr>
+            <w:r>
+              <w:rPr>
+                <w:sz w:val="22"/>
+                <w:szCs w:val="22"/>
+              </w:rPr>
+              <w:t>Falta de adopción de herramienta</w:t>
+            </w:r>
+          </w:p>
+        </w:tc>
+        <w:tc>
+          <w:tcPr>
+            <w:tcW w:w="1845" w:type="dxa"/>
+            <w:tcBorders>
+              <w:top w:val="single" w:sz="8" w:space="0" w:color="C4C7C5"/>
+              <w:left w:val="single" w:sz="8" w:space="0" w:color="C4C7C5"/>
+              <w:bottom w:val="single" w:sz="8" w:space="0" w:color="C4C7C5"/>
+              <w:right w:val="single" w:sz="8" w:space="0" w:color="C4C7C5"/>
+            </w:tcBorders>
+            <w:tcMar>
+              <w:top w:w="120" w:type="dxa"/>
+              <w:left w:w="180" w:type="dxa"/>
+              <w:bottom w:w="120" w:type="dxa"/>
+              <w:right w:w="180" w:type="dxa"/>
+            </w:tcMar>
+          </w:tcPr>
+          <w:p>
+            <w:pPr>
+              <w:spacing w:before="0" w:after="480" w:line="276" w:lineRule="auto"/>
+              <w:ind w:firstLine="0"/>
+              <w:jc w:val="left"/>
+              <w:rPr>
+                <w:sz w:val="22"/>
+                <w:szCs w:val="22"/>
+              </w:rPr>
+            </w:pPr>
+            <w:r>
+              <w:rPr>
+                <w:sz w:val="22"/>
+                <w:szCs w:val="22"/>
+              </w:rPr>
+              <w:t>Medi</w:t>
+            </w:r>
+            <w:r>
+              <w:rPr>
+                <w:sz w:val="22"/>
+                <w:szCs w:val="22"/>
+              </w:rPr>
+              <w:t>a</w:t>
+            </w:r>
+          </w:p>
+        </w:tc>
+        <w:tc>
+          <w:tcPr>
+            <w:tcW w:w="1320" w:type="dxa"/>
+            <w:tcBorders>
+              <w:top w:val="single" w:sz="8" w:space="0" w:color="C4C7C5"/>
+              <w:left w:val="single" w:sz="8" w:space="0" w:color="C4C7C5"/>
+              <w:bottom w:val="single" w:sz="8" w:space="0" w:color="C4C7C5"/>
+              <w:right w:val="single" w:sz="8" w:space="0" w:color="C4C7C5"/>
+            </w:tcBorders>
+            <w:tcMar>
+              <w:top w:w="120" w:type="dxa"/>
+              <w:left w:w="180" w:type="dxa"/>
+              <w:bottom w:w="120" w:type="dxa"/>
+              <w:right w:w="180" w:type="dxa"/>
+            </w:tcMar>
+          </w:tcPr>
+          <w:p>
+            <w:pPr>
+              <w:spacing w:before="0" w:after="480" w:line="276" w:lineRule="auto"/>
+              <w:ind w:firstLine="0"/>
+              <w:jc w:val="left"/>
+              <w:rPr>
+                <w:sz w:val="22"/>
+                <w:szCs w:val="22"/>
+              </w:rPr>
+            </w:pPr>
+            <w:r>
+              <w:rPr>
+                <w:sz w:val="22"/>
+                <w:szCs w:val="22"/>
+              </w:rPr>
+              <w:t>Medio</w:t>
             </w:r>
           </w:p>
         </w:tc>
@@ -4077,14 +4294,14 @@
                 <w:sz w:val="22"/>
                 <w:szCs w:val="22"/>
               </w:rPr>
-              <w:t>Implementar validaciones en la interfaz si la respuesta supera los 3 segundos.</w:t>
+              <w:t>Capacitacion directa apoyada en el manual de usuario</w:t>
             </w:r>
           </w:p>
         </w:tc>
       </w:tr>
       <w:tr>
         <w:trPr>
-          <w:trHeight w:val="1650"/>
+          <w:trHeight w:val="1380"/>
         </w:trPr>
         <w:tc>
           <w:tcPr>
@@ -4104,8 +4321,12 @@
           </w:tcPr>
           <w:p>
             <w:pPr>
+              <w:pStyle w:val="Prrafodelista"/>
+              <w:numPr>
+                <w:ilvl w:val="0"/>
+                <w:numId w:val="11"/>
+              </w:numPr>
               <w:spacing w:before="0" w:after="480" w:line="276" w:lineRule="auto"/>
-              <w:ind w:firstLine="0"/>
               <w:jc w:val="left"/>
               <w:rPr>
                 <w:sz w:val="22"/>
@@ -4117,7 +4338,8 @@
                 <w:sz w:val="22"/>
                 <w:szCs w:val="22"/>
               </w:rPr>
-              <w:t>2. Duplicidad de citas por concurrencia</w:t>
+              <w:lastRenderedPageBreak/>
+              <w:t>Bloqueo o deshabilitacion de Macros por políticas de seguridad de excel</w:t>
             </w:r>
           </w:p>
         </w:tc>
@@ -4222,152 +4444,7 @@
                 <w:sz w:val="22"/>
                 <w:szCs w:val="22"/>
               </w:rPr>
-              <w:t>Programar consultas dinámicas en JavaScript para verificar disponibilidad en tiempo real.</w:t>
-            </w:r>
-          </w:p>
-        </w:tc>
-      </w:tr>
-      <w:tr>
-        <w:trPr>
-          <w:trHeight w:val="1380"/>
-        </w:trPr>
-        <w:tc>
-          <w:tcPr>
-            <w:tcW w:w="2730" w:type="dxa"/>
-            <w:tcBorders>
-              <w:top w:val="single" w:sz="8" w:space="0" w:color="C4C7C5"/>
-              <w:left w:val="single" w:sz="8" w:space="0" w:color="C4C7C5"/>
-              <w:bottom w:val="single" w:sz="8" w:space="0" w:color="C4C7C5"/>
-              <w:right w:val="single" w:sz="8" w:space="0" w:color="C4C7C5"/>
-            </w:tcBorders>
-            <w:tcMar>
-              <w:top w:w="120" w:type="dxa"/>
-              <w:left w:w="180" w:type="dxa"/>
-              <w:bottom w:w="120" w:type="dxa"/>
-              <w:right w:w="180" w:type="dxa"/>
-            </w:tcMar>
-          </w:tcPr>
-          <w:p>
-            <w:pPr>
-              <w:spacing w:before="0" w:after="480" w:line="276" w:lineRule="auto"/>
-              <w:ind w:firstLine="0"/>
-              <w:jc w:val="left"/>
-              <w:rPr>
-                <w:sz w:val="22"/>
-                <w:szCs w:val="22"/>
-              </w:rPr>
-            </w:pPr>
-            <w:r>
-              <w:rPr>
-                <w:sz w:val="22"/>
-                <w:szCs w:val="22"/>
-              </w:rPr>
-              <w:t>3. Incompatibilidad de la UI en la PC de recepción</w:t>
-            </w:r>
-          </w:p>
-        </w:tc>
-        <w:tc>
-          <w:tcPr>
-            <w:tcW w:w="1845" w:type="dxa"/>
-            <w:tcBorders>
-              <w:top w:val="single" w:sz="8" w:space="0" w:color="C4C7C5"/>
-              <w:left w:val="single" w:sz="8" w:space="0" w:color="C4C7C5"/>
-              <w:bottom w:val="single" w:sz="8" w:space="0" w:color="C4C7C5"/>
-              <w:right w:val="single" w:sz="8" w:space="0" w:color="C4C7C5"/>
-            </w:tcBorders>
-            <w:tcMar>
-              <w:top w:w="120" w:type="dxa"/>
-              <w:left w:w="180" w:type="dxa"/>
-              <w:bottom w:w="120" w:type="dxa"/>
-              <w:right w:w="180" w:type="dxa"/>
-            </w:tcMar>
-          </w:tcPr>
-          <w:p>
-            <w:pPr>
-              <w:spacing w:before="0" w:after="480" w:line="276" w:lineRule="auto"/>
-              <w:ind w:firstLine="0"/>
-              <w:jc w:val="left"/>
-              <w:rPr>
-                <w:sz w:val="22"/>
-                <w:szCs w:val="22"/>
-              </w:rPr>
-            </w:pPr>
-            <w:r>
-              <w:rPr>
-                <w:sz w:val="22"/>
-                <w:szCs w:val="22"/>
-              </w:rPr>
-              <w:t>Baja</w:t>
-            </w:r>
-          </w:p>
-        </w:tc>
-        <w:tc>
-          <w:tcPr>
-            <w:tcW w:w="1320" w:type="dxa"/>
-            <w:tcBorders>
-              <w:top w:val="single" w:sz="8" w:space="0" w:color="C4C7C5"/>
-              <w:left w:val="single" w:sz="8" w:space="0" w:color="C4C7C5"/>
-              <w:bottom w:val="single" w:sz="8" w:space="0" w:color="C4C7C5"/>
-              <w:right w:val="single" w:sz="8" w:space="0" w:color="C4C7C5"/>
-            </w:tcBorders>
-            <w:tcMar>
-              <w:top w:w="120" w:type="dxa"/>
-              <w:left w:w="180" w:type="dxa"/>
-              <w:bottom w:w="120" w:type="dxa"/>
-              <w:right w:w="180" w:type="dxa"/>
-            </w:tcMar>
-          </w:tcPr>
-          <w:p>
-            <w:pPr>
-              <w:spacing w:before="0" w:after="480" w:line="276" w:lineRule="auto"/>
-              <w:ind w:firstLine="0"/>
-              <w:jc w:val="left"/>
-              <w:rPr>
-                <w:sz w:val="22"/>
-                <w:szCs w:val="22"/>
-              </w:rPr>
-            </w:pPr>
-            <w:r>
-              <w:rPr>
-                <w:sz w:val="22"/>
-                <w:szCs w:val="22"/>
-              </w:rPr>
-              <w:t>Medio</w:t>
-            </w:r>
-          </w:p>
-        </w:tc>
-        <w:tc>
-          <w:tcPr>
-            <w:tcW w:w="2865" w:type="dxa"/>
-            <w:tcBorders>
-              <w:top w:val="single" w:sz="8" w:space="0" w:color="C4C7C5"/>
-              <w:left w:val="single" w:sz="8" w:space="0" w:color="C4C7C5"/>
-              <w:bottom w:val="single" w:sz="8" w:space="0" w:color="C4C7C5"/>
-              <w:right w:val="single" w:sz="8" w:space="0" w:color="C4C7C5"/>
-            </w:tcBorders>
-            <w:tcMar>
-              <w:top w:w="120" w:type="dxa"/>
-              <w:left w:w="180" w:type="dxa"/>
-              <w:bottom w:w="120" w:type="dxa"/>
-              <w:right w:w="180" w:type="dxa"/>
-            </w:tcMar>
-          </w:tcPr>
-          <w:p>
-            <w:pPr>
-              <w:spacing w:before="0" w:after="480" w:line="276" w:lineRule="auto"/>
-              <w:ind w:firstLine="0"/>
-              <w:jc w:val="left"/>
-              <w:rPr>
-                <w:sz w:val="22"/>
-                <w:szCs w:val="22"/>
-              </w:rPr>
-            </w:pPr>
-            <w:r>
-              <w:rPr>
-                <w:sz w:val="22"/>
-                <w:szCs w:val="22"/>
-              </w:rPr>
-              <w:t>Realizar pruebas de usabilidad previas en el navegador de la clínica.</w:t>
+              <w:t>Configurar la ubicación de la caroeta del proyecto como una ubicación de confianza</w:t>
             </w:r>
           </w:p>
         </w:tc>
@@ -4552,7 +4629,6 @@
                 <w:sz w:val="22"/>
                 <w:szCs w:val="22"/>
               </w:rPr>
-              <w:lastRenderedPageBreak/>
               <w:t>5. Acceso no autorizado a los datos</w:t>
             </w:r>
           </w:p>
@@ -4677,123 +4753,45 @@
     </w:p>
     <w:p>
       <w:pPr>
-        <w:spacing w:after="240"/>
+        <w:pStyle w:val="Ttulo1"/>
+      </w:pPr>
+      <w:r>
+        <w:t>CONCLUSION</w:t>
+      </w:r>
+    </w:p>
+    <w:p>
+      <w:pPr>
+        <w:rPr>
+          <w:lang w:val="es-EC"/>
+        </w:rPr>
+      </w:pPr>
+      <w:r>
+        <w:rPr>
+          <w:lang w:val="es-EC"/>
+        </w:rPr>
+        <w:t>El prototipo en Excel permite simular un sistema real de gestión veterinaria, facilitando el control de información y mejorando la organización administrativa. Este manual ayuda al usuario a comprender y utilizar correctamente cada funcionalidad implementada.</w:t>
+      </w:r>
+    </w:p>
+    <w:p>
+      <w:pPr>
+        <w:pStyle w:val="Ttulo1"/>
+      </w:pPr>
+      <w:r>
+        <w:lastRenderedPageBreak/>
+        <w:t>HERRAMIENTAS</w:t>
+      </w:r>
+    </w:p>
+    <w:p>
+      <w:pPr>
+        <w:pStyle w:val="Ttulo2"/>
+      </w:pPr>
+      <w:r>
+        <w:t>Trello</w:t>
+      </w:r>
+    </w:p>
+    <w:p>
+      <w:pPr>
         <w:ind w:firstLine="0"/>
-        <w:jc w:val="left"/>
-        <w:rPr>
-          <w:b/>
-          <w:bCs/>
-        </w:rPr>
-      </w:pPr>
-    </w:p>
-    <w:p>
-      <w:pPr>
-        <w:spacing w:after="240"/>
-        <w:ind w:firstLine="0"/>
-        <w:jc w:val="left"/>
-        <w:rPr>
-          <w:b/>
-          <w:bCs/>
-        </w:rPr>
-      </w:pPr>
-    </w:p>
-    <w:p>
-      <w:pPr>
-        <w:spacing w:after="240"/>
-        <w:ind w:firstLine="0"/>
-        <w:jc w:val="left"/>
-        <w:rPr>
-          <w:b/>
-          <w:bCs/>
-        </w:rPr>
-      </w:pPr>
-    </w:p>
-    <w:p>
-      <w:pPr>
-        <w:spacing w:after="240"/>
-        <w:ind w:firstLine="0"/>
-        <w:jc w:val="left"/>
-        <w:rPr>
-          <w:b/>
-          <w:bCs/>
-        </w:rPr>
-      </w:pPr>
-    </w:p>
-    <w:p>
-      <w:pPr>
-        <w:spacing w:after="240"/>
-        <w:ind w:firstLine="0"/>
-        <w:jc w:val="left"/>
-        <w:rPr>
-          <w:b/>
-          <w:bCs/>
-        </w:rPr>
-      </w:pPr>
-    </w:p>
-    <w:p>
-      <w:pPr>
-        <w:spacing w:after="240"/>
-        <w:ind w:firstLine="0"/>
-        <w:jc w:val="left"/>
-        <w:rPr>
-          <w:b/>
-          <w:bCs/>
-        </w:rPr>
-      </w:pPr>
-    </w:p>
-    <w:p>
-      <w:pPr>
-        <w:spacing w:after="240"/>
-        <w:ind w:firstLine="0"/>
-        <w:jc w:val="left"/>
-        <w:rPr>
-          <w:b/>
-          <w:bCs/>
-        </w:rPr>
-      </w:pPr>
-    </w:p>
-    <w:p>
-      <w:pPr>
-        <w:ind w:firstLine="0"/>
-        <w:rPr>
-          <w:b/>
-          <w:bCs/>
-        </w:rPr>
-      </w:pPr>
-      <w:r>
-        <w:rPr>
-          <w:b/>
-          <w:bCs/>
-        </w:rPr>
-        <w:t xml:space="preserve">11. Evidencia del uso de herramientas: capturas del tablero de Trello y del repositorio de GitHub, junto con sus enlaces públicos. </w:t>
-      </w:r>
-      <w:r>
-        <w:rPr>
-          <w:b/>
-          <w:bCs/>
-        </w:rPr>
-        <w:t>(JAVIER ORDOÑEZ)</w:t>
-      </w:r>
-    </w:p>
-    <w:p>
-      <w:pPr>
-        <w:ind w:firstLine="0"/>
-        <w:rPr>
-          <w:b/>
-          <w:bCs/>
-        </w:rPr>
-      </w:pPr>
-      <w:r>
-        <w:rPr>
-          <w:b/>
-          <w:bCs/>
-        </w:rPr>
-        <w:t>Trello</w:t>
-      </w:r>
-    </w:p>
-    <w:p>
-      <w:pPr>
-        <w:ind w:firstLine="0"/>
         <w:rPr>
           <w:b/>
           <w:bCs/>
@@ -4805,7 +4803,6 @@
           <w:bCs/>
           <w:noProof/>
         </w:rPr>
-        <w:lastRenderedPageBreak/>
         <w:drawing>
           <wp:inline distT="114300" distB="114300" distL="114300" distR="114300" wp14:anchorId="0AC47234" wp14:editId="2D5DF0D6">
             <wp:extent cx="5722937" cy="2560262"/>
@@ -4820,7 +4817,7 @@
                     <pic:cNvPicPr preferRelativeResize="0"/>
                   </pic:nvPicPr>
                   <pic:blipFill>
-                    <a:blip r:embed="rId13"/>
+                    <a:blip r:embed="rId15"/>
                     <a:srcRect/>
                     <a:stretch>
                       <a:fillRect/>
@@ -4854,13 +4851,19 @@
       </w:pPr>
       <w:r>
         <w:rPr>
-          <w:b/>
-          <w:bCs/>
           <w:lang w:val="en-US"/>
         </w:rPr>
-        <w:t xml:space="preserve">Enlace: </w:t>
-      </w:r>
-      <w:hyperlink r:id="rId14">
+        <w:t>Enlace:</w:t>
+      </w:r>
+      <w:r>
+        <w:rPr>
+          <w:b/>
+          <w:bCs/>
+          <w:lang w:val="en-US"/>
+        </w:rPr>
+        <w:t xml:space="preserve"> </w:t>
+      </w:r>
+      <w:hyperlink r:id="rId16">
         <w:r>
           <w:rPr>
             <w:b/>
@@ -4875,17 +4878,10 @@
     </w:p>
     <w:p>
       <w:pPr>
-        <w:ind w:firstLine="0"/>
-        <w:rPr>
-          <w:b/>
-          <w:bCs/>
-        </w:rPr>
-      </w:pPr>
-      <w:r>
-        <w:rPr>
-          <w:b/>
-          <w:bCs/>
-        </w:rPr>
+        <w:pStyle w:val="Ttulo2"/>
+      </w:pPr>
+      <w:r>
+        <w:lastRenderedPageBreak/>
         <w:t>GitHub</w:t>
       </w:r>
     </w:p>
@@ -4917,7 +4913,7 @@
                     <pic:cNvPicPr preferRelativeResize="0"/>
                   </pic:nvPicPr>
                   <pic:blipFill>
-                    <a:blip r:embed="rId15"/>
+                    <a:blip r:embed="rId17"/>
                     <a:srcRect/>
                     <a:stretch>
                       <a:fillRect/>
@@ -4951,13 +4947,19 @@
       </w:pPr>
       <w:r>
         <w:rPr>
-          <w:b/>
-          <w:bCs/>
           <w:lang w:val="en-US"/>
         </w:rPr>
-        <w:t xml:space="preserve">Enlace: </w:t>
-      </w:r>
-      <w:hyperlink r:id="rId16">
+        <w:t>Enlace:</w:t>
+      </w:r>
+      <w:r>
+        <w:rPr>
+          <w:b/>
+          <w:bCs/>
+          <w:lang w:val="en-US"/>
+        </w:rPr>
+        <w:t xml:space="preserve"> </w:t>
+      </w:r>
+      <w:hyperlink r:id="rId18">
         <w:r>
           <w:rPr>
             <w:b/>
@@ -4980,6 +4982,205 @@
     </w:p>
     <w:p>
       <w:pPr>
+        <w:pStyle w:val="Ttulo1"/>
+        <w:rPr>
+          <w:lang w:val="en-US"/>
+        </w:rPr>
+      </w:pPr>
+      <w:r>
+        <w:rPr>
+          <w:lang w:val="en-US"/>
+        </w:rPr>
+        <w:t>BIBLIOGRAFIA</w:t>
+      </w:r>
+    </w:p>
+    <w:p>
+      <w:pPr>
+        <w:pStyle w:val="Bibliografa"/>
+        <w:rPr>
+          <w:lang w:val="en-US"/>
+        </w:rPr>
+      </w:pPr>
+      <w:r>
+        <w:rPr>
+          <w:b/>
+          <w:bCs/>
+        </w:rPr>
+        <w:fldChar w:fldCharType="begin"/>
+      </w:r>
+      <w:r>
+        <w:rPr>
+          <w:b/>
+          <w:bCs/>
+          <w:lang w:val="en-US"/>
+        </w:rPr>
+        <w:instrText xml:space="preserve"> ADDIN ZOTERO_BIBL {"uncited":[],"omitted":[],"custom":[]} CSL_BIBLIOGRAPHY </w:instrText>
+      </w:r>
+      <w:r>
+        <w:rPr>
+          <w:b/>
+          <w:bCs/>
+        </w:rPr>
+        <w:fldChar w:fldCharType="separate"/>
+      </w:r>
+      <w:r>
+        <w:rPr>
+          <w:lang w:val="en-US"/>
+        </w:rPr>
+        <w:t xml:space="preserve">Mills, H. D. (1999). </w:t>
+      </w:r>
+      <w:r>
+        <w:rPr>
+          <w:i/>
+          <w:iCs/>
+          <w:lang w:val="en-US"/>
+        </w:rPr>
+        <w:t>Management of Software Engineering, The - Part I: Principles of Software Engineering</w:t>
+      </w:r>
+      <w:r>
+        <w:rPr>
+          <w:lang w:val="en-US"/>
+        </w:rPr>
+        <w:t>. https://trace.tennessee.edu/handle/20.500.14382/47084</w:t>
+      </w:r>
+    </w:p>
+    <w:p>
+      <w:pPr>
+        <w:pStyle w:val="Bibliografa"/>
+      </w:pPr>
+      <w:r>
+        <w:rPr>
+          <w:i/>
+          <w:iCs/>
+          <w:lang w:val="en-US"/>
+        </w:rPr>
+        <w:t>Schwalbe, K. (2015). Information Technology Project Management. Cengage Learning. - References—Scientific Research Publishing</w:t>
+      </w:r>
+      <w:r>
+        <w:rPr>
+          <w:lang w:val="en-US"/>
+        </w:rPr>
+        <w:t xml:space="preserve">. </w:t>
+      </w:r>
+      <w:r>
+        <w:t>(s. f.). Recuperado 25 de julio de 2026, de https://www.scirp.org/reference/referencespapers?referenceid=3225970</w:t>
+      </w:r>
+    </w:p>
+    <w:p>
+      <w:pPr>
+        <w:pStyle w:val="Bibliografa"/>
+        <w:rPr>
+          <w:b/>
+          <w:bCs/>
+          <w:smallCaps/>
+          <w:color w:val="1F497D"/>
+          <w:sz w:val="40"/>
+          <w:szCs w:val="40"/>
+        </w:rPr>
+      </w:pPr>
+      <w:r>
+        <w:rPr>
+          <w:lang w:val="en-US"/>
+        </w:rPr>
+        <w:t xml:space="preserve">Sommerville, I. (2011). </w:t>
+      </w:r>
+      <w:r>
+        <w:rPr>
+          <w:i/>
+          <w:iCs/>
+          <w:lang w:val="en-US"/>
+        </w:rPr>
+        <w:t>Software engineering</w:t>
+      </w:r>
+      <w:r>
+        <w:rPr>
+          <w:lang w:val="en-US"/>
+        </w:rPr>
+        <w:t xml:space="preserve"> (9th ed). </w:t>
+      </w:r>
+      <w:r>
+        <w:t>Pearson.</w:t>
+      </w:r>
+      <w:r>
+        <w:rPr>
+          <w:b/>
+          <w:bCs/>
+        </w:rPr>
+        <w:fldChar w:fldCharType="end"/>
+      </w:r>
+    </w:p>
+    <w:p>
+      <w:pPr>
+        <w:pStyle w:val="Bibliografa"/>
+      </w:pPr>
+      <w:r>
+        <w:t xml:space="preserve">Pressman, R. S. (2010). Ingeniería del software: Un enfoque práctico (7.ª ed.). McGraw-Hill Interamericana Editores. </w:t>
+      </w:r>
+      <w:hyperlink r:id="rId19" w:tgtFrame="_blank" w:history="1">
+        <w:r>
+          <w:t>https://escuelaesam.pe/biblioteca/assets/uploads/libro_689d13f16f1dc.pdf</w:t>
+        </w:r>
+      </w:hyperlink>
+    </w:p>
+    <w:p>
+      <w:r>
+        <w:t xml:space="preserve">Larman, C. (2003). </w:t>
+      </w:r>
+      <w:r>
+        <w:rPr>
+          <w:i/>
+          <w:iCs/>
+        </w:rPr>
+        <w:t>UML y patrones: Una introducción al análisis y diseño orientado a objetos y al proceso unificado</w:t>
+      </w:r>
+      <w:r>
+        <w:t xml:space="preserve"> (2.ª ed.). Pearson Educación. </w:t>
+      </w:r>
+      <w:hyperlink r:id="rId20" w:tgtFrame="_blank" w:history="1">
+        <w:r>
+          <w:rPr>
+            <w:rStyle w:val="Hipervnculo"/>
+          </w:rPr>
+          <w:t>https://upload.wikimedia.org/wikipedia/commons/a/a8/UML_y_Patrones_-_Larman_2_Edicion.pdf</w:t>
+        </w:r>
+      </w:hyperlink>
+    </w:p>
+    <w:p>
+      <w:r>
+        <w:rPr>
+          <w:lang w:val="en-US"/>
+        </w:rPr>
+        <w:t xml:space="preserve">Kendall, K. E. y Kendall, J. E. (2011). </w:t>
+      </w:r>
+      <w:r>
+        <w:rPr>
+          <w:i/>
+          <w:iCs/>
+        </w:rPr>
+        <w:t>Análisis y diseño de sistemas</w:t>
+      </w:r>
+      <w:r>
+        <w:t xml:space="preserve"> (8.ª ed.). Pearson Educación. </w:t>
+      </w:r>
+      <w:hyperlink r:id="rId21" w:tgtFrame="_blank" w:history="1">
+        <w:r>
+          <w:rPr>
+            <w:rStyle w:val="Hipervnculo"/>
+          </w:rPr>
+          <w:t>https://ccie.com.mx/wp-content/uploads/2020/03/ld-Analisis-y-Diseno-de-Sistemas_Kendall-8va.pdf</w:t>
+        </w:r>
+      </w:hyperlink>
+    </w:p>
+    <w:p>
+      <w:pPr>
+        <w:pStyle w:val="Ttulo1"/>
+      </w:pPr>
+      <w:r>
+        <w:t>ANEXOS</w:t>
+      </w:r>
+    </w:p>
+    <w:p>
+      <w:pPr>
         <w:ind w:firstLine="0"/>
         <w:rPr>
           <w:b/>
@@ -4991,8 +5192,7 @@
           <w:b/>
           <w:bCs/>
         </w:rPr>
-        <w:lastRenderedPageBreak/>
-        <w:t xml:space="preserve">12. Descripción del prototipo/MVP desarrollado y su relación con los requerimientos especificados. </w:t>
+        <w:t xml:space="preserve">Enlace Trello: </w:t>
       </w:r>
     </w:p>
     <w:p>
@@ -5003,98 +5203,7 @@
           <w:bCs/>
         </w:rPr>
       </w:pPr>
-    </w:p>
-    <w:p>
-      <w:pPr>
-        <w:ind w:firstLine="0"/>
-        <w:rPr>
-          <w:b/>
-          <w:bCs/>
-        </w:rPr>
-      </w:pPr>
-      <w:r>
-        <w:rPr>
-          <w:b/>
-          <w:bCs/>
-        </w:rPr>
-        <w:t xml:space="preserve">13. Conclusiones y recomendaciones. </w:t>
-      </w:r>
-    </w:p>
-    <w:p>
-      <w:pPr>
-        <w:ind w:firstLine="0"/>
-        <w:rPr>
-          <w:b/>
-          <w:bCs/>
-        </w:rPr>
-      </w:pPr>
-    </w:p>
-    <w:p>
-      <w:pPr>
-        <w:ind w:firstLine="0"/>
-        <w:rPr>
-          <w:b/>
-          <w:bCs/>
-        </w:rPr>
-      </w:pPr>
-      <w:r>
-        <w:rPr>
-          <w:b/>
-          <w:bCs/>
-        </w:rPr>
-        <w:t xml:space="preserve">14. Bibliografía (formato APA, mínimo 5 fuentes académicas). </w:t>
-      </w:r>
-    </w:p>
-    <w:p>
-      <w:pPr>
-        <w:ind w:firstLine="0"/>
-        <w:rPr>
-          <w:b/>
-          <w:bCs/>
-        </w:rPr>
-      </w:pPr>
-    </w:p>
-    <w:p>
-      <w:pPr>
-        <w:ind w:firstLine="0"/>
-        <w:rPr>
-          <w:b/>
-          <w:bCs/>
-        </w:rPr>
-      </w:pPr>
-      <w:r>
-        <w:rPr>
-          <w:b/>
-          <w:bCs/>
-        </w:rPr>
-        <w:t xml:space="preserve">15. Anexos (capturas de pantalla adicionales, enlace al tablero de Trello y al repositorio de GitHub). </w:t>
-      </w:r>
-    </w:p>
-    <w:p>
-      <w:pPr>
-        <w:ind w:firstLine="0"/>
-        <w:rPr>
-          <w:b/>
-          <w:bCs/>
-        </w:rPr>
-      </w:pPr>
-      <w:r>
-        <w:rPr>
-          <w:b/>
-          <w:bCs/>
-        </w:rPr>
-        <w:t xml:space="preserve">Enlace Trello: </w:t>
-      </w:r>
-    </w:p>
-    <w:p>
-      <w:pPr>
-        <w:ind w:firstLine="0"/>
-        <w:rPr>
-          <w:b/>
-          <w:bCs/>
-        </w:rPr>
-      </w:pPr>
-      <w:hyperlink r:id="rId17">
+      <w:hyperlink r:id="rId22">
         <w:r>
           <w:rPr>
             <w:b/>
@@ -5149,7 +5258,7 @@
           <w:lang w:val="en-US"/>
         </w:rPr>
       </w:pPr>
-      <w:hyperlink r:id="rId18">
+      <w:hyperlink r:id="rId23">
         <w:r>
           <w:rPr>
             <w:b/>
@@ -5464,6 +5573,95 @@
     </w:lvl>
   </w:abstractNum>
   <w:abstractNum w:abstractNumId="1" w15:restartNumberingAfterBreak="0">
+    <w:nsid w:val="27662E09"/>
+    <w:multiLevelType w:val="hybridMultilevel"/>
+    <w:tmpl w:val="9582326E"/>
+    <w:lvl w:ilvl="0" w:tplc="300A000F">
+      <w:start w:val="1"/>
+      <w:numFmt w:val="decimal"/>
+      <w:lvlText w:val="%1."/>
+      <w:lvlJc w:val="left"/>
+      <w:pPr>
+        <w:ind w:left="720" w:hanging="360"/>
+      </w:pPr>
+      <w:rPr>
+        <w:rFonts w:hint="default"/>
+      </w:rPr>
+    </w:lvl>
+    <w:lvl w:ilvl="1" w:tplc="300A0019" w:tentative="1">
+      <w:start w:val="1"/>
+      <w:numFmt w:val="lowerLetter"/>
+      <w:lvlText w:val="%2."/>
+      <w:lvlJc w:val="left"/>
+      <w:pPr>
+        <w:ind w:left="1440" w:hanging="360"/>
+      </w:pPr>
+    </w:lvl>
+    <w:lvl w:ilvl="2" w:tplc="300A001B" w:tentative="1">
+      <w:start w:val="1"/>
+      <w:numFmt w:val="lowerRoman"/>
+      <w:lvlText w:val="%3."/>
+      <w:lvlJc w:val="right"/>
+      <w:pPr>
+        <w:ind w:left="2160" w:hanging="180"/>
+      </w:pPr>
+    </w:lvl>
+    <w:lvl w:ilvl="3" w:tplc="300A000F" w:tentative="1">
+      <w:start w:val="1"/>
+      <w:numFmt w:val="decimal"/>
+      <w:lvlText w:val="%4."/>
+      <w:lvlJc w:val="left"/>
+      <w:pPr>
+        <w:ind w:left="2880" w:hanging="360"/>
+      </w:pPr>
+    </w:lvl>
+    <w:lvl w:ilvl="4" w:tplc="300A0019" w:tentative="1">
+      <w:start w:val="1"/>
+      <w:numFmt w:val="lowerLetter"/>
+      <w:lvlText w:val="%5."/>
+      <w:lvlJc w:val="left"/>
+      <w:pPr>
+        <w:ind w:left="3600" w:hanging="360"/>
+      </w:pPr>
+    </w:lvl>
+    <w:lvl w:ilvl="5" w:tplc="300A001B" w:tentative="1">
+      <w:start w:val="1"/>
+      <w:numFmt w:val="lowerRoman"/>
+      <w:lvlText w:val="%6."/>
+      <w:lvlJc w:val="right"/>
+      <w:pPr>
+        <w:ind w:left="4320" w:hanging="180"/>
+      </w:pPr>
+    </w:lvl>
+    <w:lvl w:ilvl="6" w:tplc="300A000F" w:tentative="1">
+      <w:start w:val="1"/>
+      <w:numFmt w:val="decimal"/>
+      <w:lvlText w:val="%7."/>
+      <w:lvlJc w:val="left"/>
+      <w:pPr>
+        <w:ind w:left="5040" w:hanging="360"/>
+      </w:pPr>
+    </w:lvl>
+    <w:lvl w:ilvl="7" w:tplc="300A0019" w:tentative="1">
+      <w:start w:val="1"/>
+      <w:numFmt w:val="lowerLetter"/>
+      <w:lvlText w:val="%8."/>
+      <w:lvlJc w:val="left"/>
+      <w:pPr>
+        <w:ind w:left="5760" w:hanging="360"/>
+      </w:pPr>
+    </w:lvl>
+    <w:lvl w:ilvl="8" w:tplc="300A001B" w:tentative="1">
+      <w:start w:val="1"/>
+      <w:numFmt w:val="lowerRoman"/>
+      <w:lvlText w:val="%9."/>
+      <w:lvlJc w:val="right"/>
+      <w:pPr>
+        <w:ind w:left="6480" w:hanging="180"/>
+      </w:pPr>
+    </w:lvl>
+  </w:abstractNum>
+  <w:abstractNum w:abstractNumId="2" w15:restartNumberingAfterBreak="0">
     <w:nsid w:val="27DD0B34"/>
     <w:multiLevelType w:val="multilevel"/>
     <w:tmpl w:val="E1366598"/>
@@ -5576,7 +5774,120 @@
       </w:rPr>
     </w:lvl>
   </w:abstractNum>
-  <w:abstractNum w:abstractNumId="2" w15:restartNumberingAfterBreak="0">
+  <w:abstractNum w:abstractNumId="3" w15:restartNumberingAfterBreak="0">
+    <w:nsid w:val="36081841"/>
+    <w:multiLevelType w:val="hybridMultilevel"/>
+    <w:tmpl w:val="4F8E6CFC"/>
+    <w:lvl w:ilvl="0" w:tplc="300A000B">
+      <w:start w:val="1"/>
+      <w:numFmt w:val="bullet"/>
+      <w:lvlText w:val=""/>
+      <w:lvlJc w:val="left"/>
+      <w:pPr>
+        <w:ind w:left="1440" w:hanging="360"/>
+      </w:pPr>
+      <w:rPr>
+        <w:rFonts w:ascii="Wingdings" w:hAnsi="Wingdings" w:hint="default"/>
+      </w:rPr>
+    </w:lvl>
+    <w:lvl w:ilvl="1" w:tplc="300A0003" w:tentative="1">
+      <w:start w:val="1"/>
+      <w:numFmt w:val="bullet"/>
+      <w:lvlText w:val="o"/>
+      <w:lvlJc w:val="left"/>
+      <w:pPr>
+        <w:ind w:left="2160" w:hanging="360"/>
+      </w:pPr>
+      <w:rPr>
+        <w:rFonts w:ascii="Courier New" w:hAnsi="Courier New" w:cs="Courier New" w:hint="default"/>
+      </w:rPr>
+    </w:lvl>
+    <w:lvl w:ilvl="2" w:tplc="300A0005" w:tentative="1">
+      <w:start w:val="1"/>
+      <w:numFmt w:val="bullet"/>
+      <w:lvlText w:val=""/>
+      <w:lvlJc w:val="left"/>
+      <w:pPr>
+        <w:ind w:left="2880" w:hanging="360"/>
+      </w:pPr>
+      <w:rPr>
+        <w:rFonts w:ascii="Wingdings" w:hAnsi="Wingdings" w:hint="default"/>
+      </w:rPr>
+    </w:lvl>
+    <w:lvl w:ilvl="3" w:tplc="300A0001" w:tentative="1">
+      <w:start w:val="1"/>
+      <w:numFmt w:val="bullet"/>
+      <w:lvlText w:val=""/>
+      <w:lvlJc w:val="left"/>
+      <w:pPr>
+        <w:ind w:left="3600" w:hanging="360"/>
+      </w:pPr>
+      <w:rPr>
+        <w:rFonts w:ascii="Symbol" w:hAnsi="Symbol" w:hint="default"/>
+      </w:rPr>
+    </w:lvl>
+    <w:lvl w:ilvl="4" w:tplc="300A0003" w:tentative="1">
+      <w:start w:val="1"/>
+      <w:numFmt w:val="bullet"/>
+      <w:lvlText w:val="o"/>
+      <w:lvlJc w:val="left"/>
+      <w:pPr>
+        <w:ind w:left="4320" w:hanging="360"/>
+      </w:pPr>
+      <w:rPr>
+        <w:rFonts w:ascii="Courier New" w:hAnsi="Courier New" w:cs="Courier New" w:hint="default"/>
+      </w:rPr>
+    </w:lvl>
+    <w:lvl w:ilvl="5" w:tplc="300A0005" w:tentative="1">
+      <w:start w:val="1"/>
+      <w:numFmt w:val="bullet"/>
+      <w:lvlText w:val=""/>
+      <w:lvlJc w:val="left"/>
+      <w:pPr>
+        <w:ind w:left="5040" w:hanging="360"/>
+      </w:pPr>
+      <w:rPr>
+        <w:rFonts w:ascii="Wingdings" w:hAnsi="Wingdings" w:hint="default"/>
+      </w:rPr>
+    </w:lvl>
+    <w:lvl w:ilvl="6" w:tplc="300A0001" w:tentative="1">
+      <w:start w:val="1"/>
+      <w:numFmt w:val="bullet"/>
+      <w:lvlText w:val=""/>
+      <w:lvlJc w:val="left"/>
+      <w:pPr>
+        <w:ind w:left="5760" w:hanging="360"/>
+      </w:pPr>
+      <w:rPr>
+        <w:rFonts w:ascii="Symbol" w:hAnsi="Symbol" w:hint="default"/>
+      </w:rPr>
+    </w:lvl>
+    <w:lvl w:ilvl="7" w:tplc="300A0003" w:tentative="1">
+      <w:start w:val="1"/>
+      <w:numFmt w:val="bullet"/>
+      <w:lvlText w:val="o"/>
+      <w:lvlJc w:val="left"/>
+      <w:pPr>
+        <w:ind w:left="6480" w:hanging="360"/>
+      </w:pPr>
+      <w:rPr>
+        <w:rFonts w:ascii="Courier New" w:hAnsi="Courier New" w:cs="Courier New" w:hint="default"/>
+      </w:rPr>
+    </w:lvl>
+    <w:lvl w:ilvl="8" w:tplc="300A0005" w:tentative="1">
+      <w:start w:val="1"/>
+      <w:numFmt w:val="bullet"/>
+      <w:lvlText w:val=""/>
+      <w:lvlJc w:val="left"/>
+      <w:pPr>
+        <w:ind w:left="7200" w:hanging="360"/>
+      </w:pPr>
+      <w:rPr>
+        <w:rFonts w:ascii="Wingdings" w:hAnsi="Wingdings" w:hint="default"/>
+      </w:rPr>
+    </w:lvl>
+  </w:abstractNum>
+  <w:abstractNum w:abstractNumId="4" w15:restartNumberingAfterBreak="0">
     <w:nsid w:val="396D5B0C"/>
     <w:multiLevelType w:val="multilevel"/>
     <w:tmpl w:val="50868236"/>
@@ -5689,7 +6000,7 @@
       </w:rPr>
     </w:lvl>
   </w:abstractNum>
-  <w:abstractNum w:abstractNumId="3" w15:restartNumberingAfterBreak="0">
+  <w:abstractNum w:abstractNumId="5" w15:restartNumberingAfterBreak="0">
     <w:nsid w:val="3B75363D"/>
     <w:multiLevelType w:val="multilevel"/>
     <w:tmpl w:val="1BE465DC"/>
@@ -5802,7 +6113,7 @@
       </w:rPr>
     </w:lvl>
   </w:abstractNum>
-  <w:abstractNum w:abstractNumId="4" w15:restartNumberingAfterBreak="0">
+  <w:abstractNum w:abstractNumId="6" w15:restartNumberingAfterBreak="0">
     <w:nsid w:val="433A3903"/>
     <w:multiLevelType w:val="multilevel"/>
     <w:tmpl w:val="EA7C47DC"/>
@@ -5915,7 +6226,7 @@
       </w:rPr>
     </w:lvl>
   </w:abstractNum>
-  <w:abstractNum w:abstractNumId="5" w15:restartNumberingAfterBreak="0">
+  <w:abstractNum w:abstractNumId="7" w15:restartNumberingAfterBreak="0">
     <w:nsid w:val="4A153E9A"/>
     <w:multiLevelType w:val="multilevel"/>
     <w:tmpl w:val="B7C232BA"/>
@@ -6028,7 +6339,7 @@
       </w:rPr>
     </w:lvl>
   </w:abstractNum>
-  <w:abstractNum w:abstractNumId="6" w15:restartNumberingAfterBreak="0">
+  <w:abstractNum w:abstractNumId="8" w15:restartNumberingAfterBreak="0">
     <w:nsid w:val="66C71D00"/>
     <w:multiLevelType w:val="multilevel"/>
     <w:tmpl w:val="81B8FD7A"/>
@@ -6141,7 +6452,7 @@
       </w:rPr>
     </w:lvl>
   </w:abstractNum>
-  <w:abstractNum w:abstractNumId="7" w15:restartNumberingAfterBreak="0">
+  <w:abstractNum w:abstractNumId="9" w15:restartNumberingAfterBreak="0">
     <w:nsid w:val="79BF7954"/>
     <w:multiLevelType w:val="multilevel"/>
     <w:tmpl w:val="DC182B92"/>
@@ -6254,7 +6565,7 @@
       </w:rPr>
     </w:lvl>
   </w:abstractNum>
-  <w:abstractNum w:abstractNumId="8" w15:restartNumberingAfterBreak="0">
+  <w:abstractNum w:abstractNumId="10" w15:restartNumberingAfterBreak="0">
     <w:nsid w:val="7A903AA3"/>
     <w:multiLevelType w:val="multilevel"/>
     <w:tmpl w:val="4678E9AC"/>
@@ -6368,31 +6679,37 @@
     </w:lvl>
   </w:abstractNum>
   <w:num w:numId="1" w16cid:durableId="816608048">
-    <w:abstractNumId w:val="8"/>
+    <w:abstractNumId w:val="10"/>
   </w:num>
   <w:num w:numId="2" w16cid:durableId="1870802034">
-    <w:abstractNumId w:val="4"/>
+    <w:abstractNumId w:val="6"/>
   </w:num>
   <w:num w:numId="3" w16cid:durableId="444543841">
     <w:abstractNumId w:val="0"/>
   </w:num>
   <w:num w:numId="4" w16cid:durableId="1190725197">
+    <w:abstractNumId w:val="7"/>
+  </w:num>
+  <w:num w:numId="5" w16cid:durableId="1481919805">
     <w:abstractNumId w:val="5"/>
   </w:num>
-  <w:num w:numId="5" w16cid:durableId="1481919805">
+  <w:num w:numId="6" w16cid:durableId="397827010">
+    <w:abstractNumId w:val="4"/>
+  </w:num>
+  <w:num w:numId="7" w16cid:durableId="297339530">
+    <w:abstractNumId w:val="2"/>
+  </w:num>
+  <w:num w:numId="8" w16cid:durableId="330447259">
+    <w:abstractNumId w:val="8"/>
+  </w:num>
+  <w:num w:numId="9" w16cid:durableId="121504061">
+    <w:abstractNumId w:val="9"/>
+  </w:num>
+  <w:num w:numId="10" w16cid:durableId="681904112">
     <w:abstractNumId w:val="3"/>
   </w:num>
-  <w:num w:numId="6" w16cid:durableId="397827010">
-    <w:abstractNumId w:val="2"/>
-  </w:num>
-  <w:num w:numId="7" w16cid:durableId="297339530">
+  <w:num w:numId="11" w16cid:durableId="675419652">
     <w:abstractNumId w:val="1"/>
-  </w:num>
-  <w:num w:numId="8" w16cid:durableId="330447259">
-    <w:abstractNumId w:val="6"/>
-  </w:num>
-  <w:num w:numId="9" w16cid:durableId="121504061">
-    <w:abstractNumId w:val="7"/>
   </w:num>
 </w:numbering>
 </file>
@@ -6797,11 +7114,13 @@
   <w:style w:type="paragraph" w:default="1" w:styleId="Normal">
     <w:name w:val="Normal"/>
     <w:qFormat/>
+    <w:rsid w:val="001578B4"/>
   </w:style>
   <w:style w:type="paragraph" w:styleId="Ttulo1">
     <w:name w:val="heading 1"/>
     <w:basedOn w:val="Normal"/>
     <w:next w:val="Normal"/>
+    <w:link w:val="Ttulo1Car"/>
     <w:uiPriority w:val="9"/>
     <w:qFormat/>
     <w:pPr>
@@ -6921,7 +7240,6 @@
   <w:style w:type="character" w:default="1" w:styleId="Fuentedeprrafopredeter">
     <w:name w:val="Default Paragraph Font"/>
     <w:uiPriority w:val="1"/>
-    <w:semiHidden/>
     <w:unhideWhenUsed/>
   </w:style>
   <w:style w:type="table" w:default="1" w:styleId="Tablanormal">
@@ -7009,6 +7327,74 @@
       <w:tblStyleRowBandSize w:val="1"/>
       <w:tblStyleColBandSize w:val="1"/>
     </w:tblPr>
+  </w:style>
+  <w:style w:type="character" w:customStyle="1" w:styleId="Ttulo1Car">
+    <w:name w:val="Título 1 Car"/>
+    <w:basedOn w:val="Fuentedeprrafopredeter"/>
+    <w:link w:val="Ttulo1"/>
+    <w:uiPriority w:val="9"/>
+    <w:rsid w:val="00D6535C"/>
+    <w:rPr>
+      <w:b/>
+      <w:bCs/>
+      <w:smallCaps/>
+      <w:color w:val="1F497D"/>
+      <w:sz w:val="40"/>
+      <w:szCs w:val="40"/>
+    </w:rPr>
+  </w:style>
+  <w:style w:type="paragraph" w:styleId="Bibliografa">
+    <w:name w:val="Bibliography"/>
+    <w:basedOn w:val="Normal"/>
+    <w:next w:val="Normal"/>
+    <w:uiPriority w:val="37"/>
+    <w:unhideWhenUsed/>
+    <w:rsid w:val="009B65B5"/>
+  </w:style>
+  <w:style w:type="character" w:styleId="Hipervnculo">
+    <w:name w:val="Hyperlink"/>
+    <w:basedOn w:val="Fuentedeprrafopredeter"/>
+    <w:uiPriority w:val="99"/>
+    <w:unhideWhenUsed/>
+    <w:rsid w:val="009B65B5"/>
+    <w:rPr>
+      <w:color w:val="0000FF" w:themeColor="hyperlink"/>
+      <w:u w:val="single"/>
+    </w:rPr>
+  </w:style>
+  <w:style w:type="character" w:styleId="Mencinsinresolver">
+    <w:name w:val="Unresolved Mention"/>
+    <w:basedOn w:val="Fuentedeprrafopredeter"/>
+    <w:uiPriority w:val="99"/>
+    <w:semiHidden/>
+    <w:unhideWhenUsed/>
+    <w:rsid w:val="009B65B5"/>
+    <w:rPr>
+      <w:color w:val="605E5C"/>
+      <w:shd w:val="clear" w:color="auto" w:fill="E1DFDD"/>
+    </w:rPr>
+  </w:style>
+  <w:style w:type="paragraph" w:styleId="NormalWeb">
+    <w:name w:val="Normal (Web)"/>
+    <w:basedOn w:val="Normal"/>
+    <w:uiPriority w:val="99"/>
+    <w:semiHidden/>
+    <w:unhideWhenUsed/>
+    <w:rsid w:val="00D173B9"/>
+    <w:rPr>
+      <w:rFonts w:ascii="Times New Roman" w:hAnsi="Times New Roman" w:cs="Times New Roman"/>
+    </w:rPr>
+  </w:style>
+  <w:style w:type="paragraph" w:styleId="Prrafodelista">
+    <w:name w:val="List Paragraph"/>
+    <w:basedOn w:val="Normal"/>
+    <w:uiPriority w:val="34"/>
+    <w:qFormat/>
+    <w:rsid w:val="00D173B9"/>
+    <w:pPr>
+      <w:ind w:left="720"/>
+      <w:contextualSpacing/>
+    </w:pPr>
   </w:style>
 </w:styles>
 </file>
@@ -7339,6 +7725,10 @@
 </go:gDocsCustomXmlDataStorage>
 </file>
 
+<file path=customXml/item2.xml><?xml version="1.0" encoding="utf-8"?>
+<b:Sources xmlns:b="http://schemas.openxmlformats.org/officeDocument/2006/bibliography" xmlns="http://schemas.openxmlformats.org/officeDocument/2006/bibliography" SelectedStyle="\APASixthEditionOfficeOnline.xsl" StyleName="APA" Version="6"/>
+</file>
+
 <file path=customXml/itemProps1.xml><?xml version="1.0" encoding="utf-8"?>
 <ds:datastoreItem xmlns:ds="http://schemas.openxmlformats.org/officeDocument/2006/customXml" ds:itemID="{11111111-1234-1234-1234-123412341234}">
   <ds:schemaRefs>
@@ -7346,4 +7736,12 @@
     <ds:schemaRef ds:uri="http://schemas.openxmlformats.org/officeDocument/2006/relationships"/>
   </ds:schemaRefs>
 </ds:datastoreItem>
+</file>
+
+<file path=customXml/itemProps2.xml><?xml version="1.0" encoding="utf-8"?>
+<ds:datastoreItem xmlns:ds="http://schemas.openxmlformats.org/officeDocument/2006/customXml" ds:itemID="{0D619F72-32CF-4AC1-BB3D-C617A5489CDC}">
+  <ds:schemaRefs>
+    <ds:schemaRef ds:uri="http://schemas.openxmlformats.org/officeDocument/2006/bibliography"/>
+  </ds:schemaRefs>
+</ds:datastoreItem>
 </file>
</xml_diff>

<commit_message>
ORTOGRAFIA Y PORTADA CORREGIDA
</commit_message>
<xml_diff>
--- a/PROYECTO ING SOFTWARE PENDIENTE (1).docx
+++ b/PROYECTO ING SOFTWARE PENDIENTE (1).docx
@@ -423,7 +423,34 @@
           <w:sz w:val="32"/>
           <w:szCs w:val="32"/>
         </w:rPr>
-        <w:t>2025 - 2026</w:t>
+        <w:t>202</w:t>
+      </w:r>
+      <w:r>
+        <w:rPr>
+          <w:b/>
+          <w:bCs/>
+          <w:sz w:val="32"/>
+          <w:szCs w:val="32"/>
+        </w:rPr>
+        <w:t>6</w:t>
+      </w:r>
+      <w:r>
+        <w:rPr>
+          <w:b/>
+          <w:bCs/>
+          <w:sz w:val="32"/>
+          <w:szCs w:val="32"/>
+        </w:rPr>
+        <w:t xml:space="preserve"> - 202</w:t>
+      </w:r>
+      <w:r>
+        <w:rPr>
+          <w:b/>
+          <w:bCs/>
+          <w:sz w:val="32"/>
+          <w:szCs w:val="32"/>
+        </w:rPr>
+        <w:t>7</w:t>
       </w:r>
     </w:p>
     <w:p>
@@ -447,312 +474,1621 @@
           <w:szCs w:val="32"/>
         </w:rPr>
       </w:pPr>
-      <w:r>
-        <w:rPr>
-          <w:rFonts w:ascii="Calibri" w:eastAsia="Calibri" w:hAnsi="Calibri" w:cs="Calibri"/>
-          <w:color w:val="366091"/>
-          <w:sz w:val="32"/>
-          <w:szCs w:val="32"/>
-        </w:rPr>
-        <w:lastRenderedPageBreak/>
-        <w:t>Contenido</w:t>
-      </w:r>
     </w:p>
     <w:sdt>
       <w:sdtPr>
-        <w:id w:val="-1139492503"/>
+        <w:rPr>
+          <w:lang w:val="es-ES"/>
+        </w:rPr>
+        <w:id w:val="-993872453"/>
         <w:docPartObj>
           <w:docPartGallery w:val="Table of Contents"/>
           <w:docPartUnique/>
         </w:docPartObj>
       </w:sdtPr>
+      <w:sdtEndPr>
+        <w:rPr>
+          <w:rFonts w:ascii="Arial" w:eastAsia="Arial" w:hAnsi="Arial" w:cs="Arial"/>
+          <w:b/>
+          <w:bCs/>
+          <w:color w:val="auto"/>
+          <w:sz w:val="24"/>
+          <w:szCs w:val="24"/>
+        </w:rPr>
+      </w:sdtEndPr>
       <w:sdtContent>
         <w:p>
           <w:pPr>
-            <w:pBdr>
-              <w:top w:val="nil"/>
-              <w:left w:val="nil"/>
-              <w:bottom w:val="nil"/>
-              <w:right w:val="nil"/>
-              <w:between w:val="nil"/>
-            </w:pBdr>
+            <w:pStyle w:val="TtuloTDC"/>
+          </w:pPr>
+          <w:r>
+            <w:rPr>
+              <w:lang w:val="es-ES"/>
+            </w:rPr>
+            <w:t>Contenido</w:t>
+          </w:r>
+        </w:p>
+        <w:p>
+          <w:pPr>
+            <w:pStyle w:val="TDC1"/>
             <w:tabs>
-              <w:tab w:val="right" w:pos="9113"/>
+              <w:tab w:val="right" w:leader="dot" w:pos="9113"/>
             </w:tabs>
-            <w:spacing w:after="100"/>
             <w:rPr>
-              <w:rFonts w:ascii="Cambria" w:eastAsia="Cambria" w:hAnsi="Cambria" w:cs="Cambria"/>
-              <w:color w:val="000000"/>
+              <w:noProof/>
             </w:rPr>
           </w:pPr>
           <w:r>
             <w:fldChar w:fldCharType="begin"/>
           </w:r>
           <w:r>
-            <w:instrText xml:space="preserve"> TOC \h \u \z \t "Heading 1,1,Heading 2,2,Heading 3,3,"</w:instrText>
+            <w:instrText xml:space="preserve"> TOC \o "1-3" \h \z \u </w:instrText>
           </w:r>
           <w:r>
             <w:fldChar w:fldCharType="separate"/>
           </w:r>
-          <w:hyperlink w:anchor="_heading=h.mt3ziuhhwp5s">
-            <w:r>
-              <w:rPr>
-                <w:color w:val="000000"/>
+          <w:hyperlink w:anchor="_Toc235916838" w:history="1">
+            <w:r>
+              <w:rPr>
+                <w:rStyle w:val="Hipervnculo"/>
+                <w:noProof/>
               </w:rPr>
               <w:t>INTRODUCCIÓN</w:t>
             </w:r>
             <w:r>
               <w:rPr>
-                <w:color w:val="000000"/>
+                <w:noProof/>
+                <w:webHidden/>
               </w:rPr>
               <w:tab/>
+            </w:r>
+            <w:r>
+              <w:rPr>
+                <w:noProof/>
+                <w:webHidden/>
+              </w:rPr>
+              <w:fldChar w:fldCharType="begin"/>
+            </w:r>
+            <w:r>
+              <w:rPr>
+                <w:noProof/>
+                <w:webHidden/>
+              </w:rPr>
+              <w:instrText xml:space="preserve"> PAGEREF _Toc235916838 \h </w:instrText>
+            </w:r>
+            <w:r>
+              <w:rPr>
+                <w:noProof/>
+                <w:webHidden/>
+              </w:rPr>
+            </w:r>
+            <w:r>
+              <w:rPr>
+                <w:noProof/>
+                <w:webHidden/>
+              </w:rPr>
+              <w:fldChar w:fldCharType="separate"/>
+            </w:r>
+            <w:r>
+              <w:rPr>
+                <w:noProof/>
+                <w:webHidden/>
+              </w:rPr>
               <w:t>3</w:t>
+            </w:r>
+            <w:r>
+              <w:rPr>
+                <w:noProof/>
+                <w:webHidden/>
+              </w:rPr>
+              <w:fldChar w:fldCharType="end"/>
             </w:r>
           </w:hyperlink>
         </w:p>
         <w:p>
           <w:pPr>
-            <w:pBdr>
-              <w:top w:val="nil"/>
-              <w:left w:val="nil"/>
-              <w:bottom w:val="nil"/>
-              <w:right w:val="nil"/>
-              <w:between w:val="nil"/>
-            </w:pBdr>
+            <w:pStyle w:val="TDC1"/>
             <w:tabs>
-              <w:tab w:val="right" w:pos="9113"/>
+              <w:tab w:val="right" w:leader="dot" w:pos="9113"/>
             </w:tabs>
-            <w:spacing w:after="100"/>
             <w:rPr>
-              <w:rFonts w:ascii="Cambria" w:eastAsia="Cambria" w:hAnsi="Cambria" w:cs="Cambria"/>
-              <w:color w:val="000000"/>
+              <w:noProof/>
             </w:rPr>
           </w:pPr>
-          <w:hyperlink w:anchor="_heading=h.i1s7hci4my0o">
-            <w:r>
-              <w:rPr>
-                <w:color w:val="000000"/>
+          <w:hyperlink w:anchor="_Toc235916839" w:history="1">
+            <w:r>
+              <w:rPr>
+                <w:rStyle w:val="Hipervnculo"/>
+                <w:noProof/>
               </w:rPr>
               <w:t>JUSTIFICACIÒN</w:t>
             </w:r>
             <w:r>
               <w:rPr>
-                <w:color w:val="000000"/>
+                <w:noProof/>
+                <w:webHidden/>
               </w:rPr>
               <w:tab/>
+            </w:r>
+            <w:r>
+              <w:rPr>
+                <w:noProof/>
+                <w:webHidden/>
+              </w:rPr>
+              <w:fldChar w:fldCharType="begin"/>
+            </w:r>
+            <w:r>
+              <w:rPr>
+                <w:noProof/>
+                <w:webHidden/>
+              </w:rPr>
+              <w:instrText xml:space="preserve"> PAGEREF _Toc235916839 \h </w:instrText>
+            </w:r>
+            <w:r>
+              <w:rPr>
+                <w:noProof/>
+                <w:webHidden/>
+              </w:rPr>
+            </w:r>
+            <w:r>
+              <w:rPr>
+                <w:noProof/>
+                <w:webHidden/>
+              </w:rPr>
+              <w:fldChar w:fldCharType="separate"/>
+            </w:r>
+            <w:r>
+              <w:rPr>
+                <w:noProof/>
+                <w:webHidden/>
+              </w:rPr>
               <w:t>4</w:t>
+            </w:r>
+            <w:r>
+              <w:rPr>
+                <w:noProof/>
+                <w:webHidden/>
+              </w:rPr>
+              <w:fldChar w:fldCharType="end"/>
             </w:r>
           </w:hyperlink>
         </w:p>
         <w:p>
           <w:pPr>
-            <w:pBdr>
-              <w:top w:val="nil"/>
-              <w:left w:val="nil"/>
-              <w:bottom w:val="nil"/>
-              <w:right w:val="nil"/>
-              <w:between w:val="nil"/>
-            </w:pBdr>
+            <w:pStyle w:val="TDC1"/>
             <w:tabs>
-              <w:tab w:val="right" w:pos="9113"/>
+              <w:tab w:val="right" w:leader="dot" w:pos="9113"/>
             </w:tabs>
-            <w:spacing w:after="100"/>
             <w:rPr>
-              <w:rFonts w:ascii="Cambria" w:eastAsia="Cambria" w:hAnsi="Cambria" w:cs="Cambria"/>
-              <w:color w:val="000000"/>
+              <w:noProof/>
             </w:rPr>
           </w:pPr>
-          <w:hyperlink w:anchor="_heading=h.1clycumn3miq">
-            <w:r>
-              <w:rPr>
-                <w:color w:val="000000"/>
+          <w:hyperlink w:anchor="_Toc235916840" w:history="1">
+            <w:r>
+              <w:rPr>
+                <w:rStyle w:val="Hipervnculo"/>
+                <w:noProof/>
               </w:rPr>
               <w:t>OBJETIVOS</w:t>
             </w:r>
             <w:r>
               <w:rPr>
-                <w:color w:val="000000"/>
+                <w:noProof/>
+                <w:webHidden/>
               </w:rPr>
               <w:tab/>
+            </w:r>
+            <w:r>
+              <w:rPr>
+                <w:noProof/>
+                <w:webHidden/>
+              </w:rPr>
+              <w:fldChar w:fldCharType="begin"/>
+            </w:r>
+            <w:r>
+              <w:rPr>
+                <w:noProof/>
+                <w:webHidden/>
+              </w:rPr>
+              <w:instrText xml:space="preserve"> PAGEREF _Toc235916840 \h </w:instrText>
+            </w:r>
+            <w:r>
+              <w:rPr>
+                <w:noProof/>
+                <w:webHidden/>
+              </w:rPr>
+            </w:r>
+            <w:r>
+              <w:rPr>
+                <w:noProof/>
+                <w:webHidden/>
+              </w:rPr>
+              <w:fldChar w:fldCharType="separate"/>
+            </w:r>
+            <w:r>
+              <w:rPr>
+                <w:noProof/>
+                <w:webHidden/>
+              </w:rPr>
               <w:t>5</w:t>
+            </w:r>
+            <w:r>
+              <w:rPr>
+                <w:noProof/>
+                <w:webHidden/>
+              </w:rPr>
+              <w:fldChar w:fldCharType="end"/>
             </w:r>
           </w:hyperlink>
         </w:p>
         <w:p>
           <w:pPr>
-            <w:pBdr>
-              <w:top w:val="nil"/>
-              <w:left w:val="nil"/>
-              <w:bottom w:val="nil"/>
-              <w:right w:val="nil"/>
-              <w:between w:val="nil"/>
-            </w:pBdr>
+            <w:pStyle w:val="TDC2"/>
             <w:tabs>
-              <w:tab w:val="right" w:pos="9113"/>
+              <w:tab w:val="right" w:leader="dot" w:pos="9113"/>
             </w:tabs>
-            <w:spacing w:after="100"/>
-            <w:ind w:left="240" w:firstLine="480"/>
             <w:rPr>
-              <w:rFonts w:ascii="Cambria" w:eastAsia="Cambria" w:hAnsi="Cambria" w:cs="Cambria"/>
-              <w:color w:val="000000"/>
+              <w:noProof/>
             </w:rPr>
           </w:pPr>
-          <w:hyperlink w:anchor="_heading=h.e8ulcpep5ahe">
-            <w:r>
-              <w:rPr>
-                <w:color w:val="000000"/>
+          <w:hyperlink w:anchor="_Toc235916841" w:history="1">
+            <w:r>
+              <w:rPr>
+                <w:rStyle w:val="Hipervnculo"/>
+                <w:noProof/>
               </w:rPr>
               <w:t>Objetivo general</w:t>
             </w:r>
             <w:r>
               <w:rPr>
-                <w:color w:val="000000"/>
+                <w:noProof/>
+                <w:webHidden/>
               </w:rPr>
               <w:tab/>
+            </w:r>
+            <w:r>
+              <w:rPr>
+                <w:noProof/>
+                <w:webHidden/>
+              </w:rPr>
+              <w:fldChar w:fldCharType="begin"/>
+            </w:r>
+            <w:r>
+              <w:rPr>
+                <w:noProof/>
+                <w:webHidden/>
+              </w:rPr>
+              <w:instrText xml:space="preserve"> PAGEREF _Toc235916841 \h </w:instrText>
+            </w:r>
+            <w:r>
+              <w:rPr>
+                <w:noProof/>
+                <w:webHidden/>
+              </w:rPr>
+            </w:r>
+            <w:r>
+              <w:rPr>
+                <w:noProof/>
+                <w:webHidden/>
+              </w:rPr>
+              <w:fldChar w:fldCharType="separate"/>
+            </w:r>
+            <w:r>
+              <w:rPr>
+                <w:noProof/>
+                <w:webHidden/>
+              </w:rPr>
               <w:t>5</w:t>
+            </w:r>
+            <w:r>
+              <w:rPr>
+                <w:noProof/>
+                <w:webHidden/>
+              </w:rPr>
+              <w:fldChar w:fldCharType="end"/>
             </w:r>
           </w:hyperlink>
         </w:p>
         <w:p>
           <w:pPr>
-            <w:pBdr>
-              <w:top w:val="nil"/>
-              <w:left w:val="nil"/>
-              <w:bottom w:val="nil"/>
-              <w:right w:val="nil"/>
-              <w:between w:val="nil"/>
-            </w:pBdr>
+            <w:pStyle w:val="TDC2"/>
             <w:tabs>
-              <w:tab w:val="right" w:pos="9113"/>
+              <w:tab w:val="right" w:leader="dot" w:pos="9113"/>
             </w:tabs>
-            <w:spacing w:after="100"/>
-            <w:ind w:left="240" w:firstLine="480"/>
             <w:rPr>
-              <w:rFonts w:ascii="Cambria" w:eastAsia="Cambria" w:hAnsi="Cambria" w:cs="Cambria"/>
-              <w:color w:val="000000"/>
+              <w:noProof/>
             </w:rPr>
           </w:pPr>
-          <w:hyperlink w:anchor="_heading=h.ifcilk5rv898">
-            <w:r>
-              <w:rPr>
-                <w:color w:val="000000"/>
+          <w:hyperlink w:anchor="_Toc235916842" w:history="1">
+            <w:r>
+              <w:rPr>
+                <w:rStyle w:val="Hipervnculo"/>
+                <w:noProof/>
               </w:rPr>
               <w:t>Objetivos Específicos</w:t>
             </w:r>
             <w:r>
               <w:rPr>
-                <w:color w:val="000000"/>
+                <w:noProof/>
+                <w:webHidden/>
               </w:rPr>
               <w:tab/>
+            </w:r>
+            <w:r>
+              <w:rPr>
+                <w:noProof/>
+                <w:webHidden/>
+              </w:rPr>
+              <w:fldChar w:fldCharType="begin"/>
+            </w:r>
+            <w:r>
+              <w:rPr>
+                <w:noProof/>
+                <w:webHidden/>
+              </w:rPr>
+              <w:instrText xml:space="preserve"> PAGEREF _Toc235916842 \h </w:instrText>
+            </w:r>
+            <w:r>
+              <w:rPr>
+                <w:noProof/>
+                <w:webHidden/>
+              </w:rPr>
+            </w:r>
+            <w:r>
+              <w:rPr>
+                <w:noProof/>
+                <w:webHidden/>
+              </w:rPr>
+              <w:fldChar w:fldCharType="separate"/>
+            </w:r>
+            <w:r>
+              <w:rPr>
+                <w:noProof/>
+                <w:webHidden/>
+              </w:rPr>
               <w:t>5</w:t>
+            </w:r>
+            <w:r>
+              <w:rPr>
+                <w:noProof/>
+                <w:webHidden/>
+              </w:rPr>
+              <w:fldChar w:fldCharType="end"/>
             </w:r>
           </w:hyperlink>
         </w:p>
         <w:p>
           <w:pPr>
-            <w:pBdr>
-              <w:top w:val="nil"/>
-              <w:left w:val="nil"/>
-              <w:bottom w:val="nil"/>
-              <w:right w:val="nil"/>
-              <w:between w:val="nil"/>
-            </w:pBdr>
+            <w:pStyle w:val="TDC1"/>
             <w:tabs>
-              <w:tab w:val="right" w:pos="9113"/>
+              <w:tab w:val="right" w:leader="dot" w:pos="9113"/>
             </w:tabs>
-            <w:spacing w:after="100"/>
             <w:rPr>
-              <w:rFonts w:ascii="Cambria" w:eastAsia="Cambria" w:hAnsi="Cambria" w:cs="Cambria"/>
-              <w:color w:val="000000"/>
+              <w:noProof/>
             </w:rPr>
           </w:pPr>
-          <w:hyperlink w:anchor="_heading=h.c26okourk7gf">
-            <w:r>
-              <w:rPr>
-                <w:color w:val="000000"/>
+          <w:hyperlink w:anchor="_Toc235916843" w:history="1">
+            <w:r>
+              <w:rPr>
+                <w:rStyle w:val="Hipervnculo"/>
+                <w:noProof/>
               </w:rPr>
               <w:t>ALCANCE</w:t>
             </w:r>
             <w:r>
               <w:rPr>
-                <w:color w:val="000000"/>
+                <w:noProof/>
+                <w:webHidden/>
               </w:rPr>
               <w:tab/>
+            </w:r>
+            <w:r>
+              <w:rPr>
+                <w:noProof/>
+                <w:webHidden/>
+              </w:rPr>
+              <w:fldChar w:fldCharType="begin"/>
+            </w:r>
+            <w:r>
+              <w:rPr>
+                <w:noProof/>
+                <w:webHidden/>
+              </w:rPr>
+              <w:instrText xml:space="preserve"> PAGEREF _Toc235916843 \h </w:instrText>
+            </w:r>
+            <w:r>
+              <w:rPr>
+                <w:noProof/>
+                <w:webHidden/>
+              </w:rPr>
+            </w:r>
+            <w:r>
+              <w:rPr>
+                <w:noProof/>
+                <w:webHidden/>
+              </w:rPr>
+              <w:fldChar w:fldCharType="separate"/>
+            </w:r>
+            <w:r>
+              <w:rPr>
+                <w:noProof/>
+                <w:webHidden/>
+              </w:rPr>
               <w:t>6</w:t>
+            </w:r>
+            <w:r>
+              <w:rPr>
+                <w:noProof/>
+                <w:webHidden/>
+              </w:rPr>
+              <w:fldChar w:fldCharType="end"/>
             </w:r>
           </w:hyperlink>
         </w:p>
         <w:p>
           <w:pPr>
-            <w:pBdr>
-              <w:top w:val="nil"/>
-              <w:left w:val="nil"/>
-              <w:bottom w:val="nil"/>
-              <w:right w:val="nil"/>
-              <w:between w:val="nil"/>
-            </w:pBdr>
+            <w:pStyle w:val="TDC1"/>
             <w:tabs>
-              <w:tab w:val="right" w:pos="9113"/>
+              <w:tab w:val="right" w:leader="dot" w:pos="9113"/>
             </w:tabs>
-            <w:spacing w:after="100"/>
             <w:rPr>
-              <w:rFonts w:ascii="Cambria" w:eastAsia="Cambria" w:hAnsi="Cambria" w:cs="Cambria"/>
-              <w:color w:val="000000"/>
+              <w:noProof/>
             </w:rPr>
           </w:pPr>
-          <w:hyperlink w:anchor="_heading=h.vpogy7xkt9o5">
-            <w:r>
-              <w:rPr>
-                <w:color w:val="000000"/>
+          <w:hyperlink w:anchor="_Toc235916844" w:history="1">
+            <w:r>
+              <w:rPr>
+                <w:rStyle w:val="Hipervnculo"/>
+                <w:noProof/>
               </w:rPr>
               <w:t>MARCO TEÓRICO</w:t>
             </w:r>
             <w:r>
               <w:rPr>
-                <w:color w:val="000000"/>
+                <w:noProof/>
+                <w:webHidden/>
               </w:rPr>
               <w:tab/>
+            </w:r>
+            <w:r>
+              <w:rPr>
+                <w:noProof/>
+                <w:webHidden/>
+              </w:rPr>
+              <w:fldChar w:fldCharType="begin"/>
+            </w:r>
+            <w:r>
+              <w:rPr>
+                <w:noProof/>
+                <w:webHidden/>
+              </w:rPr>
+              <w:instrText xml:space="preserve"> PAGEREF _Toc235916844 \h </w:instrText>
+            </w:r>
+            <w:r>
+              <w:rPr>
+                <w:noProof/>
+                <w:webHidden/>
+              </w:rPr>
+            </w:r>
+            <w:r>
+              <w:rPr>
+                <w:noProof/>
+                <w:webHidden/>
+              </w:rPr>
+              <w:fldChar w:fldCharType="separate"/>
+            </w:r>
+            <w:r>
+              <w:rPr>
+                <w:noProof/>
+                <w:webHidden/>
+              </w:rPr>
               <w:t>7</w:t>
+            </w:r>
+            <w:r>
+              <w:rPr>
+                <w:noProof/>
+                <w:webHidden/>
+              </w:rPr>
+              <w:fldChar w:fldCharType="end"/>
             </w:r>
           </w:hyperlink>
         </w:p>
         <w:p>
           <w:pPr>
-            <w:pBdr>
-              <w:top w:val="nil"/>
-              <w:left w:val="nil"/>
-              <w:bottom w:val="nil"/>
-              <w:right w:val="nil"/>
-              <w:between w:val="nil"/>
-            </w:pBdr>
+            <w:pStyle w:val="TDC1"/>
             <w:tabs>
-              <w:tab w:val="right" w:pos="9113"/>
+              <w:tab w:val="right" w:leader="dot" w:pos="9113"/>
             </w:tabs>
-            <w:spacing w:after="100"/>
-            <w:ind w:left="240" w:firstLine="480"/>
             <w:rPr>
-              <w:rFonts w:ascii="Cambria" w:eastAsia="Cambria" w:hAnsi="Cambria" w:cs="Cambria"/>
-              <w:color w:val="000000"/>
+              <w:noProof/>
             </w:rPr>
           </w:pPr>
-          <w:hyperlink w:anchor="_heading=h.gcdeu4mc4gw2">
-            <w:r>
-              <w:rPr>
-                <w:color w:val="000000"/>
-              </w:rPr>
-              <w:t>Antecedentes de la investigación</w:t>
-            </w:r>
-            <w:r>
-              <w:rPr>
-                <w:color w:val="000000"/>
+          <w:hyperlink w:anchor="_Toc235916845" w:history="1">
+            <w:r>
+              <w:rPr>
+                <w:rStyle w:val="Hipervnculo"/>
+                <w:noProof/>
+              </w:rPr>
+              <w:t>Ingeniería de requerimientos</w:t>
+            </w:r>
+            <w:r>
+              <w:rPr>
+                <w:noProof/>
+                <w:webHidden/>
               </w:rPr>
               <w:tab/>
-              <w:t>7</w:t>
+            </w:r>
+            <w:r>
+              <w:rPr>
+                <w:noProof/>
+                <w:webHidden/>
+              </w:rPr>
+              <w:fldChar w:fldCharType="begin"/>
+            </w:r>
+            <w:r>
+              <w:rPr>
+                <w:noProof/>
+                <w:webHidden/>
+              </w:rPr>
+              <w:instrText xml:space="preserve"> PAGEREF _Toc235916845 \h </w:instrText>
+            </w:r>
+            <w:r>
+              <w:rPr>
+                <w:noProof/>
+                <w:webHidden/>
+              </w:rPr>
+            </w:r>
+            <w:r>
+              <w:rPr>
+                <w:noProof/>
+                <w:webHidden/>
+              </w:rPr>
+              <w:fldChar w:fldCharType="separate"/>
+            </w:r>
+            <w:r>
+              <w:rPr>
+                <w:noProof/>
+                <w:webHidden/>
+              </w:rPr>
+              <w:t>10</w:t>
+            </w:r>
+            <w:r>
+              <w:rPr>
+                <w:noProof/>
+                <w:webHidden/>
+              </w:rPr>
+              <w:fldChar w:fldCharType="end"/>
+            </w:r>
+          </w:hyperlink>
+        </w:p>
+        <w:p>
+          <w:pPr>
+            <w:pStyle w:val="TDC2"/>
+            <w:tabs>
+              <w:tab w:val="right" w:leader="dot" w:pos="9113"/>
+            </w:tabs>
+            <w:rPr>
+              <w:noProof/>
+            </w:rPr>
+          </w:pPr>
+          <w:hyperlink w:anchor="_Toc235916846" w:history="1">
+            <w:r>
+              <w:rPr>
+                <w:rStyle w:val="Hipervnculo"/>
+                <w:noProof/>
+              </w:rPr>
+              <w:t>Proceso de levantamiento y técnicas aplicadas</w:t>
+            </w:r>
+            <w:r>
+              <w:rPr>
+                <w:noProof/>
+                <w:webHidden/>
+              </w:rPr>
+              <w:tab/>
+            </w:r>
+            <w:r>
+              <w:rPr>
+                <w:noProof/>
+                <w:webHidden/>
+              </w:rPr>
+              <w:fldChar w:fldCharType="begin"/>
+            </w:r>
+            <w:r>
+              <w:rPr>
+                <w:noProof/>
+                <w:webHidden/>
+              </w:rPr>
+              <w:instrText xml:space="preserve"> PAGEREF _Toc235916846 \h </w:instrText>
+            </w:r>
+            <w:r>
+              <w:rPr>
+                <w:noProof/>
+                <w:webHidden/>
+              </w:rPr>
+            </w:r>
+            <w:r>
+              <w:rPr>
+                <w:noProof/>
+                <w:webHidden/>
+              </w:rPr>
+              <w:fldChar w:fldCharType="separate"/>
+            </w:r>
+            <w:r>
+              <w:rPr>
+                <w:noProof/>
+                <w:webHidden/>
+              </w:rPr>
+              <w:t>10</w:t>
+            </w:r>
+            <w:r>
+              <w:rPr>
+                <w:noProof/>
+                <w:webHidden/>
+              </w:rPr>
+              <w:fldChar w:fldCharType="end"/>
+            </w:r>
+          </w:hyperlink>
+        </w:p>
+        <w:p>
+          <w:pPr>
+            <w:pStyle w:val="TDC2"/>
+            <w:tabs>
+              <w:tab w:val="right" w:leader="dot" w:pos="9113"/>
+            </w:tabs>
+            <w:rPr>
+              <w:noProof/>
+            </w:rPr>
+          </w:pPr>
+          <w:hyperlink w:anchor="_Toc235916847" w:history="1">
+            <w:r>
+              <w:rPr>
+                <w:rStyle w:val="Hipervnculo"/>
+                <w:noProof/>
+              </w:rPr>
+              <w:t>Clasificación de Requerimientos</w:t>
+            </w:r>
+            <w:r>
+              <w:rPr>
+                <w:noProof/>
+                <w:webHidden/>
+              </w:rPr>
+              <w:tab/>
+            </w:r>
+            <w:r>
+              <w:rPr>
+                <w:noProof/>
+                <w:webHidden/>
+              </w:rPr>
+              <w:fldChar w:fldCharType="begin"/>
+            </w:r>
+            <w:r>
+              <w:rPr>
+                <w:noProof/>
+                <w:webHidden/>
+              </w:rPr>
+              <w:instrText xml:space="preserve"> PAGEREF _Toc235916847 \h </w:instrText>
+            </w:r>
+            <w:r>
+              <w:rPr>
+                <w:noProof/>
+                <w:webHidden/>
+              </w:rPr>
+            </w:r>
+            <w:r>
+              <w:rPr>
+                <w:noProof/>
+                <w:webHidden/>
+              </w:rPr>
+              <w:fldChar w:fldCharType="separate"/>
+            </w:r>
+            <w:r>
+              <w:rPr>
+                <w:noProof/>
+                <w:webHidden/>
+              </w:rPr>
+              <w:t>11</w:t>
+            </w:r>
+            <w:r>
+              <w:rPr>
+                <w:noProof/>
+                <w:webHidden/>
+              </w:rPr>
+              <w:fldChar w:fldCharType="end"/>
+            </w:r>
+          </w:hyperlink>
+        </w:p>
+        <w:p>
+          <w:pPr>
+            <w:pStyle w:val="TDC2"/>
+            <w:tabs>
+              <w:tab w:val="right" w:leader="dot" w:pos="9113"/>
+            </w:tabs>
+            <w:rPr>
+              <w:noProof/>
+            </w:rPr>
+          </w:pPr>
+          <w:hyperlink w:anchor="_Toc235916848" w:history="1">
+            <w:r>
+              <w:rPr>
+                <w:rStyle w:val="Hipervnculo"/>
+                <w:noProof/>
+              </w:rPr>
+              <w:t>Implementación</w:t>
+            </w:r>
+            <w:r>
+              <w:rPr>
+                <w:noProof/>
+                <w:webHidden/>
+              </w:rPr>
+              <w:tab/>
+            </w:r>
+            <w:r>
+              <w:rPr>
+                <w:noProof/>
+                <w:webHidden/>
+              </w:rPr>
+              <w:fldChar w:fldCharType="begin"/>
+            </w:r>
+            <w:r>
+              <w:rPr>
+                <w:noProof/>
+                <w:webHidden/>
+              </w:rPr>
+              <w:instrText xml:space="preserve"> PAGEREF _Toc235916848 \h </w:instrText>
+            </w:r>
+            <w:r>
+              <w:rPr>
+                <w:noProof/>
+                <w:webHidden/>
+              </w:rPr>
+            </w:r>
+            <w:r>
+              <w:rPr>
+                <w:noProof/>
+                <w:webHidden/>
+              </w:rPr>
+              <w:fldChar w:fldCharType="separate"/>
+            </w:r>
+            <w:r>
+              <w:rPr>
+                <w:noProof/>
+                <w:webHidden/>
+              </w:rPr>
+              <w:t>13</w:t>
+            </w:r>
+            <w:r>
+              <w:rPr>
+                <w:noProof/>
+                <w:webHidden/>
+              </w:rPr>
+              <w:fldChar w:fldCharType="end"/>
+            </w:r>
+          </w:hyperlink>
+        </w:p>
+        <w:p>
+          <w:pPr>
+            <w:pStyle w:val="TDC2"/>
+            <w:tabs>
+              <w:tab w:val="right" w:leader="dot" w:pos="9113"/>
+            </w:tabs>
+            <w:rPr>
+              <w:noProof/>
+            </w:rPr>
+          </w:pPr>
+          <w:hyperlink w:anchor="_Toc235916849" w:history="1">
+            <w:r>
+              <w:rPr>
+                <w:rStyle w:val="Hipervnculo"/>
+                <w:noProof/>
+              </w:rPr>
+              <w:t>Despliegue de la Interfaz de Usuaria (UI)</w:t>
+            </w:r>
+            <w:r>
+              <w:rPr>
+                <w:noProof/>
+                <w:webHidden/>
+              </w:rPr>
+              <w:tab/>
+            </w:r>
+            <w:r>
+              <w:rPr>
+                <w:noProof/>
+                <w:webHidden/>
+              </w:rPr>
+              <w:fldChar w:fldCharType="begin"/>
+            </w:r>
+            <w:r>
+              <w:rPr>
+                <w:noProof/>
+                <w:webHidden/>
+              </w:rPr>
+              <w:instrText xml:space="preserve"> PAGEREF _Toc235916849 \h </w:instrText>
+            </w:r>
+            <w:r>
+              <w:rPr>
+                <w:noProof/>
+                <w:webHidden/>
+              </w:rPr>
+            </w:r>
+            <w:r>
+              <w:rPr>
+                <w:noProof/>
+                <w:webHidden/>
+              </w:rPr>
+              <w:fldChar w:fldCharType="separate"/>
+            </w:r>
+            <w:r>
+              <w:rPr>
+                <w:noProof/>
+                <w:webHidden/>
+              </w:rPr>
+              <w:t>14</w:t>
+            </w:r>
+            <w:r>
+              <w:rPr>
+                <w:noProof/>
+                <w:webHidden/>
+              </w:rPr>
+              <w:fldChar w:fldCharType="end"/>
+            </w:r>
+          </w:hyperlink>
+        </w:p>
+        <w:p>
+          <w:pPr>
+            <w:pStyle w:val="TDC1"/>
+            <w:tabs>
+              <w:tab w:val="right" w:leader="dot" w:pos="9113"/>
+            </w:tabs>
+            <w:rPr>
+              <w:noProof/>
+            </w:rPr>
+          </w:pPr>
+          <w:hyperlink w:anchor="_Toc235916850" w:history="1">
+            <w:r>
+              <w:rPr>
+                <w:rStyle w:val="Hipervnculo"/>
+                <w:noProof/>
+              </w:rPr>
+              <w:t>MANUAL DE USUARIO</w:t>
+            </w:r>
+            <w:r>
+              <w:rPr>
+                <w:noProof/>
+                <w:webHidden/>
+              </w:rPr>
+              <w:tab/>
+            </w:r>
+            <w:r>
+              <w:rPr>
+                <w:noProof/>
+                <w:webHidden/>
+              </w:rPr>
+              <w:fldChar w:fldCharType="begin"/>
+            </w:r>
+            <w:r>
+              <w:rPr>
+                <w:noProof/>
+                <w:webHidden/>
+              </w:rPr>
+              <w:instrText xml:space="preserve"> PAGEREF _Toc235916850 \h </w:instrText>
+            </w:r>
+            <w:r>
+              <w:rPr>
+                <w:noProof/>
+                <w:webHidden/>
+              </w:rPr>
+            </w:r>
+            <w:r>
+              <w:rPr>
+                <w:noProof/>
+                <w:webHidden/>
+              </w:rPr>
+              <w:fldChar w:fldCharType="separate"/>
+            </w:r>
+            <w:r>
+              <w:rPr>
+                <w:noProof/>
+                <w:webHidden/>
+              </w:rPr>
+              <w:t>15</w:t>
+            </w:r>
+            <w:r>
+              <w:rPr>
+                <w:noProof/>
+                <w:webHidden/>
+              </w:rPr>
+              <w:fldChar w:fldCharType="end"/>
+            </w:r>
+          </w:hyperlink>
+        </w:p>
+        <w:p>
+          <w:pPr>
+            <w:pStyle w:val="TDC1"/>
+            <w:tabs>
+              <w:tab w:val="right" w:leader="dot" w:pos="9113"/>
+            </w:tabs>
+            <w:rPr>
+              <w:noProof/>
+            </w:rPr>
+          </w:pPr>
+          <w:hyperlink w:anchor="_Toc235916851" w:history="1">
+            <w:r>
+              <w:rPr>
+                <w:rStyle w:val="Hipervnculo"/>
+                <w:noProof/>
+              </w:rPr>
+              <w:t>EVIDENCIA DE VALIDACIÓN CON LOS INTERESADOS</w:t>
+            </w:r>
+            <w:r>
+              <w:rPr>
+                <w:noProof/>
+                <w:webHidden/>
+              </w:rPr>
+              <w:tab/>
+            </w:r>
+            <w:r>
+              <w:rPr>
+                <w:noProof/>
+                <w:webHidden/>
+              </w:rPr>
+              <w:fldChar w:fldCharType="begin"/>
+            </w:r>
+            <w:r>
+              <w:rPr>
+                <w:noProof/>
+                <w:webHidden/>
+              </w:rPr>
+              <w:instrText xml:space="preserve"> PAGEREF _Toc235916851 \h </w:instrText>
+            </w:r>
+            <w:r>
+              <w:rPr>
+                <w:noProof/>
+                <w:webHidden/>
+              </w:rPr>
+            </w:r>
+            <w:r>
+              <w:rPr>
+                <w:noProof/>
+                <w:webHidden/>
+              </w:rPr>
+              <w:fldChar w:fldCharType="separate"/>
+            </w:r>
+            <w:r>
+              <w:rPr>
+                <w:noProof/>
+                <w:webHidden/>
+              </w:rPr>
+              <w:t>15</w:t>
+            </w:r>
+            <w:r>
+              <w:rPr>
+                <w:noProof/>
+                <w:webHidden/>
+              </w:rPr>
+              <w:fldChar w:fldCharType="end"/>
+            </w:r>
+          </w:hyperlink>
+        </w:p>
+        <w:p>
+          <w:pPr>
+            <w:pStyle w:val="TDC2"/>
+            <w:tabs>
+              <w:tab w:val="right" w:leader="dot" w:pos="9113"/>
+            </w:tabs>
+            <w:rPr>
+              <w:noProof/>
+            </w:rPr>
+          </w:pPr>
+          <w:hyperlink w:anchor="_Toc235916852" w:history="1">
+            <w:r>
+              <w:rPr>
+                <w:rStyle w:val="Hipervnculo"/>
+                <w:noProof/>
+              </w:rPr>
+              <w:t>Mecanismo de Gestión de Cambios de Requerimientos</w:t>
+            </w:r>
+            <w:r>
+              <w:rPr>
+                <w:noProof/>
+                <w:webHidden/>
+              </w:rPr>
+              <w:tab/>
+            </w:r>
+            <w:r>
+              <w:rPr>
+                <w:noProof/>
+                <w:webHidden/>
+              </w:rPr>
+              <w:fldChar w:fldCharType="begin"/>
+            </w:r>
+            <w:r>
+              <w:rPr>
+                <w:noProof/>
+                <w:webHidden/>
+              </w:rPr>
+              <w:instrText xml:space="preserve"> PAGEREF _Toc235916852 \h </w:instrText>
+            </w:r>
+            <w:r>
+              <w:rPr>
+                <w:noProof/>
+                <w:webHidden/>
+              </w:rPr>
+            </w:r>
+            <w:r>
+              <w:rPr>
+                <w:noProof/>
+                <w:webHidden/>
+              </w:rPr>
+              <w:fldChar w:fldCharType="separate"/>
+            </w:r>
+            <w:r>
+              <w:rPr>
+                <w:noProof/>
+                <w:webHidden/>
+              </w:rPr>
+              <w:t>16</w:t>
+            </w:r>
+            <w:r>
+              <w:rPr>
+                <w:noProof/>
+                <w:webHidden/>
+              </w:rPr>
+              <w:fldChar w:fldCharType="end"/>
+            </w:r>
+          </w:hyperlink>
+        </w:p>
+        <w:p>
+          <w:pPr>
+            <w:pStyle w:val="TDC1"/>
+            <w:tabs>
+              <w:tab w:val="right" w:leader="dot" w:pos="9113"/>
+            </w:tabs>
+            <w:rPr>
+              <w:noProof/>
+            </w:rPr>
+          </w:pPr>
+          <w:hyperlink w:anchor="_Toc235916853" w:history="1">
+            <w:r>
+              <w:rPr>
+                <w:rStyle w:val="Hipervnculo"/>
+                <w:noProof/>
+              </w:rPr>
+              <w:t>ESTRUCTURA DE DESGLOSE DEL TRABAJO (EDT/WBS)</w:t>
+            </w:r>
+            <w:r>
+              <w:rPr>
+                <w:noProof/>
+                <w:webHidden/>
+              </w:rPr>
+              <w:tab/>
+            </w:r>
+            <w:r>
+              <w:rPr>
+                <w:noProof/>
+                <w:webHidden/>
+              </w:rPr>
+              <w:fldChar w:fldCharType="begin"/>
+            </w:r>
+            <w:r>
+              <w:rPr>
+                <w:noProof/>
+                <w:webHidden/>
+              </w:rPr>
+              <w:instrText xml:space="preserve"> PAGEREF _Toc235916853 \h </w:instrText>
+            </w:r>
+            <w:r>
+              <w:rPr>
+                <w:noProof/>
+                <w:webHidden/>
+              </w:rPr>
+            </w:r>
+            <w:r>
+              <w:rPr>
+                <w:noProof/>
+                <w:webHidden/>
+              </w:rPr>
+              <w:fldChar w:fldCharType="separate"/>
+            </w:r>
+            <w:r>
+              <w:rPr>
+                <w:noProof/>
+                <w:webHidden/>
+              </w:rPr>
+              <w:t>16</w:t>
+            </w:r>
+            <w:r>
+              <w:rPr>
+                <w:noProof/>
+                <w:webHidden/>
+              </w:rPr>
+              <w:fldChar w:fldCharType="end"/>
+            </w:r>
+          </w:hyperlink>
+        </w:p>
+        <w:p>
+          <w:pPr>
+            <w:pStyle w:val="TDC1"/>
+            <w:tabs>
+              <w:tab w:val="right" w:leader="dot" w:pos="9113"/>
+            </w:tabs>
+            <w:rPr>
+              <w:noProof/>
+            </w:rPr>
+          </w:pPr>
+          <w:hyperlink w:anchor="_Toc235916854" w:history="1">
+            <w:r>
+              <w:rPr>
+                <w:rStyle w:val="Hipervnculo"/>
+                <w:noProof/>
+              </w:rPr>
+              <w:t>MATRIZ DE GESTIÓN DE RIESGOS</w:t>
+            </w:r>
+            <w:r>
+              <w:rPr>
+                <w:noProof/>
+                <w:webHidden/>
+              </w:rPr>
+              <w:tab/>
+            </w:r>
+            <w:r>
+              <w:rPr>
+                <w:noProof/>
+                <w:webHidden/>
+              </w:rPr>
+              <w:fldChar w:fldCharType="begin"/>
+            </w:r>
+            <w:r>
+              <w:rPr>
+                <w:noProof/>
+                <w:webHidden/>
+              </w:rPr>
+              <w:instrText xml:space="preserve"> PAGEREF _Toc235916854 \h </w:instrText>
+            </w:r>
+            <w:r>
+              <w:rPr>
+                <w:noProof/>
+                <w:webHidden/>
+              </w:rPr>
+            </w:r>
+            <w:r>
+              <w:rPr>
+                <w:noProof/>
+                <w:webHidden/>
+              </w:rPr>
+              <w:fldChar w:fldCharType="separate"/>
+            </w:r>
+            <w:r>
+              <w:rPr>
+                <w:noProof/>
+                <w:webHidden/>
+              </w:rPr>
+              <w:t>17</w:t>
+            </w:r>
+            <w:r>
+              <w:rPr>
+                <w:noProof/>
+                <w:webHidden/>
+              </w:rPr>
+              <w:fldChar w:fldCharType="end"/>
+            </w:r>
+          </w:hyperlink>
+        </w:p>
+        <w:p>
+          <w:pPr>
+            <w:pStyle w:val="TDC1"/>
+            <w:tabs>
+              <w:tab w:val="right" w:leader="dot" w:pos="9113"/>
+            </w:tabs>
+            <w:rPr>
+              <w:noProof/>
+            </w:rPr>
+          </w:pPr>
+          <w:hyperlink w:anchor="_Toc235916855" w:history="1">
+            <w:r>
+              <w:rPr>
+                <w:rStyle w:val="Hipervnculo"/>
+                <w:noProof/>
+              </w:rPr>
+              <w:t>CONCLUSION</w:t>
+            </w:r>
+            <w:r>
+              <w:rPr>
+                <w:noProof/>
+                <w:webHidden/>
+              </w:rPr>
+              <w:tab/>
+            </w:r>
+            <w:r>
+              <w:rPr>
+                <w:noProof/>
+                <w:webHidden/>
+              </w:rPr>
+              <w:fldChar w:fldCharType="begin"/>
+            </w:r>
+            <w:r>
+              <w:rPr>
+                <w:noProof/>
+                <w:webHidden/>
+              </w:rPr>
+              <w:instrText xml:space="preserve"> PAGEREF _Toc235916855 \h </w:instrText>
+            </w:r>
+            <w:r>
+              <w:rPr>
+                <w:noProof/>
+                <w:webHidden/>
+              </w:rPr>
+            </w:r>
+            <w:r>
+              <w:rPr>
+                <w:noProof/>
+                <w:webHidden/>
+              </w:rPr>
+              <w:fldChar w:fldCharType="separate"/>
+            </w:r>
+            <w:r>
+              <w:rPr>
+                <w:noProof/>
+                <w:webHidden/>
+              </w:rPr>
+              <w:t>18</w:t>
+            </w:r>
+            <w:r>
+              <w:rPr>
+                <w:noProof/>
+                <w:webHidden/>
+              </w:rPr>
+              <w:fldChar w:fldCharType="end"/>
+            </w:r>
+          </w:hyperlink>
+        </w:p>
+        <w:p>
+          <w:pPr>
+            <w:pStyle w:val="TDC1"/>
+            <w:tabs>
+              <w:tab w:val="right" w:leader="dot" w:pos="9113"/>
+            </w:tabs>
+            <w:rPr>
+              <w:noProof/>
+            </w:rPr>
+          </w:pPr>
+          <w:hyperlink w:anchor="_Toc235916856" w:history="1">
+            <w:r>
+              <w:rPr>
+                <w:rStyle w:val="Hipervnculo"/>
+                <w:noProof/>
+              </w:rPr>
+              <w:t>HERRAMIENTAS</w:t>
+            </w:r>
+            <w:r>
+              <w:rPr>
+                <w:noProof/>
+                <w:webHidden/>
+              </w:rPr>
+              <w:tab/>
+            </w:r>
+            <w:r>
+              <w:rPr>
+                <w:noProof/>
+                <w:webHidden/>
+              </w:rPr>
+              <w:fldChar w:fldCharType="begin"/>
+            </w:r>
+            <w:r>
+              <w:rPr>
+                <w:noProof/>
+                <w:webHidden/>
+              </w:rPr>
+              <w:instrText xml:space="preserve"> PAGEREF _Toc235916856 \h </w:instrText>
+            </w:r>
+            <w:r>
+              <w:rPr>
+                <w:noProof/>
+                <w:webHidden/>
+              </w:rPr>
+            </w:r>
+            <w:r>
+              <w:rPr>
+                <w:noProof/>
+                <w:webHidden/>
+              </w:rPr>
+              <w:fldChar w:fldCharType="separate"/>
+            </w:r>
+            <w:r>
+              <w:rPr>
+                <w:noProof/>
+                <w:webHidden/>
+              </w:rPr>
+              <w:t>19</w:t>
+            </w:r>
+            <w:r>
+              <w:rPr>
+                <w:noProof/>
+                <w:webHidden/>
+              </w:rPr>
+              <w:fldChar w:fldCharType="end"/>
+            </w:r>
+          </w:hyperlink>
+        </w:p>
+        <w:p>
+          <w:pPr>
+            <w:pStyle w:val="TDC2"/>
+            <w:tabs>
+              <w:tab w:val="right" w:leader="dot" w:pos="9113"/>
+            </w:tabs>
+            <w:rPr>
+              <w:noProof/>
+            </w:rPr>
+          </w:pPr>
+          <w:hyperlink w:anchor="_Toc235916857" w:history="1">
+            <w:r>
+              <w:rPr>
+                <w:rStyle w:val="Hipervnculo"/>
+                <w:noProof/>
+              </w:rPr>
+              <w:t>Trello</w:t>
+            </w:r>
+            <w:r>
+              <w:rPr>
+                <w:noProof/>
+                <w:webHidden/>
+              </w:rPr>
+              <w:tab/>
+            </w:r>
+            <w:r>
+              <w:rPr>
+                <w:noProof/>
+                <w:webHidden/>
+              </w:rPr>
+              <w:fldChar w:fldCharType="begin"/>
+            </w:r>
+            <w:r>
+              <w:rPr>
+                <w:noProof/>
+                <w:webHidden/>
+              </w:rPr>
+              <w:instrText xml:space="preserve"> PAGEREF _Toc235916857 \h </w:instrText>
+            </w:r>
+            <w:r>
+              <w:rPr>
+                <w:noProof/>
+                <w:webHidden/>
+              </w:rPr>
+            </w:r>
+            <w:r>
+              <w:rPr>
+                <w:noProof/>
+                <w:webHidden/>
+              </w:rPr>
+              <w:fldChar w:fldCharType="separate"/>
+            </w:r>
+            <w:r>
+              <w:rPr>
+                <w:noProof/>
+                <w:webHidden/>
+              </w:rPr>
+              <w:t>19</w:t>
+            </w:r>
+            <w:r>
+              <w:rPr>
+                <w:noProof/>
+                <w:webHidden/>
+              </w:rPr>
+              <w:fldChar w:fldCharType="end"/>
+            </w:r>
+          </w:hyperlink>
+        </w:p>
+        <w:p>
+          <w:pPr>
+            <w:pStyle w:val="TDC2"/>
+            <w:tabs>
+              <w:tab w:val="right" w:leader="dot" w:pos="9113"/>
+            </w:tabs>
+            <w:rPr>
+              <w:noProof/>
+            </w:rPr>
+          </w:pPr>
+          <w:hyperlink w:anchor="_Toc235916858" w:history="1">
+            <w:r>
+              <w:rPr>
+                <w:rStyle w:val="Hipervnculo"/>
+                <w:noProof/>
+              </w:rPr>
+              <w:t>GitHub</w:t>
+            </w:r>
+            <w:r>
+              <w:rPr>
+                <w:noProof/>
+                <w:webHidden/>
+              </w:rPr>
+              <w:tab/>
+            </w:r>
+            <w:r>
+              <w:rPr>
+                <w:noProof/>
+                <w:webHidden/>
+              </w:rPr>
+              <w:fldChar w:fldCharType="begin"/>
+            </w:r>
+            <w:r>
+              <w:rPr>
+                <w:noProof/>
+                <w:webHidden/>
+              </w:rPr>
+              <w:instrText xml:space="preserve"> PAGEREF _Toc235916858 \h </w:instrText>
+            </w:r>
+            <w:r>
+              <w:rPr>
+                <w:noProof/>
+                <w:webHidden/>
+              </w:rPr>
+            </w:r>
+            <w:r>
+              <w:rPr>
+                <w:noProof/>
+                <w:webHidden/>
+              </w:rPr>
+              <w:fldChar w:fldCharType="separate"/>
+            </w:r>
+            <w:r>
+              <w:rPr>
+                <w:noProof/>
+                <w:webHidden/>
+              </w:rPr>
+              <w:t>20</w:t>
+            </w:r>
+            <w:r>
+              <w:rPr>
+                <w:noProof/>
+                <w:webHidden/>
+              </w:rPr>
+              <w:fldChar w:fldCharType="end"/>
+            </w:r>
+          </w:hyperlink>
+        </w:p>
+        <w:p>
+          <w:pPr>
+            <w:pStyle w:val="TDC1"/>
+            <w:tabs>
+              <w:tab w:val="right" w:leader="dot" w:pos="9113"/>
+            </w:tabs>
+            <w:rPr>
+              <w:noProof/>
+            </w:rPr>
+          </w:pPr>
+          <w:hyperlink w:anchor="_Toc235916859" w:history="1">
+            <w:r>
+              <w:rPr>
+                <w:rStyle w:val="Hipervnculo"/>
+                <w:noProof/>
+                <w:lang w:val="en-US"/>
+              </w:rPr>
+              <w:t>BIBLIOGRAFIA</w:t>
+            </w:r>
+            <w:r>
+              <w:rPr>
+                <w:noProof/>
+                <w:webHidden/>
+              </w:rPr>
+              <w:tab/>
+            </w:r>
+            <w:r>
+              <w:rPr>
+                <w:noProof/>
+                <w:webHidden/>
+              </w:rPr>
+              <w:fldChar w:fldCharType="begin"/>
+            </w:r>
+            <w:r>
+              <w:rPr>
+                <w:noProof/>
+                <w:webHidden/>
+              </w:rPr>
+              <w:instrText xml:space="preserve"> PAGEREF _Toc235916859 \h </w:instrText>
+            </w:r>
+            <w:r>
+              <w:rPr>
+                <w:noProof/>
+                <w:webHidden/>
+              </w:rPr>
+            </w:r>
+            <w:r>
+              <w:rPr>
+                <w:noProof/>
+                <w:webHidden/>
+              </w:rPr>
+              <w:fldChar w:fldCharType="separate"/>
+            </w:r>
+            <w:r>
+              <w:rPr>
+                <w:noProof/>
+                <w:webHidden/>
+              </w:rPr>
+              <w:t>20</w:t>
+            </w:r>
+            <w:r>
+              <w:rPr>
+                <w:noProof/>
+                <w:webHidden/>
+              </w:rPr>
+              <w:fldChar w:fldCharType="end"/>
+            </w:r>
+          </w:hyperlink>
+        </w:p>
+        <w:p>
+          <w:pPr>
+            <w:pStyle w:val="TDC1"/>
+            <w:tabs>
+              <w:tab w:val="right" w:leader="dot" w:pos="9113"/>
+            </w:tabs>
+            <w:rPr>
+              <w:noProof/>
+            </w:rPr>
+          </w:pPr>
+          <w:hyperlink w:anchor="_Toc235916860" w:history="1">
+            <w:r>
+              <w:rPr>
+                <w:rStyle w:val="Hipervnculo"/>
+                <w:noProof/>
+              </w:rPr>
+              <w:t>ANEXOS</w:t>
+            </w:r>
+            <w:r>
+              <w:rPr>
+                <w:noProof/>
+                <w:webHidden/>
+              </w:rPr>
+              <w:tab/>
+            </w:r>
+            <w:r>
+              <w:rPr>
+                <w:noProof/>
+                <w:webHidden/>
+              </w:rPr>
+              <w:fldChar w:fldCharType="begin"/>
+            </w:r>
+            <w:r>
+              <w:rPr>
+                <w:noProof/>
+                <w:webHidden/>
+              </w:rPr>
+              <w:instrText xml:space="preserve"> PAGEREF _Toc235916860 \h </w:instrText>
+            </w:r>
+            <w:r>
+              <w:rPr>
+                <w:noProof/>
+                <w:webHidden/>
+              </w:rPr>
+            </w:r>
+            <w:r>
+              <w:rPr>
+                <w:noProof/>
+                <w:webHidden/>
+              </w:rPr>
+              <w:fldChar w:fldCharType="separate"/>
+            </w:r>
+            <w:r>
+              <w:rPr>
+                <w:noProof/>
+                <w:webHidden/>
+              </w:rPr>
+              <w:t>21</w:t>
+            </w:r>
+            <w:r>
+              <w:rPr>
+                <w:noProof/>
+                <w:webHidden/>
+              </w:rPr>
+              <w:fldChar w:fldCharType="end"/>
             </w:r>
           </w:hyperlink>
         </w:p>
         <w:p>
           <w:r>
+            <w:rPr>
+              <w:b/>
+              <w:bCs/>
+              <w:lang w:val="es-ES"/>
+            </w:rPr>
             <w:fldChar w:fldCharType="end"/>
           </w:r>
         </w:p>
@@ -784,12 +2120,12 @@
           <w:bCs w:val="0"/>
         </w:rPr>
       </w:pPr>
-      <w:bookmarkStart w:id="0" w:name="_heading=h.mt3ziuhhwp5s" w:colFirst="0" w:colLast="0"/>
-      <w:bookmarkEnd w:id="0"/>
+      <w:bookmarkStart w:id="0" w:name="_Toc235916838"/>
       <w:r>
         <w:lastRenderedPageBreak/>
         <w:t>INTRODUCCIÓN</w:t>
       </w:r>
+      <w:bookmarkEnd w:id="0"/>
     </w:p>
     <w:p>
       <w:pPr>
@@ -840,8 +2176,7 @@
         <w:pStyle w:val="Ttulo1"/>
         <w:ind w:firstLine="0"/>
       </w:pPr>
-      <w:bookmarkStart w:id="1" w:name="_heading=h.i1s7hci4my0o" w:colFirst="0" w:colLast="0"/>
-      <w:bookmarkEnd w:id="1"/>
+      <w:bookmarkStart w:id="1" w:name="_Toc235916839"/>
       <w:r>
         <w:rPr>
           <w:smallCaps w:val="0"/>
@@ -849,6 +2184,7 @@
         <w:lastRenderedPageBreak/>
         <w:t>JUSTIFICACIÒN</w:t>
       </w:r>
+      <w:bookmarkEnd w:id="1"/>
     </w:p>
     <w:p>
       <w:pPr>
@@ -900,8 +2236,7 @@
       <w:pPr>
         <w:pStyle w:val="Ttulo1"/>
       </w:pPr>
-      <w:bookmarkStart w:id="2" w:name="_heading=h.1clycumn3miq" w:colFirst="0" w:colLast="0"/>
-      <w:bookmarkEnd w:id="2"/>
+      <w:bookmarkStart w:id="2" w:name="_Toc235916840"/>
       <w:r>
         <w:rPr>
           <w:smallCaps w:val="0"/>
@@ -909,16 +2244,17 @@
         <w:lastRenderedPageBreak/>
         <w:t>OBJETIVOS</w:t>
       </w:r>
+      <w:bookmarkEnd w:id="2"/>
     </w:p>
     <w:p>
       <w:pPr>
         <w:pStyle w:val="Ttulo2"/>
       </w:pPr>
-      <w:bookmarkStart w:id="3" w:name="_heading=h.e8ulcpep5ahe" w:colFirst="0" w:colLast="0"/>
+      <w:bookmarkStart w:id="3" w:name="_Toc235916841"/>
+      <w:r>
+        <w:t>Objetivo general</w:t>
+      </w:r>
       <w:bookmarkEnd w:id="3"/>
-      <w:r>
-        <w:t>Objetivo general</w:t>
-      </w:r>
     </w:p>
     <w:p>
       <w:pPr>
@@ -932,11 +2268,11 @@
       <w:pPr>
         <w:pStyle w:val="Ttulo2"/>
       </w:pPr>
-      <w:bookmarkStart w:id="4" w:name="_heading=h.ifcilk5rv898" w:colFirst="0" w:colLast="0"/>
+      <w:bookmarkStart w:id="4" w:name="_Toc235916842"/>
+      <w:r>
+        <w:t>Objetivos Específicos</w:t>
+      </w:r>
       <w:bookmarkEnd w:id="4"/>
-      <w:r>
-        <w:t>Objetivos Específicos</w:t>
-      </w:r>
     </w:p>
     <w:p>
       <w:pPr>
@@ -999,8 +2335,7 @@
       <w:pPr>
         <w:pStyle w:val="Ttulo1"/>
       </w:pPr>
-      <w:bookmarkStart w:id="5" w:name="_heading=h.c26okourk7gf" w:colFirst="0" w:colLast="0"/>
-      <w:bookmarkEnd w:id="5"/>
+      <w:bookmarkStart w:id="5" w:name="_Toc235916843"/>
       <w:r>
         <w:rPr>
           <w:smallCaps w:val="0"/>
@@ -1008,6 +2343,7 @@
         <w:lastRenderedPageBreak/>
         <w:t>ALCANCE</w:t>
       </w:r>
+      <w:bookmarkEnd w:id="5"/>
     </w:p>
     <w:p>
       <w:r>
@@ -1333,19 +2669,23 @@
       <w:pPr>
         <w:pStyle w:val="Ttulo1"/>
       </w:pPr>
-      <w:bookmarkStart w:id="6" w:name="_heading=h.vpogy7xkt9o5" w:colFirst="0" w:colLast="0"/>
+      <w:bookmarkStart w:id="6" w:name="_Toc235916844"/>
+      <w:r>
+        <w:rPr>
+          <w:smallCaps w:val="0"/>
+        </w:rPr>
+        <w:lastRenderedPageBreak/>
+        <w:t>MARCO TEÓRICO</w:t>
+      </w:r>
       <w:bookmarkEnd w:id="6"/>
       <w:r>
         <w:rPr>
           <w:smallCaps w:val="0"/>
         </w:rPr>
-        <w:lastRenderedPageBreak/>
-        <w:t xml:space="preserve">MARCO TEÓRICO </w:t>
-      </w:r>
-    </w:p>
-    <w:p>
-      <w:bookmarkStart w:id="7" w:name="_heading=h.gcdeu4mc4gw2" w:colFirst="0" w:colLast="0"/>
-      <w:bookmarkEnd w:id="7"/>
+        <w:t xml:space="preserve"> </w:t>
+      </w:r>
+    </w:p>
+    <w:p>
       <w:r>
         <w:t>Rodríguez y Silva (2022), en su investigación titulada “Optimización de procesos de atención al cliente mediante plataformas web en clínicas veterinarias” para la Universidad Politécnica de Valencia, desarrollaron una aplicación orientada a la gestión de citas. La cual redujo el 35 % el tiempo de espera y aportó a la mejora de fidelización del usuario.</w:t>
       </w:r>
@@ -1474,13 +2814,13 @@
         <w:rPr>
           <w:i/>
           <w:iCs/>
-          <w:lang w:val="es-EC"/>
+          <w:lang w:val="en-US"/>
         </w:rPr>
         <w:t>Cengage Learning. - References - Scientific Research Publishing</w:t>
       </w:r>
       <w:r>
         <w:rPr>
-          <w:lang w:val="es-EC"/>
+          <w:lang w:val="en-US"/>
         </w:rPr>
         <w:t>, s. f.)</w:t>
       </w:r>
@@ -1488,6 +2828,9 @@
         <w:fldChar w:fldCharType="end"/>
       </w:r>
       <w:r>
+        <w:rPr>
+          <w:lang w:val="en-US"/>
+        </w:rPr>
         <w:t xml:space="preserve"> </w:t>
       </w:r>
       <w:r>
@@ -1678,17 +3021,24 @@
       <w:pPr>
         <w:pStyle w:val="Ttulo1"/>
       </w:pPr>
-      <w:r>
-        <w:t xml:space="preserve">Ingeniería de requerimientos </w:t>
+      <w:bookmarkStart w:id="7" w:name="_Toc235916845"/>
+      <w:r>
+        <w:t>INGENIERÍA DE REQUERIMIENTOS</w:t>
+      </w:r>
+      <w:bookmarkEnd w:id="7"/>
+      <w:r>
+        <w:t xml:space="preserve"> </w:t>
       </w:r>
     </w:p>
     <w:p>
       <w:pPr>
         <w:pStyle w:val="Ttulo2"/>
       </w:pPr>
+      <w:bookmarkStart w:id="8" w:name="_Toc235916846"/>
       <w:r>
         <w:t>Proceso de levantamiento y técnicas aplicadas</w:t>
       </w:r>
+      <w:bookmarkEnd w:id="8"/>
     </w:p>
     <w:p>
       <w:r>
@@ -1794,10 +3144,12 @@
       <w:pPr>
         <w:pStyle w:val="Ttulo2"/>
       </w:pPr>
+      <w:bookmarkStart w:id="9" w:name="_Toc235916847"/>
       <w:r>
         <w:lastRenderedPageBreak/>
         <w:t>Clasificación de Requerimientos</w:t>
       </w:r>
+      <w:bookmarkEnd w:id="9"/>
     </w:p>
     <w:p>
       <w:pPr>
@@ -3030,10 +4382,12 @@
       <w:pPr>
         <w:pStyle w:val="Ttulo2"/>
       </w:pPr>
+      <w:bookmarkStart w:id="10" w:name="_Toc235916848"/>
       <w:r>
         <w:lastRenderedPageBreak/>
         <w:t>Implementación</w:t>
       </w:r>
+      <w:bookmarkEnd w:id="10"/>
     </w:p>
     <w:p>
       <w:r>
@@ -3092,7 +4446,13 @@
         <w:t xml:space="preserve">. Este componente </w:t>
       </w:r>
       <w:r>
-        <w:t>constituye el núcleo del sistema, ya que gestiona la lógica de negocio la validación de datos y la manipulación de la información almacenada en hojas de calculo Excel.</w:t>
+        <w:t xml:space="preserve">constituye el núcleo del sistema, ya que gestiona la lógica de negocio la validación de datos y la manipulación de la información almacenada en hojas de </w:t>
+      </w:r>
+      <w:r>
+        <w:t>cálculo</w:t>
+      </w:r>
+      <w:r>
+        <w:t xml:space="preserve"> Excel.</w:t>
       </w:r>
     </w:p>
     <w:p>
@@ -3100,7 +4460,25 @@
         <w:ind w:firstLine="0"/>
       </w:pPr>
       <w:r>
-        <w:t>El sistema esta diseñado para operar mediante una interfaz sencilla e intuitiva, en la cual el usuario ejecuta las acciones principales (registro, consulta, modificacion y cancelación de citas) mediante botones asignados a macros especificas. Entre las principales funcionalidades se destacan:</w:t>
+        <w:t xml:space="preserve">El sistema </w:t>
+      </w:r>
+      <w:r>
+        <w:t>está</w:t>
+      </w:r>
+      <w:r>
+        <w:t xml:space="preserve"> diseñado para operar mediante una interfaz sencilla e intuitiva, en la cual el usuario ejecuta las acciones principales (registro, consulta, </w:t>
+      </w:r>
+      <w:r>
+        <w:t>modificación</w:t>
+      </w:r>
+      <w:r>
+        <w:t xml:space="preserve"> y cancelación de citas) mediante botones asignados a macros </w:t>
+      </w:r>
+      <w:r>
+        <w:t>específicas</w:t>
+      </w:r>
+      <w:r>
+        <w:t>. Entre las principales funcionalidades se destacan:</w:t>
       </w:r>
     </w:p>
     <w:p>
@@ -3111,7 +4489,10 @@
         </w:numPr>
       </w:pPr>
       <w:r>
-        <w:t>Automatizacion de procesos mediante macros.</w:t>
+        <w:t>Automatización</w:t>
+      </w:r>
+      <w:r>
+        <w:t xml:space="preserve"> de procesos mediante macros.</w:t>
       </w:r>
     </w:p>
     <w:p>
@@ -3123,7 +4504,10 @@
         <w:spacing w:before="0"/>
       </w:pPr>
       <w:r>
-        <w:t>Manipulacion de datos en hojas de Excel.</w:t>
+        <w:t>Manipulación</w:t>
+      </w:r>
+      <w:r>
+        <w:t xml:space="preserve"> de datos en hojas de Excel.</w:t>
       </w:r>
     </w:p>
     <w:p>
@@ -3147,7 +4531,10 @@
         <w:spacing w:before="0"/>
       </w:pPr>
       <w:r>
-        <w:t>Gestion de eventos</w:t>
+        <w:t>Gestión</w:t>
+      </w:r>
+      <w:r>
+        <w:t xml:space="preserve"> de eventos</w:t>
       </w:r>
     </w:p>
     <w:p>
@@ -3159,7 +4546,16 @@
         <w:spacing w:before="0"/>
       </w:pPr>
       <w:r>
-        <w:t>Validacion de datos en tiempo rela.</w:t>
+        <w:t>Validación</w:t>
+      </w:r>
+      <w:r>
+        <w:t xml:space="preserve"> de datos en tiempo </w:t>
+      </w:r>
+      <w:r>
+        <w:t>real</w:t>
+      </w:r>
+      <w:r>
+        <w:t>.</w:t>
       </w:r>
     </w:p>
     <w:p>
@@ -3171,17 +4567,22 @@
         <w:spacing w:before="0"/>
       </w:pPr>
       <w:r>
-        <w:t>Optimizacion de la experiencia del usuario.</w:t>
+        <w:t>Optimización</w:t>
+      </w:r>
+      <w:r>
+        <w:t xml:space="preserve"> de la experiencia del usuario.</w:t>
       </w:r>
     </w:p>
     <w:p>
       <w:pPr>
         <w:pStyle w:val="Ttulo2"/>
       </w:pPr>
+      <w:bookmarkStart w:id="11" w:name="_Toc235916849"/>
       <w:r>
         <w:lastRenderedPageBreak/>
         <w:t>Despliegue de la Interfaz de Usuaria (UI)</w:t>
       </w:r>
+      <w:bookmarkEnd w:id="11"/>
     </w:p>
     <w:p>
       <w:pPr>
@@ -3230,6 +4631,7 @@
           <w:b/>
           <w:bCs/>
           <w:smallCaps/>
+          <w:noProof/>
           <w:color w:val="1F497D"/>
           <w:sz w:val="40"/>
           <w:szCs w:val="40"/>
@@ -3281,6 +4683,7 @@
           <w:b/>
           <w:bCs/>
           <w:smallCaps/>
+          <w:noProof/>
           <w:color w:val="1F497D"/>
           <w:sz w:val="40"/>
           <w:szCs w:val="40"/>
@@ -3384,17 +4787,21 @@
       <w:pPr>
         <w:pStyle w:val="Ttulo1"/>
       </w:pPr>
+      <w:bookmarkStart w:id="12" w:name="_Toc235916850"/>
       <w:r>
         <w:t>MANUAL DE USUARIO</w:t>
       </w:r>
+      <w:bookmarkEnd w:id="12"/>
     </w:p>
     <w:p>
       <w:pPr>
         <w:pStyle w:val="Ttulo1"/>
       </w:pPr>
+      <w:bookmarkStart w:id="13" w:name="_Toc235916851"/>
       <w:r>
         <w:t>EVIDENCIA DE VALIDACIÓN CON LOS INTERESADOS</w:t>
       </w:r>
+      <w:bookmarkEnd w:id="13"/>
     </w:p>
     <w:p>
       <w:r>
@@ -3508,9 +4915,11 @@
       <w:pPr>
         <w:pStyle w:val="Ttulo2"/>
       </w:pPr>
+      <w:bookmarkStart w:id="14" w:name="_Toc235916852"/>
       <w:r>
         <w:t>Mecanismo de Gestión de Cambios de Requerimientos</w:t>
       </w:r>
+      <w:bookmarkEnd w:id="14"/>
     </w:p>
     <w:p>
       <w:r>
@@ -3623,9 +5032,11 @@
       <w:pPr>
         <w:pStyle w:val="Ttulo1"/>
       </w:pPr>
+      <w:bookmarkStart w:id="15" w:name="_Toc235916853"/>
       <w:r>
         <w:t>ESTRUCTURA DE DESGLOSE DEL TRABAJO (EDT/WBS)</w:t>
       </w:r>
+      <w:bookmarkEnd w:id="15"/>
     </w:p>
     <w:p>
       <w:pPr>
@@ -3796,8 +5207,13 @@
       <w:pPr>
         <w:pStyle w:val="Ttulo1"/>
       </w:pPr>
-      <w:r>
-        <w:t xml:space="preserve">MATRIZ DE GESTIÓN DE RIESGOS </w:t>
+      <w:bookmarkStart w:id="16" w:name="_Toc235916854"/>
+      <w:r>
+        <w:t>MATRIZ DE GESTIÓN DE RIESGOS</w:t>
+      </w:r>
+      <w:bookmarkEnd w:id="16"/>
+      <w:r>
+        <w:t xml:space="preserve"> </w:t>
       </w:r>
     </w:p>
     <w:tbl>
@@ -4138,7 +5554,28 @@
                 <w:sz w:val="22"/>
                 <w:szCs w:val="22"/>
               </w:rPr>
-              <w:t>Împlementar reglas de validación de datos, por ejemplo en campos numéricos para cedula o teléfono.</w:t>
+              <w:t>Implementar</w:t>
+            </w:r>
+            <w:r>
+              <w:rPr>
+                <w:sz w:val="22"/>
+                <w:szCs w:val="22"/>
+              </w:rPr>
+              <w:t xml:space="preserve"> reglas de validación de datos, por </w:t>
+            </w:r>
+            <w:r>
+              <w:rPr>
+                <w:sz w:val="22"/>
+                <w:szCs w:val="22"/>
+              </w:rPr>
+              <w:t>ejemplo,</w:t>
+            </w:r>
+            <w:r>
+              <w:rPr>
+                <w:sz w:val="22"/>
+                <w:szCs w:val="22"/>
+              </w:rPr>
+              <w:t xml:space="preserve"> en campos numéricos para cedula o teléfono.</w:t>
             </w:r>
           </w:p>
         </w:tc>
@@ -4217,14 +5654,7 @@
                 <w:sz w:val="22"/>
                 <w:szCs w:val="22"/>
               </w:rPr>
-              <w:t>Medi</w:t>
-            </w:r>
-            <w:r>
-              <w:rPr>
-                <w:sz w:val="22"/>
-                <w:szCs w:val="22"/>
-              </w:rPr>
-              <w:t>a</w:t>
+              <w:t>Media</w:t>
             </w:r>
           </w:p>
         </w:tc>
@@ -4294,7 +5724,14 @@
                 <w:sz w:val="22"/>
                 <w:szCs w:val="22"/>
               </w:rPr>
-              <w:t>Capacitacion directa apoyada en el manual de usuario</w:t>
+              <w:t>Capacitación</w:t>
+            </w:r>
+            <w:r>
+              <w:rPr>
+                <w:sz w:val="22"/>
+                <w:szCs w:val="22"/>
+              </w:rPr>
+              <w:t xml:space="preserve"> directa apoyada en el manual de usuario</w:t>
             </w:r>
           </w:p>
         </w:tc>
@@ -4339,7 +5776,28 @@
                 <w:szCs w:val="22"/>
               </w:rPr>
               <w:lastRenderedPageBreak/>
-              <w:t>Bloqueo o deshabilitacion de Macros por políticas de seguridad de excel</w:t>
+              <w:t xml:space="preserve">Bloqueo o </w:t>
+            </w:r>
+            <w:r>
+              <w:rPr>
+                <w:sz w:val="22"/>
+                <w:szCs w:val="22"/>
+              </w:rPr>
+              <w:t>deshabilitación</w:t>
+            </w:r>
+            <w:r>
+              <w:rPr>
+                <w:sz w:val="22"/>
+                <w:szCs w:val="22"/>
+              </w:rPr>
+              <w:t xml:space="preserve"> de Macros por políticas de seguridad de </w:t>
+            </w:r>
+            <w:r>
+              <w:rPr>
+                <w:sz w:val="22"/>
+                <w:szCs w:val="22"/>
+              </w:rPr>
+              <w:t>Excel</w:t>
             </w:r>
           </w:p>
         </w:tc>
@@ -4444,7 +5902,28 @@
                 <w:sz w:val="22"/>
                 <w:szCs w:val="22"/>
               </w:rPr>
-              <w:t>Configurar la ubicación de la caroeta del proyecto como una ubicación de confianza</w:t>
+              <w:t>Configurar la ubicación de la car</w:t>
+            </w:r>
+            <w:r>
+              <w:rPr>
+                <w:sz w:val="22"/>
+                <w:szCs w:val="22"/>
+              </w:rPr>
+              <w:t>p</w:t>
+            </w:r>
+            <w:r>
+              <w:rPr>
+                <w:sz w:val="22"/>
+                <w:szCs w:val="22"/>
+              </w:rPr>
+              <w:t>eta del proyecto como una ubicación de confianza</w:t>
+            </w:r>
+            <w:r>
+              <w:rPr>
+                <w:sz w:val="22"/>
+                <w:szCs w:val="22"/>
+              </w:rPr>
+              <w:t xml:space="preserve"> dentro de las opciones de seguridad.</w:t>
             </w:r>
           </w:p>
         </w:tc>
@@ -4471,8 +5950,12 @@
           </w:tcPr>
           <w:p>
             <w:pPr>
+              <w:pStyle w:val="Prrafodelista"/>
+              <w:numPr>
+                <w:ilvl w:val="0"/>
+                <w:numId w:val="11"/>
+              </w:numPr>
               <w:spacing w:before="0" w:after="480" w:line="276" w:lineRule="auto"/>
-              <w:ind w:firstLine="0"/>
               <w:jc w:val="left"/>
               <w:rPr>
                 <w:sz w:val="22"/>
@@ -4484,7 +5967,7 @@
                 <w:sz w:val="22"/>
                 <w:szCs w:val="22"/>
               </w:rPr>
-              <w:t>4. Retraso en la programación (JavaScript)</w:t>
+              <w:t xml:space="preserve">Incompatibilidad de versiones de Microsoft Excel </w:t>
             </w:r>
           </w:p>
         </w:tc>
@@ -4589,7 +6072,7 @@
                 <w:sz w:val="22"/>
                 <w:szCs w:val="22"/>
               </w:rPr>
-              <w:t>Reasignar tareas dentro del equipo para asegurar que las funciones críticas operen primero.</w:t>
+              <w:t xml:space="preserve">Escribir código VBA compatible con arquitecturas 32 y 64 bits </w:t>
             </w:r>
           </w:p>
         </w:tc>
@@ -4616,8 +6099,12 @@
           </w:tcPr>
           <w:p>
             <w:pPr>
+              <w:pStyle w:val="Prrafodelista"/>
+              <w:numPr>
+                <w:ilvl w:val="0"/>
+                <w:numId w:val="11"/>
+              </w:numPr>
               <w:spacing w:before="0" w:after="480" w:line="276" w:lineRule="auto"/>
-              <w:ind w:firstLine="0"/>
               <w:jc w:val="left"/>
               <w:rPr>
                 <w:sz w:val="22"/>
@@ -4629,7 +6116,7 @@
                 <w:sz w:val="22"/>
                 <w:szCs w:val="22"/>
               </w:rPr>
-              <w:t>5. Acceso no autorizado a los datos</w:t>
+              <w:t>Falto de respaldos automatizados ante fallos del equipo o corte de energía</w:t>
             </w:r>
           </w:p>
         </w:tc>
@@ -4664,7 +6151,7 @@
                 <w:sz w:val="22"/>
                 <w:szCs w:val="22"/>
               </w:rPr>
-              <w:t>Baja</w:t>
+              <w:t>Media</w:t>
             </w:r>
           </w:p>
         </w:tc>
@@ -4734,7 +6221,7 @@
                 <w:sz w:val="22"/>
                 <w:szCs w:val="22"/>
               </w:rPr>
-              <w:t>Restringir el acceso mediante permisos nativos de la cuenta Google del administrador.</w:t>
+              <w:t xml:space="preserve">Programar un guardado automático en VBA </w:t>
             </w:r>
           </w:p>
         </w:tc>
@@ -4755,9 +6242,11 @@
       <w:pPr>
         <w:pStyle w:val="Ttulo1"/>
       </w:pPr>
+      <w:bookmarkStart w:id="17" w:name="_Toc235916855"/>
       <w:r>
         <w:t>CONCLUSION</w:t>
       </w:r>
+      <w:bookmarkEnd w:id="17"/>
     </w:p>
     <w:p>
       <w:pPr>
@@ -4776,18 +6265,22 @@
       <w:pPr>
         <w:pStyle w:val="Ttulo1"/>
       </w:pPr>
+      <w:bookmarkStart w:id="18" w:name="_Toc235916856"/>
       <w:r>
         <w:lastRenderedPageBreak/>
         <w:t>HERRAMIENTAS</w:t>
       </w:r>
+      <w:bookmarkEnd w:id="18"/>
     </w:p>
     <w:p>
       <w:pPr>
         <w:pStyle w:val="Ttulo2"/>
       </w:pPr>
+      <w:bookmarkStart w:id="19" w:name="_Toc235916857"/>
       <w:r>
         <w:t>Trello</w:t>
       </w:r>
+      <w:bookmarkEnd w:id="19"/>
     </w:p>
     <w:p>
       <w:pPr>
@@ -4880,10 +6373,12 @@
       <w:pPr>
         <w:pStyle w:val="Ttulo2"/>
       </w:pPr>
+      <w:bookmarkStart w:id="20" w:name="_Toc235916858"/>
       <w:r>
         <w:lastRenderedPageBreak/>
         <w:t>GitHub</w:t>
       </w:r>
+      <w:bookmarkEnd w:id="20"/>
     </w:p>
     <w:p>
       <w:pPr>
@@ -4987,12 +6482,14 @@
           <w:lang w:val="en-US"/>
         </w:rPr>
       </w:pPr>
+      <w:bookmarkStart w:id="21" w:name="_Toc235916859"/>
       <w:r>
         <w:rPr>
           <w:lang w:val="en-US"/>
         </w:rPr>
         <w:t>BIBLIOGRAFIA</w:t>
       </w:r>
+      <w:bookmarkEnd w:id="21"/>
     </w:p>
     <w:p>
       <w:pPr>
@@ -5175,9 +6672,11 @@
       <w:pPr>
         <w:pStyle w:val="Ttulo1"/>
       </w:pPr>
+      <w:bookmarkStart w:id="22" w:name="_Toc235916860"/>
       <w:r>
         <w:t>ANEXOS</w:t>
       </w:r>
+      <w:bookmarkEnd w:id="22"/>
     </w:p>
     <w:p>
       <w:pPr>
@@ -5897,7 +7396,7 @@
       <w:lvlText w:val="⮚"/>
       <w:lvlJc w:val="left"/>
       <w:pPr>
-        <w:ind w:left="3600" w:hanging="360"/>
+        <w:ind w:left="2520" w:hanging="360"/>
       </w:pPr>
       <w:rPr>
         <w:rFonts w:ascii="Noto Sans Symbols" w:eastAsia="Noto Sans Symbols" w:hAnsi="Noto Sans Symbols" w:cs="Noto Sans Symbols"/>
@@ -5909,7 +7408,7 @@
       <w:lvlText w:val="o"/>
       <w:lvlJc w:val="left"/>
       <w:pPr>
-        <w:ind w:left="4320" w:hanging="360"/>
+        <w:ind w:left="3240" w:hanging="360"/>
       </w:pPr>
       <w:rPr>
         <w:rFonts w:ascii="Courier New" w:eastAsia="Courier New" w:hAnsi="Courier New" w:cs="Courier New"/>
@@ -5921,7 +7420,7 @@
       <w:lvlText w:val="▪"/>
       <w:lvlJc w:val="left"/>
       <w:pPr>
-        <w:ind w:left="5040" w:hanging="360"/>
+        <w:ind w:left="3960" w:hanging="360"/>
       </w:pPr>
       <w:rPr>
         <w:rFonts w:ascii="Noto Sans Symbols" w:eastAsia="Noto Sans Symbols" w:hAnsi="Noto Sans Symbols" w:cs="Noto Sans Symbols"/>
@@ -5933,7 +7432,7 @@
       <w:lvlText w:val="●"/>
       <w:lvlJc w:val="left"/>
       <w:pPr>
-        <w:ind w:left="5760" w:hanging="360"/>
+        <w:ind w:left="4680" w:hanging="360"/>
       </w:pPr>
       <w:rPr>
         <w:rFonts w:ascii="Noto Sans Symbols" w:eastAsia="Noto Sans Symbols" w:hAnsi="Noto Sans Symbols" w:cs="Noto Sans Symbols"/>
@@ -5945,7 +7444,7 @@
       <w:lvlText w:val="o"/>
       <w:lvlJc w:val="left"/>
       <w:pPr>
-        <w:ind w:left="6480" w:hanging="360"/>
+        <w:ind w:left="5400" w:hanging="360"/>
       </w:pPr>
       <w:rPr>
         <w:rFonts w:ascii="Courier New" w:eastAsia="Courier New" w:hAnsi="Courier New" w:cs="Courier New"/>
@@ -5957,7 +7456,7 @@
       <w:lvlText w:val="▪"/>
       <w:lvlJc w:val="left"/>
       <w:pPr>
-        <w:ind w:left="7200" w:hanging="360"/>
+        <w:ind w:left="6120" w:hanging="360"/>
       </w:pPr>
       <w:rPr>
         <w:rFonts w:ascii="Noto Sans Symbols" w:eastAsia="Noto Sans Symbols" w:hAnsi="Noto Sans Symbols" w:cs="Noto Sans Symbols"/>
@@ -5969,7 +7468,7 @@
       <w:lvlText w:val="●"/>
       <w:lvlJc w:val="left"/>
       <w:pPr>
-        <w:ind w:left="7920" w:hanging="360"/>
+        <w:ind w:left="6840" w:hanging="360"/>
       </w:pPr>
       <w:rPr>
         <w:rFonts w:ascii="Noto Sans Symbols" w:eastAsia="Noto Sans Symbols" w:hAnsi="Noto Sans Symbols" w:cs="Noto Sans Symbols"/>
@@ -5981,7 +7480,7 @@
       <w:lvlText w:val="o"/>
       <w:lvlJc w:val="left"/>
       <w:pPr>
-        <w:ind w:left="8640" w:hanging="360"/>
+        <w:ind w:left="7560" w:hanging="360"/>
       </w:pPr>
       <w:rPr>
         <w:rFonts w:ascii="Courier New" w:eastAsia="Courier New" w:hAnsi="Courier New" w:cs="Courier New"/>
@@ -5993,7 +7492,7 @@
       <w:lvlText w:val="▪"/>
       <w:lvlJc w:val="left"/>
       <w:pPr>
-        <w:ind w:left="9360" w:hanging="360"/>
+        <w:ind w:left="8280" w:hanging="360"/>
       </w:pPr>
       <w:rPr>
         <w:rFonts w:ascii="Noto Sans Symbols" w:eastAsia="Noto Sans Symbols" w:hAnsi="Noto Sans Symbols" w:cs="Noto Sans Symbols"/>
@@ -7240,6 +8739,7 @@
   <w:style w:type="character" w:default="1" w:styleId="Fuentedeprrafopredeter">
     <w:name w:val="Default Paragraph Font"/>
     <w:uiPriority w:val="1"/>
+    <w:semiHidden/>
     <w:unhideWhenUsed/>
   </w:style>
   <w:style w:type="table" w:default="1" w:styleId="Tablanormal">
@@ -7394,6 +8894,56 @@
     <w:pPr>
       <w:ind w:left="720"/>
       <w:contextualSpacing/>
+    </w:pPr>
+  </w:style>
+  <w:style w:type="paragraph" w:styleId="TtuloTDC">
+    <w:name w:val="TOC Heading"/>
+    <w:basedOn w:val="Ttulo1"/>
+    <w:next w:val="Normal"/>
+    <w:uiPriority w:val="39"/>
+    <w:unhideWhenUsed/>
+    <w:qFormat/>
+    <w:rsid w:val="00320A0C"/>
+    <w:pPr>
+      <w:spacing w:after="0" w:line="259" w:lineRule="auto"/>
+      <w:ind w:firstLine="0"/>
+      <w:jc w:val="left"/>
+      <w:outlineLvl w:val="9"/>
+    </w:pPr>
+    <w:rPr>
+      <w:rFonts w:asciiTheme="majorHAnsi" w:eastAsiaTheme="majorEastAsia" w:hAnsiTheme="majorHAnsi" w:cstheme="majorBidi"/>
+      <w:b w:val="0"/>
+      <w:bCs w:val="0"/>
+      <w:smallCaps w:val="0"/>
+      <w:color w:val="365F91" w:themeColor="accent1" w:themeShade="BF"/>
+      <w:sz w:val="32"/>
+      <w:szCs w:val="32"/>
+      <w:lang w:val="es-EC"/>
+    </w:rPr>
+  </w:style>
+  <w:style w:type="paragraph" w:styleId="TDC1">
+    <w:name w:val="toc 1"/>
+    <w:basedOn w:val="Normal"/>
+    <w:next w:val="Normal"/>
+    <w:autoRedefine/>
+    <w:uiPriority w:val="39"/>
+    <w:unhideWhenUsed/>
+    <w:rsid w:val="00320A0C"/>
+    <w:pPr>
+      <w:spacing w:after="100"/>
+    </w:pPr>
+  </w:style>
+  <w:style w:type="paragraph" w:styleId="TDC2">
+    <w:name w:val="toc 2"/>
+    <w:basedOn w:val="Normal"/>
+    <w:next w:val="Normal"/>
+    <w:autoRedefine/>
+    <w:uiPriority w:val="39"/>
+    <w:unhideWhenUsed/>
+    <w:rsid w:val="00320A0C"/>
+    <w:pPr>
+      <w:spacing w:after="100"/>
+      <w:ind w:left="240"/>
     </w:pPr>
   </w:style>
 </w:styles>
@@ -7720,28 +9270,28 @@
 </file>
 
 <file path=customXml/item1.xml><?xml version="1.0" encoding="utf-8"?>
+<b:Sources xmlns:b="http://schemas.openxmlformats.org/officeDocument/2006/bibliography" xmlns="http://schemas.openxmlformats.org/officeDocument/2006/bibliography" SelectedStyle="\APASixthEditionOfficeOnline.xsl" StyleName="APA" Version="6"/>
+</file>
+
+<file path=customXml/item2.xml><?xml version="1.0" encoding="utf-8"?>
 <go:gDocsCustomXmlDataStorage xmlns:go="http://customooxmlschemas.google.com/" xmlns:r="http://schemas.openxmlformats.org/officeDocument/2006/relationships" uri="GoogleDocsCustomDataVersion2">
   <go:docsCustomData xmlns:go="http://customooxmlschemas.google.com/" roundtripDataSignature="AMtx7mh3tGXZL5Snns8rvQeUSepJPQ1reQ==">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</go:docsCustomData>
 </go:gDocsCustomXmlDataStorage>
 </file>
 
-<file path=customXml/item2.xml><?xml version="1.0" encoding="utf-8"?>
-<b:Sources xmlns:b="http://schemas.openxmlformats.org/officeDocument/2006/bibliography" xmlns="http://schemas.openxmlformats.org/officeDocument/2006/bibliography" SelectedStyle="\APASixthEditionOfficeOnline.xsl" StyleName="APA" Version="6"/>
+<file path=customXml/itemProps1.xml><?xml version="1.0" encoding="utf-8"?>
+<ds:datastoreItem xmlns:ds="http://schemas.openxmlformats.org/officeDocument/2006/customXml" ds:itemID="{0D619F72-32CF-4AC1-BB3D-C617A5489CDC}">
+  <ds:schemaRefs>
+    <ds:schemaRef ds:uri="http://schemas.openxmlformats.org/officeDocument/2006/bibliography"/>
+  </ds:schemaRefs>
+</ds:datastoreItem>
 </file>
 
-<file path=customXml/itemProps1.xml><?xml version="1.0" encoding="utf-8"?>
+<file path=customXml/itemProps2.xml><?xml version="1.0" encoding="utf-8"?>
 <ds:datastoreItem xmlns:ds="http://schemas.openxmlformats.org/officeDocument/2006/customXml" ds:itemID="{11111111-1234-1234-1234-123412341234}">
   <ds:schemaRefs>
     <ds:schemaRef ds:uri="http://customooxmlschemas.google.com/"/>
     <ds:schemaRef ds:uri="http://schemas.openxmlformats.org/officeDocument/2006/relationships"/>
   </ds:schemaRefs>
 </ds:datastoreItem>
-</file>
-
-<file path=customXml/itemProps2.xml><?xml version="1.0" encoding="utf-8"?>
-<ds:datastoreItem xmlns:ds="http://schemas.openxmlformats.org/officeDocument/2006/customXml" ds:itemID="{0D619F72-32CF-4AC1-BB3D-C617A5489CDC}">
-  <ds:schemaRefs>
-    <ds:schemaRef ds:uri="http://schemas.openxmlformats.org/officeDocument/2006/bibliography"/>
-  </ds:schemaRefs>
-</ds:datastoreItem>
 </file>
</xml_diff>